<commit_message>
Exercise 3, gitignore, and more
- Added Exercise 3 of Lab 02
- Added .gitignore file
- Updated directory page and Lab 02 report file
</commit_message>
<xml_diff>
--- a/02/WEB-Lab02-ITCSIU24039-Vũ Quốc Khánh.docx
+++ b/02/WEB-Lab02-ITCSIU24039-Vũ Quốc Khánh.docx
@@ -2752,6 +2752,1818 @@
         </w:drawing>
       </w:r>
     </w:p>
+    <w:p/>
+    <w:p>
+      <w:pPr>
+        <w:pStyle w:val="Heading1"/>
+      </w:pPr>
+      <w:r>
+        <w:t>Exercise 3</w:t>
+      </w:r>
+    </w:p>
+    <w:p>
+      <w:pPr>
+        <w:pStyle w:val="Heading2"/>
+      </w:pPr>
+      <w:r>
+        <w:t>HTML Code</w:t>
+      </w:r>
+    </w:p>
+    <w:p>
+      <w:pPr>
+        <w:pBdr>
+          <w:top w:val="single" w:sz="4" w:space="1" w:color="auto"/>
+          <w:left w:val="single" w:sz="4" w:space="4" w:color="auto"/>
+          <w:bottom w:val="single" w:sz="4" w:space="1" w:color="auto"/>
+          <w:right w:val="single" w:sz="4" w:space="4" w:color="auto"/>
+        </w:pBdr>
+        <w:rPr>
+          <w:rFonts w:ascii="Consolas" w:hAnsi="Consolas"/>
+        </w:rPr>
+      </w:pPr>
+      <w:r>
+        <w:rPr>
+          <w:rFonts w:ascii="Consolas" w:hAnsi="Consolas"/>
+        </w:rPr>
+        <w:t>&lt;!DOCTYPE html&gt;</w:t>
+      </w:r>
+    </w:p>
+    <w:p>
+      <w:pPr>
+        <w:pBdr>
+          <w:top w:val="single" w:sz="4" w:space="1" w:color="auto"/>
+          <w:left w:val="single" w:sz="4" w:space="4" w:color="auto"/>
+          <w:bottom w:val="single" w:sz="4" w:space="1" w:color="auto"/>
+          <w:right w:val="single" w:sz="4" w:space="4" w:color="auto"/>
+        </w:pBdr>
+        <w:rPr>
+          <w:rFonts w:ascii="Consolas" w:hAnsi="Consolas"/>
+        </w:rPr>
+      </w:pPr>
+      <w:r>
+        <w:rPr>
+          <w:rFonts w:ascii="Consolas" w:hAnsi="Consolas"/>
+        </w:rPr>
+        <w:t>&lt;html lang="</w:t>
+      </w:r>
+      <w:proofErr w:type="spellStart"/>
+      <w:r>
+        <w:rPr>
+          <w:rFonts w:ascii="Consolas" w:hAnsi="Consolas"/>
+        </w:rPr>
+        <w:t>en</w:t>
+      </w:r>
+      <w:proofErr w:type="spellEnd"/>
+      <w:r>
+        <w:rPr>
+          <w:rFonts w:ascii="Consolas" w:hAnsi="Consolas"/>
+        </w:rPr>
+        <w:t>"&gt;</w:t>
+      </w:r>
+    </w:p>
+    <w:p>
+      <w:pPr>
+        <w:pBdr>
+          <w:top w:val="single" w:sz="4" w:space="1" w:color="auto"/>
+          <w:left w:val="single" w:sz="4" w:space="4" w:color="auto"/>
+          <w:bottom w:val="single" w:sz="4" w:space="1" w:color="auto"/>
+          <w:right w:val="single" w:sz="4" w:space="4" w:color="auto"/>
+        </w:pBdr>
+        <w:rPr>
+          <w:rFonts w:ascii="Consolas" w:hAnsi="Consolas"/>
+        </w:rPr>
+      </w:pPr>
+      <w:r>
+        <w:rPr>
+          <w:rFonts w:ascii="Consolas" w:hAnsi="Consolas"/>
+        </w:rPr>
+        <w:t>&lt;head&gt;</w:t>
+      </w:r>
+    </w:p>
+    <w:p>
+      <w:pPr>
+        <w:pBdr>
+          <w:top w:val="single" w:sz="4" w:space="1" w:color="auto"/>
+          <w:left w:val="single" w:sz="4" w:space="4" w:color="auto"/>
+          <w:bottom w:val="single" w:sz="4" w:space="1" w:color="auto"/>
+          <w:right w:val="single" w:sz="4" w:space="4" w:color="auto"/>
+        </w:pBdr>
+        <w:rPr>
+          <w:rFonts w:ascii="Consolas" w:hAnsi="Consolas"/>
+        </w:rPr>
+      </w:pPr>
+      <w:r>
+        <w:rPr>
+          <w:rFonts w:ascii="Consolas" w:hAnsi="Consolas"/>
+        </w:rPr>
+        <w:t>    &lt;meta charset="UTF-8"&gt;</w:t>
+      </w:r>
+    </w:p>
+    <w:p>
+      <w:pPr>
+        <w:pBdr>
+          <w:top w:val="single" w:sz="4" w:space="1" w:color="auto"/>
+          <w:left w:val="single" w:sz="4" w:space="4" w:color="auto"/>
+          <w:bottom w:val="single" w:sz="4" w:space="1" w:color="auto"/>
+          <w:right w:val="single" w:sz="4" w:space="4" w:color="auto"/>
+        </w:pBdr>
+        <w:rPr>
+          <w:rFonts w:ascii="Consolas" w:hAnsi="Consolas"/>
+        </w:rPr>
+      </w:pPr>
+      <w:r>
+        <w:rPr>
+          <w:rFonts w:ascii="Consolas" w:hAnsi="Consolas"/>
+        </w:rPr>
+        <w:lastRenderedPageBreak/>
+        <w:t>    &lt;meta name="viewport" content="width=device-width, initial-scale=1.0"&gt;</w:t>
+      </w:r>
+    </w:p>
+    <w:p>
+      <w:pPr>
+        <w:pBdr>
+          <w:top w:val="single" w:sz="4" w:space="1" w:color="auto"/>
+          <w:left w:val="single" w:sz="4" w:space="4" w:color="auto"/>
+          <w:bottom w:val="single" w:sz="4" w:space="1" w:color="auto"/>
+          <w:right w:val="single" w:sz="4" w:space="4" w:color="auto"/>
+        </w:pBdr>
+        <w:rPr>
+          <w:rFonts w:ascii="Consolas" w:hAnsi="Consolas"/>
+        </w:rPr>
+      </w:pPr>
+      <w:r>
+        <w:rPr>
+          <w:rFonts w:ascii="Consolas" w:hAnsi="Consolas"/>
+        </w:rPr>
+        <w:t xml:space="preserve">    &lt;link </w:t>
+      </w:r>
+      <w:proofErr w:type="spellStart"/>
+      <w:r>
+        <w:rPr>
+          <w:rFonts w:ascii="Consolas" w:hAnsi="Consolas"/>
+        </w:rPr>
+        <w:t>rel</w:t>
+      </w:r>
+      <w:proofErr w:type="spellEnd"/>
+      <w:r>
+        <w:rPr>
+          <w:rFonts w:ascii="Consolas" w:hAnsi="Consolas"/>
+        </w:rPr>
+        <w:t xml:space="preserve">="stylesheet" </w:t>
+      </w:r>
+      <w:proofErr w:type="spellStart"/>
+      <w:r>
+        <w:rPr>
+          <w:rFonts w:ascii="Consolas" w:hAnsi="Consolas"/>
+        </w:rPr>
+        <w:t>href</w:t>
+      </w:r>
+      <w:proofErr w:type="spellEnd"/>
+      <w:r>
+        <w:rPr>
+          <w:rFonts w:ascii="Consolas" w:hAnsi="Consolas"/>
+        </w:rPr>
+        <w:t>="./style.css"&gt;</w:t>
+      </w:r>
+    </w:p>
+    <w:p>
+      <w:pPr>
+        <w:pBdr>
+          <w:top w:val="single" w:sz="4" w:space="1" w:color="auto"/>
+          <w:left w:val="single" w:sz="4" w:space="4" w:color="auto"/>
+          <w:bottom w:val="single" w:sz="4" w:space="1" w:color="auto"/>
+          <w:right w:val="single" w:sz="4" w:space="4" w:color="auto"/>
+        </w:pBdr>
+        <w:rPr>
+          <w:rFonts w:ascii="Consolas" w:hAnsi="Consolas"/>
+        </w:rPr>
+      </w:pPr>
+      <w:r>
+        <w:rPr>
+          <w:rFonts w:ascii="Consolas" w:hAnsi="Consolas"/>
+        </w:rPr>
+        <w:t>    &lt;title&gt;Flexbox layout example&lt;/title&gt;</w:t>
+      </w:r>
+    </w:p>
+    <w:p>
+      <w:pPr>
+        <w:pBdr>
+          <w:top w:val="single" w:sz="4" w:space="1" w:color="auto"/>
+          <w:left w:val="single" w:sz="4" w:space="4" w:color="auto"/>
+          <w:bottom w:val="single" w:sz="4" w:space="1" w:color="auto"/>
+          <w:right w:val="single" w:sz="4" w:space="4" w:color="auto"/>
+        </w:pBdr>
+        <w:rPr>
+          <w:rFonts w:ascii="Consolas" w:hAnsi="Consolas"/>
+        </w:rPr>
+      </w:pPr>
+      <w:r>
+        <w:rPr>
+          <w:rFonts w:ascii="Consolas" w:hAnsi="Consolas"/>
+        </w:rPr>
+        <w:t>&lt;/head&gt;</w:t>
+      </w:r>
+    </w:p>
+    <w:p>
+      <w:pPr>
+        <w:pBdr>
+          <w:top w:val="single" w:sz="4" w:space="1" w:color="auto"/>
+          <w:left w:val="single" w:sz="4" w:space="4" w:color="auto"/>
+          <w:bottom w:val="single" w:sz="4" w:space="1" w:color="auto"/>
+          <w:right w:val="single" w:sz="4" w:space="4" w:color="auto"/>
+        </w:pBdr>
+        <w:rPr>
+          <w:rFonts w:ascii="Consolas" w:hAnsi="Consolas"/>
+        </w:rPr>
+      </w:pPr>
+      <w:r>
+        <w:rPr>
+          <w:rFonts w:ascii="Consolas" w:hAnsi="Consolas"/>
+        </w:rPr>
+        <w:t>&lt;body&gt;</w:t>
+      </w:r>
+    </w:p>
+    <w:p>
+      <w:pPr>
+        <w:pBdr>
+          <w:top w:val="single" w:sz="4" w:space="1" w:color="auto"/>
+          <w:left w:val="single" w:sz="4" w:space="4" w:color="auto"/>
+          <w:bottom w:val="single" w:sz="4" w:space="1" w:color="auto"/>
+          <w:right w:val="single" w:sz="4" w:space="4" w:color="auto"/>
+        </w:pBdr>
+        <w:rPr>
+          <w:rFonts w:ascii="Consolas" w:hAnsi="Consolas"/>
+        </w:rPr>
+      </w:pPr>
+      <w:r>
+        <w:rPr>
+          <w:rFonts w:ascii="Consolas" w:hAnsi="Consolas"/>
+        </w:rPr>
+        <w:t>    &lt;section class="container"&gt;</w:t>
+      </w:r>
+    </w:p>
+    <w:p>
+      <w:pPr>
+        <w:pBdr>
+          <w:top w:val="single" w:sz="4" w:space="1" w:color="auto"/>
+          <w:left w:val="single" w:sz="4" w:space="4" w:color="auto"/>
+          <w:bottom w:val="single" w:sz="4" w:space="1" w:color="auto"/>
+          <w:right w:val="single" w:sz="4" w:space="4" w:color="auto"/>
+        </w:pBdr>
+        <w:rPr>
+          <w:rFonts w:ascii="Consolas" w:hAnsi="Consolas"/>
+        </w:rPr>
+      </w:pPr>
+      <w:r>
+        <w:rPr>
+          <w:rFonts w:ascii="Consolas" w:hAnsi="Consolas"/>
+        </w:rPr>
+        <w:t>        &lt;header&gt;</w:t>
+      </w:r>
+    </w:p>
+    <w:p>
+      <w:pPr>
+        <w:pBdr>
+          <w:top w:val="single" w:sz="4" w:space="1" w:color="auto"/>
+          <w:left w:val="single" w:sz="4" w:space="4" w:color="auto"/>
+          <w:bottom w:val="single" w:sz="4" w:space="1" w:color="auto"/>
+          <w:right w:val="single" w:sz="4" w:space="4" w:color="auto"/>
+        </w:pBdr>
+        <w:rPr>
+          <w:rFonts w:ascii="Consolas" w:hAnsi="Consolas"/>
+        </w:rPr>
+      </w:pPr>
+      <w:r>
+        <w:rPr>
+          <w:rFonts w:ascii="Consolas" w:hAnsi="Consolas"/>
+        </w:rPr>
+        <w:t>            &lt;h2&gt;Header&lt;/h2&gt;</w:t>
+      </w:r>
+    </w:p>
+    <w:p>
+      <w:pPr>
+        <w:pBdr>
+          <w:top w:val="single" w:sz="4" w:space="1" w:color="auto"/>
+          <w:left w:val="single" w:sz="4" w:space="4" w:color="auto"/>
+          <w:bottom w:val="single" w:sz="4" w:space="1" w:color="auto"/>
+          <w:right w:val="single" w:sz="4" w:space="4" w:color="auto"/>
+        </w:pBdr>
+        <w:rPr>
+          <w:rFonts w:ascii="Consolas" w:hAnsi="Consolas"/>
+        </w:rPr>
+      </w:pPr>
+      <w:r>
+        <w:rPr>
+          <w:rFonts w:ascii="Consolas" w:hAnsi="Consolas"/>
+        </w:rPr>
+        <w:t>        &lt;/header&gt;</w:t>
+      </w:r>
+    </w:p>
+    <w:p>
+      <w:pPr>
+        <w:pBdr>
+          <w:top w:val="single" w:sz="4" w:space="1" w:color="auto"/>
+          <w:left w:val="single" w:sz="4" w:space="4" w:color="auto"/>
+          <w:bottom w:val="single" w:sz="4" w:space="1" w:color="auto"/>
+          <w:right w:val="single" w:sz="4" w:space="4" w:color="auto"/>
+        </w:pBdr>
+        <w:rPr>
+          <w:rFonts w:ascii="Consolas" w:hAnsi="Consolas"/>
+        </w:rPr>
+      </w:pPr>
+    </w:p>
+    <w:p>
+      <w:pPr>
+        <w:pBdr>
+          <w:top w:val="single" w:sz="4" w:space="1" w:color="auto"/>
+          <w:left w:val="single" w:sz="4" w:space="4" w:color="auto"/>
+          <w:bottom w:val="single" w:sz="4" w:space="1" w:color="auto"/>
+          <w:right w:val="single" w:sz="4" w:space="4" w:color="auto"/>
+        </w:pBdr>
+        <w:rPr>
+          <w:rFonts w:ascii="Consolas" w:hAnsi="Consolas"/>
+        </w:rPr>
+      </w:pPr>
+      <w:r>
+        <w:rPr>
+          <w:rFonts w:ascii="Consolas" w:hAnsi="Consolas"/>
+        </w:rPr>
+        <w:t>        &lt;section class="side-main"&gt;</w:t>
+      </w:r>
+    </w:p>
+    <w:p>
+      <w:pPr>
+        <w:pBdr>
+          <w:top w:val="single" w:sz="4" w:space="1" w:color="auto"/>
+          <w:left w:val="single" w:sz="4" w:space="4" w:color="auto"/>
+          <w:bottom w:val="single" w:sz="4" w:space="1" w:color="auto"/>
+          <w:right w:val="single" w:sz="4" w:space="4" w:color="auto"/>
+        </w:pBdr>
+        <w:rPr>
+          <w:rFonts w:ascii="Consolas" w:hAnsi="Consolas"/>
+        </w:rPr>
+      </w:pPr>
+      <w:r>
+        <w:rPr>
+          <w:rFonts w:ascii="Consolas" w:hAnsi="Consolas"/>
+        </w:rPr>
+        <w:t>            &lt;div class="sidebar-a"&gt;</w:t>
+      </w:r>
+    </w:p>
+    <w:p>
+      <w:pPr>
+        <w:pBdr>
+          <w:top w:val="single" w:sz="4" w:space="1" w:color="auto"/>
+          <w:left w:val="single" w:sz="4" w:space="4" w:color="auto"/>
+          <w:bottom w:val="single" w:sz="4" w:space="1" w:color="auto"/>
+          <w:right w:val="single" w:sz="4" w:space="4" w:color="auto"/>
+        </w:pBdr>
+        <w:rPr>
+          <w:rFonts w:ascii="Consolas" w:hAnsi="Consolas"/>
+        </w:rPr>
+      </w:pPr>
+      <w:r>
+        <w:rPr>
+          <w:rFonts w:ascii="Consolas" w:hAnsi="Consolas"/>
+        </w:rPr>
+        <w:t>                &lt;h2&gt;Sidebar A&lt;/h2&gt;</w:t>
+      </w:r>
+    </w:p>
+    <w:p>
+      <w:pPr>
+        <w:pBdr>
+          <w:top w:val="single" w:sz="4" w:space="1" w:color="auto"/>
+          <w:left w:val="single" w:sz="4" w:space="4" w:color="auto"/>
+          <w:bottom w:val="single" w:sz="4" w:space="1" w:color="auto"/>
+          <w:right w:val="single" w:sz="4" w:space="4" w:color="auto"/>
+        </w:pBdr>
+        <w:rPr>
+          <w:rFonts w:ascii="Consolas" w:hAnsi="Consolas"/>
+        </w:rPr>
+      </w:pPr>
+      <w:r>
+        <w:rPr>
+          <w:rFonts w:ascii="Consolas" w:hAnsi="Consolas"/>
+        </w:rPr>
+        <w:t>            &lt;/div&gt;</w:t>
+      </w:r>
+    </w:p>
+    <w:p>
+      <w:pPr>
+        <w:pBdr>
+          <w:top w:val="single" w:sz="4" w:space="1" w:color="auto"/>
+          <w:left w:val="single" w:sz="4" w:space="4" w:color="auto"/>
+          <w:bottom w:val="single" w:sz="4" w:space="1" w:color="auto"/>
+          <w:right w:val="single" w:sz="4" w:space="4" w:color="auto"/>
+        </w:pBdr>
+        <w:rPr>
+          <w:rFonts w:ascii="Consolas" w:hAnsi="Consolas"/>
+        </w:rPr>
+      </w:pPr>
+    </w:p>
+    <w:p>
+      <w:pPr>
+        <w:pBdr>
+          <w:top w:val="single" w:sz="4" w:space="1" w:color="auto"/>
+          <w:left w:val="single" w:sz="4" w:space="4" w:color="auto"/>
+          <w:bottom w:val="single" w:sz="4" w:space="1" w:color="auto"/>
+          <w:right w:val="single" w:sz="4" w:space="4" w:color="auto"/>
+        </w:pBdr>
+        <w:rPr>
+          <w:rFonts w:ascii="Consolas" w:hAnsi="Consolas"/>
+        </w:rPr>
+      </w:pPr>
+      <w:r>
+        <w:rPr>
+          <w:rFonts w:ascii="Consolas" w:hAnsi="Consolas"/>
+        </w:rPr>
+        <w:t>            &lt;main&gt;</w:t>
+      </w:r>
+    </w:p>
+    <w:p>
+      <w:pPr>
+        <w:pBdr>
+          <w:top w:val="single" w:sz="4" w:space="1" w:color="auto"/>
+          <w:left w:val="single" w:sz="4" w:space="4" w:color="auto"/>
+          <w:bottom w:val="single" w:sz="4" w:space="1" w:color="auto"/>
+          <w:right w:val="single" w:sz="4" w:space="4" w:color="auto"/>
+        </w:pBdr>
+        <w:rPr>
+          <w:rFonts w:ascii="Consolas" w:hAnsi="Consolas"/>
+        </w:rPr>
+      </w:pPr>
+      <w:r>
+        <w:rPr>
+          <w:rFonts w:ascii="Consolas" w:hAnsi="Consolas"/>
+        </w:rPr>
+        <w:t>                &lt;h2&gt;Main content&lt;/h2&gt;</w:t>
+      </w:r>
+    </w:p>
+    <w:p>
+      <w:pPr>
+        <w:pBdr>
+          <w:top w:val="single" w:sz="4" w:space="1" w:color="auto"/>
+          <w:left w:val="single" w:sz="4" w:space="4" w:color="auto"/>
+          <w:bottom w:val="single" w:sz="4" w:space="1" w:color="auto"/>
+          <w:right w:val="single" w:sz="4" w:space="4" w:color="auto"/>
+        </w:pBdr>
+        <w:rPr>
+          <w:rFonts w:ascii="Consolas" w:hAnsi="Consolas"/>
+        </w:rPr>
+      </w:pPr>
+      <w:r>
+        <w:rPr>
+          <w:rFonts w:ascii="Consolas" w:hAnsi="Consolas"/>
+        </w:rPr>
+        <w:t>            &lt;/main&gt;</w:t>
+      </w:r>
+    </w:p>
+    <w:p>
+      <w:pPr>
+        <w:pBdr>
+          <w:top w:val="single" w:sz="4" w:space="1" w:color="auto"/>
+          <w:left w:val="single" w:sz="4" w:space="4" w:color="auto"/>
+          <w:bottom w:val="single" w:sz="4" w:space="1" w:color="auto"/>
+          <w:right w:val="single" w:sz="4" w:space="4" w:color="auto"/>
+        </w:pBdr>
+        <w:rPr>
+          <w:rFonts w:ascii="Consolas" w:hAnsi="Consolas"/>
+        </w:rPr>
+      </w:pPr>
+    </w:p>
+    <w:p>
+      <w:pPr>
+        <w:pBdr>
+          <w:top w:val="single" w:sz="4" w:space="1" w:color="auto"/>
+          <w:left w:val="single" w:sz="4" w:space="4" w:color="auto"/>
+          <w:bottom w:val="single" w:sz="4" w:space="1" w:color="auto"/>
+          <w:right w:val="single" w:sz="4" w:space="4" w:color="auto"/>
+        </w:pBdr>
+        <w:rPr>
+          <w:rFonts w:ascii="Consolas" w:hAnsi="Consolas"/>
+        </w:rPr>
+      </w:pPr>
+      <w:r>
+        <w:rPr>
+          <w:rFonts w:ascii="Consolas" w:hAnsi="Consolas"/>
+        </w:rPr>
+        <w:t>            &lt;div class="sidebar-b"&gt;</w:t>
+      </w:r>
+    </w:p>
+    <w:p>
+      <w:pPr>
+        <w:pBdr>
+          <w:top w:val="single" w:sz="4" w:space="1" w:color="auto"/>
+          <w:left w:val="single" w:sz="4" w:space="4" w:color="auto"/>
+          <w:bottom w:val="single" w:sz="4" w:space="1" w:color="auto"/>
+          <w:right w:val="single" w:sz="4" w:space="4" w:color="auto"/>
+        </w:pBdr>
+        <w:rPr>
+          <w:rFonts w:ascii="Consolas" w:hAnsi="Consolas"/>
+        </w:rPr>
+      </w:pPr>
+      <w:r>
+        <w:rPr>
+          <w:rFonts w:ascii="Consolas" w:hAnsi="Consolas"/>
+        </w:rPr>
+        <w:t>                &lt;h2&gt;Sidebar B&lt;/h2&gt;</w:t>
+      </w:r>
+    </w:p>
+    <w:p>
+      <w:pPr>
+        <w:pBdr>
+          <w:top w:val="single" w:sz="4" w:space="1" w:color="auto"/>
+          <w:left w:val="single" w:sz="4" w:space="4" w:color="auto"/>
+          <w:bottom w:val="single" w:sz="4" w:space="1" w:color="auto"/>
+          <w:right w:val="single" w:sz="4" w:space="4" w:color="auto"/>
+        </w:pBdr>
+        <w:rPr>
+          <w:rFonts w:ascii="Consolas" w:hAnsi="Consolas"/>
+        </w:rPr>
+      </w:pPr>
+      <w:r>
+        <w:rPr>
+          <w:rFonts w:ascii="Consolas" w:hAnsi="Consolas"/>
+        </w:rPr>
+        <w:t>            &lt;/div&gt;</w:t>
+      </w:r>
+    </w:p>
+    <w:p>
+      <w:pPr>
+        <w:pBdr>
+          <w:top w:val="single" w:sz="4" w:space="1" w:color="auto"/>
+          <w:left w:val="single" w:sz="4" w:space="4" w:color="auto"/>
+          <w:bottom w:val="single" w:sz="4" w:space="1" w:color="auto"/>
+          <w:right w:val="single" w:sz="4" w:space="4" w:color="auto"/>
+        </w:pBdr>
+        <w:rPr>
+          <w:rFonts w:ascii="Consolas" w:hAnsi="Consolas"/>
+        </w:rPr>
+      </w:pPr>
+      <w:r>
+        <w:rPr>
+          <w:rFonts w:ascii="Consolas" w:hAnsi="Consolas"/>
+        </w:rPr>
+        <w:t>        &lt;/section&gt;</w:t>
+      </w:r>
+    </w:p>
+    <w:p>
+      <w:pPr>
+        <w:pBdr>
+          <w:top w:val="single" w:sz="4" w:space="1" w:color="auto"/>
+          <w:left w:val="single" w:sz="4" w:space="4" w:color="auto"/>
+          <w:bottom w:val="single" w:sz="4" w:space="1" w:color="auto"/>
+          <w:right w:val="single" w:sz="4" w:space="4" w:color="auto"/>
+        </w:pBdr>
+        <w:rPr>
+          <w:rFonts w:ascii="Consolas" w:hAnsi="Consolas"/>
+        </w:rPr>
+      </w:pPr>
+    </w:p>
+    <w:p>
+      <w:pPr>
+        <w:pBdr>
+          <w:top w:val="single" w:sz="4" w:space="1" w:color="auto"/>
+          <w:left w:val="single" w:sz="4" w:space="4" w:color="auto"/>
+          <w:bottom w:val="single" w:sz="4" w:space="1" w:color="auto"/>
+          <w:right w:val="single" w:sz="4" w:space="4" w:color="auto"/>
+        </w:pBdr>
+        <w:rPr>
+          <w:rFonts w:ascii="Consolas" w:hAnsi="Consolas"/>
+        </w:rPr>
+      </w:pPr>
+      <w:r>
+        <w:rPr>
+          <w:rFonts w:ascii="Consolas" w:hAnsi="Consolas"/>
+        </w:rPr>
+        <w:t>        &lt;footer&gt;</w:t>
+      </w:r>
+    </w:p>
+    <w:p>
+      <w:pPr>
+        <w:pBdr>
+          <w:top w:val="single" w:sz="4" w:space="1" w:color="auto"/>
+          <w:left w:val="single" w:sz="4" w:space="4" w:color="auto"/>
+          <w:bottom w:val="single" w:sz="4" w:space="1" w:color="auto"/>
+          <w:right w:val="single" w:sz="4" w:space="4" w:color="auto"/>
+        </w:pBdr>
+        <w:rPr>
+          <w:rFonts w:ascii="Consolas" w:hAnsi="Consolas"/>
+        </w:rPr>
+      </w:pPr>
+      <w:r>
+        <w:rPr>
+          <w:rFonts w:ascii="Consolas" w:hAnsi="Consolas"/>
+        </w:rPr>
+        <w:t>            &lt;h2&gt;Footer&lt;/h2&gt;</w:t>
+      </w:r>
+    </w:p>
+    <w:p>
+      <w:pPr>
+        <w:pBdr>
+          <w:top w:val="single" w:sz="4" w:space="1" w:color="auto"/>
+          <w:left w:val="single" w:sz="4" w:space="4" w:color="auto"/>
+          <w:bottom w:val="single" w:sz="4" w:space="1" w:color="auto"/>
+          <w:right w:val="single" w:sz="4" w:space="4" w:color="auto"/>
+        </w:pBdr>
+        <w:rPr>
+          <w:rFonts w:ascii="Consolas" w:hAnsi="Consolas"/>
+        </w:rPr>
+      </w:pPr>
+      <w:r>
+        <w:rPr>
+          <w:rFonts w:ascii="Consolas" w:hAnsi="Consolas"/>
+        </w:rPr>
+        <w:lastRenderedPageBreak/>
+        <w:t>        &lt;/footer&gt;</w:t>
+      </w:r>
+    </w:p>
+    <w:p>
+      <w:pPr>
+        <w:pBdr>
+          <w:top w:val="single" w:sz="4" w:space="1" w:color="auto"/>
+          <w:left w:val="single" w:sz="4" w:space="4" w:color="auto"/>
+          <w:bottom w:val="single" w:sz="4" w:space="1" w:color="auto"/>
+          <w:right w:val="single" w:sz="4" w:space="4" w:color="auto"/>
+        </w:pBdr>
+        <w:rPr>
+          <w:rFonts w:ascii="Consolas" w:hAnsi="Consolas"/>
+        </w:rPr>
+      </w:pPr>
+      <w:r>
+        <w:rPr>
+          <w:rFonts w:ascii="Consolas" w:hAnsi="Consolas"/>
+        </w:rPr>
+        <w:t>    &lt;/section&gt;</w:t>
+      </w:r>
+    </w:p>
+    <w:p>
+      <w:pPr>
+        <w:pBdr>
+          <w:top w:val="single" w:sz="4" w:space="1" w:color="auto"/>
+          <w:left w:val="single" w:sz="4" w:space="4" w:color="auto"/>
+          <w:bottom w:val="single" w:sz="4" w:space="1" w:color="auto"/>
+          <w:right w:val="single" w:sz="4" w:space="4" w:color="auto"/>
+        </w:pBdr>
+        <w:rPr>
+          <w:rFonts w:ascii="Consolas" w:hAnsi="Consolas"/>
+        </w:rPr>
+      </w:pPr>
+      <w:r>
+        <w:rPr>
+          <w:rFonts w:ascii="Consolas" w:hAnsi="Consolas"/>
+        </w:rPr>
+        <w:t>&lt;/body&gt;</w:t>
+      </w:r>
+    </w:p>
+    <w:p>
+      <w:pPr>
+        <w:pBdr>
+          <w:top w:val="single" w:sz="4" w:space="1" w:color="auto"/>
+          <w:left w:val="single" w:sz="4" w:space="4" w:color="auto"/>
+          <w:bottom w:val="single" w:sz="4" w:space="1" w:color="auto"/>
+          <w:right w:val="single" w:sz="4" w:space="4" w:color="auto"/>
+        </w:pBdr>
+        <w:rPr>
+          <w:rFonts w:ascii="Consolas" w:hAnsi="Consolas"/>
+        </w:rPr>
+      </w:pPr>
+      <w:r>
+        <w:rPr>
+          <w:rFonts w:ascii="Consolas" w:hAnsi="Consolas"/>
+        </w:rPr>
+        <w:t>&lt;/html&gt;</w:t>
+      </w:r>
+    </w:p>
+    <w:p/>
+    <w:p>
+      <w:pPr>
+        <w:pStyle w:val="Heading2"/>
+      </w:pPr>
+      <w:r>
+        <w:t>CSS Code</w:t>
+      </w:r>
+    </w:p>
+    <w:p>
+      <w:pPr>
+        <w:pBdr>
+          <w:top w:val="single" w:sz="4" w:space="1" w:color="auto"/>
+          <w:left w:val="single" w:sz="4" w:space="4" w:color="auto"/>
+          <w:bottom w:val="single" w:sz="4" w:space="1" w:color="auto"/>
+          <w:right w:val="single" w:sz="4" w:space="4" w:color="auto"/>
+        </w:pBdr>
+        <w:rPr>
+          <w:rFonts w:ascii="Consolas" w:hAnsi="Consolas"/>
+        </w:rPr>
+      </w:pPr>
+      <w:r>
+        <w:rPr>
+          <w:rFonts w:ascii="Consolas" w:hAnsi="Consolas"/>
+        </w:rPr>
+        <w:t>body {</w:t>
+      </w:r>
+    </w:p>
+    <w:p>
+      <w:pPr>
+        <w:pBdr>
+          <w:top w:val="single" w:sz="4" w:space="1" w:color="auto"/>
+          <w:left w:val="single" w:sz="4" w:space="4" w:color="auto"/>
+          <w:bottom w:val="single" w:sz="4" w:space="1" w:color="auto"/>
+          <w:right w:val="single" w:sz="4" w:space="4" w:color="auto"/>
+        </w:pBdr>
+        <w:rPr>
+          <w:rFonts w:ascii="Consolas" w:hAnsi="Consolas"/>
+        </w:rPr>
+      </w:pPr>
+      <w:r>
+        <w:rPr>
+          <w:rFonts w:ascii="Consolas" w:hAnsi="Consolas"/>
+        </w:rPr>
+        <w:t>    font-family: sans-</w:t>
+      </w:r>
+      <w:proofErr w:type="gramStart"/>
+      <w:r>
+        <w:rPr>
+          <w:rFonts w:ascii="Consolas" w:hAnsi="Consolas"/>
+        </w:rPr>
+        <w:t>serif;</w:t>
+      </w:r>
+      <w:proofErr w:type="gramEnd"/>
+    </w:p>
+    <w:p>
+      <w:pPr>
+        <w:pBdr>
+          <w:top w:val="single" w:sz="4" w:space="1" w:color="auto"/>
+          <w:left w:val="single" w:sz="4" w:space="4" w:color="auto"/>
+          <w:bottom w:val="single" w:sz="4" w:space="1" w:color="auto"/>
+          <w:right w:val="single" w:sz="4" w:space="4" w:color="auto"/>
+        </w:pBdr>
+        <w:rPr>
+          <w:rFonts w:ascii="Consolas" w:hAnsi="Consolas"/>
+        </w:rPr>
+      </w:pPr>
+      <w:r>
+        <w:rPr>
+          <w:rFonts w:ascii="Consolas" w:hAnsi="Consolas"/>
+        </w:rPr>
+        <w:t>    background-</w:t>
+      </w:r>
+      <w:proofErr w:type="gramStart"/>
+      <w:r>
+        <w:rPr>
+          <w:rFonts w:ascii="Consolas" w:hAnsi="Consolas"/>
+        </w:rPr>
+        <w:t>color: #facd8c;</w:t>
+      </w:r>
+      <w:proofErr w:type="gramEnd"/>
+    </w:p>
+    <w:p>
+      <w:pPr>
+        <w:pBdr>
+          <w:top w:val="single" w:sz="4" w:space="1" w:color="auto"/>
+          <w:left w:val="single" w:sz="4" w:space="4" w:color="auto"/>
+          <w:bottom w:val="single" w:sz="4" w:space="1" w:color="auto"/>
+          <w:right w:val="single" w:sz="4" w:space="4" w:color="auto"/>
+        </w:pBdr>
+        <w:rPr>
+          <w:rFonts w:ascii="Consolas" w:hAnsi="Consolas"/>
+        </w:rPr>
+      </w:pPr>
+    </w:p>
+    <w:p>
+      <w:pPr>
+        <w:pBdr>
+          <w:top w:val="single" w:sz="4" w:space="1" w:color="auto"/>
+          <w:left w:val="single" w:sz="4" w:space="4" w:color="auto"/>
+          <w:bottom w:val="single" w:sz="4" w:space="1" w:color="auto"/>
+          <w:right w:val="single" w:sz="4" w:space="4" w:color="auto"/>
+        </w:pBdr>
+        <w:rPr>
+          <w:rFonts w:ascii="Consolas" w:hAnsi="Consolas"/>
+        </w:rPr>
+      </w:pPr>
+      <w:r>
+        <w:rPr>
+          <w:rFonts w:ascii="Consolas" w:hAnsi="Consolas"/>
+        </w:rPr>
+        <w:t xml:space="preserve">    height: </w:t>
+      </w:r>
+      <w:proofErr w:type="gramStart"/>
+      <w:r>
+        <w:rPr>
+          <w:rFonts w:ascii="Consolas" w:hAnsi="Consolas"/>
+        </w:rPr>
+        <w:t>100vh;</w:t>
+      </w:r>
+      <w:proofErr w:type="gramEnd"/>
+    </w:p>
+    <w:p>
+      <w:pPr>
+        <w:pBdr>
+          <w:top w:val="single" w:sz="4" w:space="1" w:color="auto"/>
+          <w:left w:val="single" w:sz="4" w:space="4" w:color="auto"/>
+          <w:bottom w:val="single" w:sz="4" w:space="1" w:color="auto"/>
+          <w:right w:val="single" w:sz="4" w:space="4" w:color="auto"/>
+        </w:pBdr>
+        <w:rPr>
+          <w:rFonts w:ascii="Consolas" w:hAnsi="Consolas"/>
+        </w:rPr>
+      </w:pPr>
+      <w:r>
+        <w:rPr>
+          <w:rFonts w:ascii="Consolas" w:hAnsi="Consolas"/>
+        </w:rPr>
+        <w:t xml:space="preserve">    width: </w:t>
+      </w:r>
+      <w:proofErr w:type="gramStart"/>
+      <w:r>
+        <w:rPr>
+          <w:rFonts w:ascii="Consolas" w:hAnsi="Consolas"/>
+        </w:rPr>
+        <w:t>1000px;</w:t>
+      </w:r>
+      <w:proofErr w:type="gramEnd"/>
+    </w:p>
+    <w:p>
+      <w:pPr>
+        <w:pBdr>
+          <w:top w:val="single" w:sz="4" w:space="1" w:color="auto"/>
+          <w:left w:val="single" w:sz="4" w:space="4" w:color="auto"/>
+          <w:bottom w:val="single" w:sz="4" w:space="1" w:color="auto"/>
+          <w:right w:val="single" w:sz="4" w:space="4" w:color="auto"/>
+        </w:pBdr>
+        <w:rPr>
+          <w:rFonts w:ascii="Consolas" w:hAnsi="Consolas"/>
+        </w:rPr>
+      </w:pPr>
+      <w:r>
+        <w:rPr>
+          <w:rFonts w:ascii="Consolas" w:hAnsi="Consolas"/>
+        </w:rPr>
+        <w:t xml:space="preserve">    margin: 0 </w:t>
+      </w:r>
+      <w:proofErr w:type="gramStart"/>
+      <w:r>
+        <w:rPr>
+          <w:rFonts w:ascii="Consolas" w:hAnsi="Consolas"/>
+        </w:rPr>
+        <w:t>auto;</w:t>
+      </w:r>
+      <w:proofErr w:type="gramEnd"/>
+    </w:p>
+    <w:p>
+      <w:pPr>
+        <w:pBdr>
+          <w:top w:val="single" w:sz="4" w:space="1" w:color="auto"/>
+          <w:left w:val="single" w:sz="4" w:space="4" w:color="auto"/>
+          <w:bottom w:val="single" w:sz="4" w:space="1" w:color="auto"/>
+          <w:right w:val="single" w:sz="4" w:space="4" w:color="auto"/>
+        </w:pBdr>
+        <w:rPr>
+          <w:rFonts w:ascii="Consolas" w:hAnsi="Consolas"/>
+        </w:rPr>
+      </w:pPr>
+    </w:p>
+    <w:p>
+      <w:pPr>
+        <w:pBdr>
+          <w:top w:val="single" w:sz="4" w:space="1" w:color="auto"/>
+          <w:left w:val="single" w:sz="4" w:space="4" w:color="auto"/>
+          <w:bottom w:val="single" w:sz="4" w:space="1" w:color="auto"/>
+          <w:right w:val="single" w:sz="4" w:space="4" w:color="auto"/>
+        </w:pBdr>
+        <w:rPr>
+          <w:rFonts w:ascii="Consolas" w:hAnsi="Consolas"/>
+        </w:rPr>
+      </w:pPr>
+      <w:r>
+        <w:rPr>
+          <w:rFonts w:ascii="Consolas" w:hAnsi="Consolas"/>
+        </w:rPr>
+        <w:t xml:space="preserve">    display: </w:t>
+      </w:r>
+      <w:proofErr w:type="gramStart"/>
+      <w:r>
+        <w:rPr>
+          <w:rFonts w:ascii="Consolas" w:hAnsi="Consolas"/>
+        </w:rPr>
+        <w:t>flex;</w:t>
+      </w:r>
+      <w:proofErr w:type="gramEnd"/>
+    </w:p>
+    <w:p>
+      <w:pPr>
+        <w:pBdr>
+          <w:top w:val="single" w:sz="4" w:space="1" w:color="auto"/>
+          <w:left w:val="single" w:sz="4" w:space="4" w:color="auto"/>
+          <w:bottom w:val="single" w:sz="4" w:space="1" w:color="auto"/>
+          <w:right w:val="single" w:sz="4" w:space="4" w:color="auto"/>
+        </w:pBdr>
+        <w:rPr>
+          <w:rFonts w:ascii="Consolas" w:hAnsi="Consolas"/>
+        </w:rPr>
+      </w:pPr>
+      <w:r>
+        <w:rPr>
+          <w:rFonts w:ascii="Consolas" w:hAnsi="Consolas"/>
+        </w:rPr>
+        <w:t xml:space="preserve">    flex-direction: </w:t>
+      </w:r>
+      <w:proofErr w:type="gramStart"/>
+      <w:r>
+        <w:rPr>
+          <w:rFonts w:ascii="Consolas" w:hAnsi="Consolas"/>
+        </w:rPr>
+        <w:t>column;</w:t>
+      </w:r>
+      <w:proofErr w:type="gramEnd"/>
+    </w:p>
+    <w:p>
+      <w:pPr>
+        <w:pBdr>
+          <w:top w:val="single" w:sz="4" w:space="1" w:color="auto"/>
+          <w:left w:val="single" w:sz="4" w:space="4" w:color="auto"/>
+          <w:bottom w:val="single" w:sz="4" w:space="1" w:color="auto"/>
+          <w:right w:val="single" w:sz="4" w:space="4" w:color="auto"/>
+        </w:pBdr>
+        <w:rPr>
+          <w:rFonts w:ascii="Consolas" w:hAnsi="Consolas"/>
+        </w:rPr>
+      </w:pPr>
+      <w:r>
+        <w:rPr>
+          <w:rFonts w:ascii="Consolas" w:hAnsi="Consolas"/>
+        </w:rPr>
+        <w:t>}</w:t>
+      </w:r>
+    </w:p>
+    <w:p>
+      <w:pPr>
+        <w:pBdr>
+          <w:top w:val="single" w:sz="4" w:space="1" w:color="auto"/>
+          <w:left w:val="single" w:sz="4" w:space="4" w:color="auto"/>
+          <w:bottom w:val="single" w:sz="4" w:space="1" w:color="auto"/>
+          <w:right w:val="single" w:sz="4" w:space="4" w:color="auto"/>
+        </w:pBdr>
+        <w:rPr>
+          <w:rFonts w:ascii="Consolas" w:hAnsi="Consolas"/>
+        </w:rPr>
+      </w:pPr>
+    </w:p>
+    <w:p>
+      <w:pPr>
+        <w:pBdr>
+          <w:top w:val="single" w:sz="4" w:space="1" w:color="auto"/>
+          <w:left w:val="single" w:sz="4" w:space="4" w:color="auto"/>
+          <w:bottom w:val="single" w:sz="4" w:space="1" w:color="auto"/>
+          <w:right w:val="single" w:sz="4" w:space="4" w:color="auto"/>
+        </w:pBdr>
+        <w:rPr>
+          <w:rFonts w:ascii="Consolas" w:hAnsi="Consolas"/>
+        </w:rPr>
+      </w:pPr>
+      <w:r>
+        <w:rPr>
+          <w:rFonts w:ascii="Consolas" w:hAnsi="Consolas"/>
+        </w:rPr>
+        <w:t>.container header, .container footer</w:t>
+      </w:r>
+      <w:proofErr w:type="gramStart"/>
+      <w:r>
+        <w:rPr>
+          <w:rFonts w:ascii="Consolas" w:hAnsi="Consolas"/>
+        </w:rPr>
+        <w:t>, .side</w:t>
+      </w:r>
+      <w:proofErr w:type="gramEnd"/>
+      <w:r>
+        <w:rPr>
+          <w:rFonts w:ascii="Consolas" w:hAnsi="Consolas"/>
+        </w:rPr>
+        <w:t xml:space="preserve">-main </w:t>
+      </w:r>
+      <w:proofErr w:type="gramStart"/>
+      <w:r>
+        <w:rPr>
+          <w:rFonts w:ascii="Consolas" w:hAnsi="Consolas"/>
+        </w:rPr>
+        <w:t>&gt; * {</w:t>
+      </w:r>
+      <w:proofErr w:type="gramEnd"/>
+    </w:p>
+    <w:p>
+      <w:pPr>
+        <w:pBdr>
+          <w:top w:val="single" w:sz="4" w:space="1" w:color="auto"/>
+          <w:left w:val="single" w:sz="4" w:space="4" w:color="auto"/>
+          <w:bottom w:val="single" w:sz="4" w:space="1" w:color="auto"/>
+          <w:right w:val="single" w:sz="4" w:space="4" w:color="auto"/>
+        </w:pBdr>
+        <w:rPr>
+          <w:rFonts w:ascii="Consolas" w:hAnsi="Consolas"/>
+        </w:rPr>
+      </w:pPr>
+      <w:r>
+        <w:rPr>
+          <w:rFonts w:ascii="Consolas" w:hAnsi="Consolas"/>
+        </w:rPr>
+        <w:t xml:space="preserve">    padding: 0 </w:t>
+      </w:r>
+      <w:proofErr w:type="gramStart"/>
+      <w:r>
+        <w:rPr>
+          <w:rFonts w:ascii="Consolas" w:hAnsi="Consolas"/>
+        </w:rPr>
+        <w:t>1em;</w:t>
+      </w:r>
+      <w:proofErr w:type="gramEnd"/>
+    </w:p>
+    <w:p>
+      <w:pPr>
+        <w:pBdr>
+          <w:top w:val="single" w:sz="4" w:space="1" w:color="auto"/>
+          <w:left w:val="single" w:sz="4" w:space="4" w:color="auto"/>
+          <w:bottom w:val="single" w:sz="4" w:space="1" w:color="auto"/>
+          <w:right w:val="single" w:sz="4" w:space="4" w:color="auto"/>
+        </w:pBdr>
+        <w:rPr>
+          <w:rFonts w:ascii="Consolas" w:hAnsi="Consolas"/>
+        </w:rPr>
+      </w:pPr>
+      <w:r>
+        <w:rPr>
+          <w:rFonts w:ascii="Consolas" w:hAnsi="Consolas"/>
+        </w:rPr>
+        <w:t>}</w:t>
+      </w:r>
+    </w:p>
+    <w:p>
+      <w:pPr>
+        <w:pBdr>
+          <w:top w:val="single" w:sz="4" w:space="1" w:color="auto"/>
+          <w:left w:val="single" w:sz="4" w:space="4" w:color="auto"/>
+          <w:bottom w:val="single" w:sz="4" w:space="1" w:color="auto"/>
+          <w:right w:val="single" w:sz="4" w:space="4" w:color="auto"/>
+        </w:pBdr>
+        <w:rPr>
+          <w:rFonts w:ascii="Consolas" w:hAnsi="Consolas"/>
+        </w:rPr>
+      </w:pPr>
+    </w:p>
+    <w:p>
+      <w:pPr>
+        <w:pBdr>
+          <w:top w:val="single" w:sz="4" w:space="1" w:color="auto"/>
+          <w:left w:val="single" w:sz="4" w:space="4" w:color="auto"/>
+          <w:bottom w:val="single" w:sz="4" w:space="1" w:color="auto"/>
+          <w:right w:val="single" w:sz="4" w:space="4" w:color="auto"/>
+        </w:pBdr>
+        <w:rPr>
+          <w:rFonts w:ascii="Consolas" w:hAnsi="Consolas"/>
+        </w:rPr>
+      </w:pPr>
+      <w:r>
+        <w:rPr>
+          <w:rFonts w:ascii="Consolas" w:hAnsi="Consolas"/>
+        </w:rPr>
+        <w:t>.container {</w:t>
+      </w:r>
+    </w:p>
+    <w:p>
+      <w:pPr>
+        <w:pBdr>
+          <w:top w:val="single" w:sz="4" w:space="1" w:color="auto"/>
+          <w:left w:val="single" w:sz="4" w:space="4" w:color="auto"/>
+          <w:bottom w:val="single" w:sz="4" w:space="1" w:color="auto"/>
+          <w:right w:val="single" w:sz="4" w:space="4" w:color="auto"/>
+        </w:pBdr>
+        <w:rPr>
+          <w:rFonts w:ascii="Consolas" w:hAnsi="Consolas"/>
+        </w:rPr>
+      </w:pPr>
+      <w:r>
+        <w:rPr>
+          <w:rFonts w:ascii="Consolas" w:hAnsi="Consolas"/>
+        </w:rPr>
+        <w:t xml:space="preserve">    background-color: </w:t>
+      </w:r>
+      <w:proofErr w:type="gramStart"/>
+      <w:r>
+        <w:rPr>
+          <w:rFonts w:ascii="Consolas" w:hAnsi="Consolas"/>
+        </w:rPr>
+        <w:t>white;</w:t>
+      </w:r>
+      <w:proofErr w:type="gramEnd"/>
+    </w:p>
+    <w:p>
+      <w:pPr>
+        <w:pBdr>
+          <w:top w:val="single" w:sz="4" w:space="1" w:color="auto"/>
+          <w:left w:val="single" w:sz="4" w:space="4" w:color="auto"/>
+          <w:bottom w:val="single" w:sz="4" w:space="1" w:color="auto"/>
+          <w:right w:val="single" w:sz="4" w:space="4" w:color="auto"/>
+        </w:pBdr>
+        <w:rPr>
+          <w:rFonts w:ascii="Consolas" w:hAnsi="Consolas"/>
+        </w:rPr>
+      </w:pPr>
+      <w:r>
+        <w:rPr>
+          <w:rFonts w:ascii="Consolas" w:hAnsi="Consolas"/>
+        </w:rPr>
+        <w:t xml:space="preserve">    border: 2px solid </w:t>
+      </w:r>
+      <w:proofErr w:type="gramStart"/>
+      <w:r>
+        <w:rPr>
+          <w:rFonts w:ascii="Consolas" w:hAnsi="Consolas"/>
+        </w:rPr>
+        <w:t>black;</w:t>
+      </w:r>
+      <w:proofErr w:type="gramEnd"/>
+    </w:p>
+    <w:p>
+      <w:pPr>
+        <w:pBdr>
+          <w:top w:val="single" w:sz="4" w:space="1" w:color="auto"/>
+          <w:left w:val="single" w:sz="4" w:space="4" w:color="auto"/>
+          <w:bottom w:val="single" w:sz="4" w:space="1" w:color="auto"/>
+          <w:right w:val="single" w:sz="4" w:space="4" w:color="auto"/>
+        </w:pBdr>
+        <w:rPr>
+          <w:rFonts w:ascii="Consolas" w:hAnsi="Consolas"/>
+        </w:rPr>
+      </w:pPr>
+    </w:p>
+    <w:p>
+      <w:pPr>
+        <w:pBdr>
+          <w:top w:val="single" w:sz="4" w:space="1" w:color="auto"/>
+          <w:left w:val="single" w:sz="4" w:space="4" w:color="auto"/>
+          <w:bottom w:val="single" w:sz="4" w:space="1" w:color="auto"/>
+          <w:right w:val="single" w:sz="4" w:space="4" w:color="auto"/>
+        </w:pBdr>
+        <w:rPr>
+          <w:rFonts w:ascii="Consolas" w:hAnsi="Consolas"/>
+        </w:rPr>
+      </w:pPr>
+      <w:r>
+        <w:rPr>
+          <w:rFonts w:ascii="Consolas" w:hAnsi="Consolas"/>
+        </w:rPr>
+        <w:lastRenderedPageBreak/>
+        <w:t xml:space="preserve">    margin: </w:t>
+      </w:r>
+      <w:proofErr w:type="gramStart"/>
+      <w:r>
+        <w:rPr>
+          <w:rFonts w:ascii="Consolas" w:hAnsi="Consolas"/>
+        </w:rPr>
+        <w:t>1em;</w:t>
+      </w:r>
+      <w:proofErr w:type="gramEnd"/>
+    </w:p>
+    <w:p>
+      <w:pPr>
+        <w:pBdr>
+          <w:top w:val="single" w:sz="4" w:space="1" w:color="auto"/>
+          <w:left w:val="single" w:sz="4" w:space="4" w:color="auto"/>
+          <w:bottom w:val="single" w:sz="4" w:space="1" w:color="auto"/>
+          <w:right w:val="single" w:sz="4" w:space="4" w:color="auto"/>
+        </w:pBdr>
+        <w:rPr>
+          <w:rFonts w:ascii="Consolas" w:hAnsi="Consolas"/>
+        </w:rPr>
+      </w:pPr>
+      <w:r>
+        <w:rPr>
+          <w:rFonts w:ascii="Consolas" w:hAnsi="Consolas"/>
+        </w:rPr>
+        <w:t xml:space="preserve">    height: </w:t>
+      </w:r>
+      <w:proofErr w:type="gramStart"/>
+      <w:r>
+        <w:rPr>
+          <w:rFonts w:ascii="Consolas" w:hAnsi="Consolas"/>
+        </w:rPr>
+        <w:t>100%;</w:t>
+      </w:r>
+      <w:proofErr w:type="gramEnd"/>
+    </w:p>
+    <w:p>
+      <w:pPr>
+        <w:pBdr>
+          <w:top w:val="single" w:sz="4" w:space="1" w:color="auto"/>
+          <w:left w:val="single" w:sz="4" w:space="4" w:color="auto"/>
+          <w:bottom w:val="single" w:sz="4" w:space="1" w:color="auto"/>
+          <w:right w:val="single" w:sz="4" w:space="4" w:color="auto"/>
+        </w:pBdr>
+        <w:rPr>
+          <w:rFonts w:ascii="Consolas" w:hAnsi="Consolas"/>
+        </w:rPr>
+      </w:pPr>
+    </w:p>
+    <w:p>
+      <w:pPr>
+        <w:pBdr>
+          <w:top w:val="single" w:sz="4" w:space="1" w:color="auto"/>
+          <w:left w:val="single" w:sz="4" w:space="4" w:color="auto"/>
+          <w:bottom w:val="single" w:sz="4" w:space="1" w:color="auto"/>
+          <w:right w:val="single" w:sz="4" w:space="4" w:color="auto"/>
+        </w:pBdr>
+        <w:rPr>
+          <w:rFonts w:ascii="Consolas" w:hAnsi="Consolas"/>
+        </w:rPr>
+      </w:pPr>
+      <w:r>
+        <w:rPr>
+          <w:rFonts w:ascii="Consolas" w:hAnsi="Consolas"/>
+        </w:rPr>
+        <w:t xml:space="preserve">    display: </w:t>
+      </w:r>
+      <w:proofErr w:type="gramStart"/>
+      <w:r>
+        <w:rPr>
+          <w:rFonts w:ascii="Consolas" w:hAnsi="Consolas"/>
+        </w:rPr>
+        <w:t>flex;</w:t>
+      </w:r>
+      <w:proofErr w:type="gramEnd"/>
+    </w:p>
+    <w:p>
+      <w:pPr>
+        <w:pBdr>
+          <w:top w:val="single" w:sz="4" w:space="1" w:color="auto"/>
+          <w:left w:val="single" w:sz="4" w:space="4" w:color="auto"/>
+          <w:bottom w:val="single" w:sz="4" w:space="1" w:color="auto"/>
+          <w:right w:val="single" w:sz="4" w:space="4" w:color="auto"/>
+        </w:pBdr>
+        <w:rPr>
+          <w:rFonts w:ascii="Consolas" w:hAnsi="Consolas"/>
+        </w:rPr>
+      </w:pPr>
+      <w:r>
+        <w:rPr>
+          <w:rFonts w:ascii="Consolas" w:hAnsi="Consolas"/>
+        </w:rPr>
+        <w:t xml:space="preserve">    flex-direction: </w:t>
+      </w:r>
+      <w:proofErr w:type="gramStart"/>
+      <w:r>
+        <w:rPr>
+          <w:rFonts w:ascii="Consolas" w:hAnsi="Consolas"/>
+        </w:rPr>
+        <w:t>column;</w:t>
+      </w:r>
+      <w:proofErr w:type="gramEnd"/>
+    </w:p>
+    <w:p>
+      <w:pPr>
+        <w:pBdr>
+          <w:top w:val="single" w:sz="4" w:space="1" w:color="auto"/>
+          <w:left w:val="single" w:sz="4" w:space="4" w:color="auto"/>
+          <w:bottom w:val="single" w:sz="4" w:space="1" w:color="auto"/>
+          <w:right w:val="single" w:sz="4" w:space="4" w:color="auto"/>
+        </w:pBdr>
+        <w:rPr>
+          <w:rFonts w:ascii="Consolas" w:hAnsi="Consolas"/>
+        </w:rPr>
+      </w:pPr>
+      <w:r>
+        <w:rPr>
+          <w:rFonts w:ascii="Consolas" w:hAnsi="Consolas"/>
+        </w:rPr>
+        <w:t>}</w:t>
+      </w:r>
+    </w:p>
+    <w:p>
+      <w:pPr>
+        <w:pBdr>
+          <w:top w:val="single" w:sz="4" w:space="1" w:color="auto"/>
+          <w:left w:val="single" w:sz="4" w:space="4" w:color="auto"/>
+          <w:bottom w:val="single" w:sz="4" w:space="1" w:color="auto"/>
+          <w:right w:val="single" w:sz="4" w:space="4" w:color="auto"/>
+        </w:pBdr>
+        <w:rPr>
+          <w:rFonts w:ascii="Consolas" w:hAnsi="Consolas"/>
+        </w:rPr>
+      </w:pPr>
+    </w:p>
+    <w:p>
+      <w:pPr>
+        <w:pBdr>
+          <w:top w:val="single" w:sz="4" w:space="1" w:color="auto"/>
+          <w:left w:val="single" w:sz="4" w:space="4" w:color="auto"/>
+          <w:bottom w:val="single" w:sz="4" w:space="1" w:color="auto"/>
+          <w:right w:val="single" w:sz="4" w:space="4" w:color="auto"/>
+        </w:pBdr>
+        <w:rPr>
+          <w:rFonts w:ascii="Consolas" w:hAnsi="Consolas"/>
+        </w:rPr>
+      </w:pPr>
+      <w:proofErr w:type="gramStart"/>
+      <w:r>
+        <w:rPr>
+          <w:rFonts w:ascii="Consolas" w:hAnsi="Consolas"/>
+        </w:rPr>
+        <w:t>.side</w:t>
+      </w:r>
+      <w:proofErr w:type="gramEnd"/>
+      <w:r>
+        <w:rPr>
+          <w:rFonts w:ascii="Consolas" w:hAnsi="Consolas"/>
+        </w:rPr>
+        <w:t>-main</w:t>
+      </w:r>
+      <w:proofErr w:type="gramStart"/>
+      <w:r>
+        <w:rPr>
+          <w:rFonts w:ascii="Consolas" w:hAnsi="Consolas"/>
+        </w:rPr>
+        <w:t>, .side</w:t>
+      </w:r>
+      <w:proofErr w:type="gramEnd"/>
+      <w:r>
+        <w:rPr>
+          <w:rFonts w:ascii="Consolas" w:hAnsi="Consolas"/>
+        </w:rPr>
+        <w:t>-main main {</w:t>
+      </w:r>
+    </w:p>
+    <w:p>
+      <w:pPr>
+        <w:pBdr>
+          <w:top w:val="single" w:sz="4" w:space="1" w:color="auto"/>
+          <w:left w:val="single" w:sz="4" w:space="4" w:color="auto"/>
+          <w:bottom w:val="single" w:sz="4" w:space="1" w:color="auto"/>
+          <w:right w:val="single" w:sz="4" w:space="4" w:color="auto"/>
+        </w:pBdr>
+        <w:rPr>
+          <w:rFonts w:ascii="Consolas" w:hAnsi="Consolas"/>
+        </w:rPr>
+      </w:pPr>
+      <w:r>
+        <w:rPr>
+          <w:rFonts w:ascii="Consolas" w:hAnsi="Consolas"/>
+        </w:rPr>
+        <w:t>    border: solid #</w:t>
+      </w:r>
+      <w:proofErr w:type="gramStart"/>
+      <w:r>
+        <w:rPr>
+          <w:rFonts w:ascii="Consolas" w:hAnsi="Consolas"/>
+        </w:rPr>
+        <w:t>cfca9d;</w:t>
+      </w:r>
+      <w:proofErr w:type="gramEnd"/>
+    </w:p>
+    <w:p>
+      <w:pPr>
+        <w:pBdr>
+          <w:top w:val="single" w:sz="4" w:space="1" w:color="auto"/>
+          <w:left w:val="single" w:sz="4" w:space="4" w:color="auto"/>
+          <w:bottom w:val="single" w:sz="4" w:space="1" w:color="auto"/>
+          <w:right w:val="single" w:sz="4" w:space="4" w:color="auto"/>
+        </w:pBdr>
+        <w:rPr>
+          <w:rFonts w:ascii="Consolas" w:hAnsi="Consolas"/>
+        </w:rPr>
+      </w:pPr>
+      <w:r>
+        <w:rPr>
+          <w:rFonts w:ascii="Consolas" w:hAnsi="Consolas"/>
+        </w:rPr>
+        <w:t>}</w:t>
+      </w:r>
+    </w:p>
+    <w:p>
+      <w:pPr>
+        <w:pBdr>
+          <w:top w:val="single" w:sz="4" w:space="1" w:color="auto"/>
+          <w:left w:val="single" w:sz="4" w:space="4" w:color="auto"/>
+          <w:bottom w:val="single" w:sz="4" w:space="1" w:color="auto"/>
+          <w:right w:val="single" w:sz="4" w:space="4" w:color="auto"/>
+        </w:pBdr>
+        <w:rPr>
+          <w:rFonts w:ascii="Consolas" w:hAnsi="Consolas"/>
+        </w:rPr>
+      </w:pPr>
+    </w:p>
+    <w:p>
+      <w:pPr>
+        <w:pBdr>
+          <w:top w:val="single" w:sz="4" w:space="1" w:color="auto"/>
+          <w:left w:val="single" w:sz="4" w:space="4" w:color="auto"/>
+          <w:bottom w:val="single" w:sz="4" w:space="1" w:color="auto"/>
+          <w:right w:val="single" w:sz="4" w:space="4" w:color="auto"/>
+        </w:pBdr>
+        <w:rPr>
+          <w:rFonts w:ascii="Consolas" w:hAnsi="Consolas"/>
+        </w:rPr>
+      </w:pPr>
+      <w:proofErr w:type="gramStart"/>
+      <w:r>
+        <w:rPr>
+          <w:rFonts w:ascii="Consolas" w:hAnsi="Consolas"/>
+        </w:rPr>
+        <w:t>.side</w:t>
+      </w:r>
+      <w:proofErr w:type="gramEnd"/>
+      <w:r>
+        <w:rPr>
+          <w:rFonts w:ascii="Consolas" w:hAnsi="Consolas"/>
+        </w:rPr>
+        <w:t>-main {</w:t>
+      </w:r>
+    </w:p>
+    <w:p>
+      <w:pPr>
+        <w:pBdr>
+          <w:top w:val="single" w:sz="4" w:space="1" w:color="auto"/>
+          <w:left w:val="single" w:sz="4" w:space="4" w:color="auto"/>
+          <w:bottom w:val="single" w:sz="4" w:space="1" w:color="auto"/>
+          <w:right w:val="single" w:sz="4" w:space="4" w:color="auto"/>
+        </w:pBdr>
+        <w:rPr>
+          <w:rFonts w:ascii="Consolas" w:hAnsi="Consolas"/>
+        </w:rPr>
+      </w:pPr>
+      <w:r>
+        <w:rPr>
+          <w:rFonts w:ascii="Consolas" w:hAnsi="Consolas"/>
+        </w:rPr>
+        <w:t xml:space="preserve">    display: </w:t>
+      </w:r>
+      <w:proofErr w:type="gramStart"/>
+      <w:r>
+        <w:rPr>
+          <w:rFonts w:ascii="Consolas" w:hAnsi="Consolas"/>
+        </w:rPr>
+        <w:t>flex;</w:t>
+      </w:r>
+      <w:proofErr w:type="gramEnd"/>
+    </w:p>
+    <w:p>
+      <w:pPr>
+        <w:pBdr>
+          <w:top w:val="single" w:sz="4" w:space="1" w:color="auto"/>
+          <w:left w:val="single" w:sz="4" w:space="4" w:color="auto"/>
+          <w:bottom w:val="single" w:sz="4" w:space="1" w:color="auto"/>
+          <w:right w:val="single" w:sz="4" w:space="4" w:color="auto"/>
+        </w:pBdr>
+        <w:rPr>
+          <w:rFonts w:ascii="Consolas" w:hAnsi="Consolas"/>
+        </w:rPr>
+      </w:pPr>
+      <w:r>
+        <w:rPr>
+          <w:rFonts w:ascii="Consolas" w:hAnsi="Consolas"/>
+        </w:rPr>
+        <w:t xml:space="preserve">    border-width: 2px </w:t>
+      </w:r>
+      <w:proofErr w:type="gramStart"/>
+      <w:r>
+        <w:rPr>
+          <w:rFonts w:ascii="Consolas" w:hAnsi="Consolas"/>
+        </w:rPr>
+        <w:t>0;</w:t>
+      </w:r>
+      <w:proofErr w:type="gramEnd"/>
+    </w:p>
+    <w:p>
+      <w:pPr>
+        <w:pBdr>
+          <w:top w:val="single" w:sz="4" w:space="1" w:color="auto"/>
+          <w:left w:val="single" w:sz="4" w:space="4" w:color="auto"/>
+          <w:bottom w:val="single" w:sz="4" w:space="1" w:color="auto"/>
+          <w:right w:val="single" w:sz="4" w:space="4" w:color="auto"/>
+        </w:pBdr>
+        <w:rPr>
+          <w:rFonts w:ascii="Consolas" w:hAnsi="Consolas"/>
+        </w:rPr>
+      </w:pPr>
+    </w:p>
+    <w:p>
+      <w:pPr>
+        <w:pBdr>
+          <w:top w:val="single" w:sz="4" w:space="1" w:color="auto"/>
+          <w:left w:val="single" w:sz="4" w:space="4" w:color="auto"/>
+          <w:bottom w:val="single" w:sz="4" w:space="1" w:color="auto"/>
+          <w:right w:val="single" w:sz="4" w:space="4" w:color="auto"/>
+        </w:pBdr>
+        <w:rPr>
+          <w:rFonts w:ascii="Consolas" w:hAnsi="Consolas"/>
+        </w:rPr>
+      </w:pPr>
+      <w:r>
+        <w:rPr>
+          <w:rFonts w:ascii="Consolas" w:hAnsi="Consolas"/>
+        </w:rPr>
+        <w:t xml:space="preserve">    height: </w:t>
+      </w:r>
+      <w:proofErr w:type="gramStart"/>
+      <w:r>
+        <w:rPr>
+          <w:rFonts w:ascii="Consolas" w:hAnsi="Consolas"/>
+        </w:rPr>
+        <w:t>100%;</w:t>
+      </w:r>
+      <w:proofErr w:type="gramEnd"/>
+    </w:p>
+    <w:p>
+      <w:pPr>
+        <w:pBdr>
+          <w:top w:val="single" w:sz="4" w:space="1" w:color="auto"/>
+          <w:left w:val="single" w:sz="4" w:space="4" w:color="auto"/>
+          <w:bottom w:val="single" w:sz="4" w:space="1" w:color="auto"/>
+          <w:right w:val="single" w:sz="4" w:space="4" w:color="auto"/>
+        </w:pBdr>
+        <w:rPr>
+          <w:rFonts w:ascii="Consolas" w:hAnsi="Consolas"/>
+        </w:rPr>
+      </w:pPr>
+      <w:r>
+        <w:rPr>
+          <w:rFonts w:ascii="Consolas" w:hAnsi="Consolas"/>
+        </w:rPr>
+        <w:t>}</w:t>
+      </w:r>
+    </w:p>
+    <w:p>
+      <w:pPr>
+        <w:pBdr>
+          <w:top w:val="single" w:sz="4" w:space="1" w:color="auto"/>
+          <w:left w:val="single" w:sz="4" w:space="4" w:color="auto"/>
+          <w:bottom w:val="single" w:sz="4" w:space="1" w:color="auto"/>
+          <w:right w:val="single" w:sz="4" w:space="4" w:color="auto"/>
+        </w:pBdr>
+        <w:rPr>
+          <w:rFonts w:ascii="Consolas" w:hAnsi="Consolas"/>
+        </w:rPr>
+      </w:pPr>
+    </w:p>
+    <w:p>
+      <w:pPr>
+        <w:pBdr>
+          <w:top w:val="single" w:sz="4" w:space="1" w:color="auto"/>
+          <w:left w:val="single" w:sz="4" w:space="4" w:color="auto"/>
+          <w:bottom w:val="single" w:sz="4" w:space="1" w:color="auto"/>
+          <w:right w:val="single" w:sz="4" w:space="4" w:color="auto"/>
+        </w:pBdr>
+        <w:rPr>
+          <w:rFonts w:ascii="Consolas" w:hAnsi="Consolas"/>
+        </w:rPr>
+      </w:pPr>
+      <w:proofErr w:type="gramStart"/>
+      <w:r>
+        <w:rPr>
+          <w:rFonts w:ascii="Consolas" w:hAnsi="Consolas"/>
+        </w:rPr>
+        <w:t>.side</w:t>
+      </w:r>
+      <w:proofErr w:type="gramEnd"/>
+      <w:r>
+        <w:rPr>
+          <w:rFonts w:ascii="Consolas" w:hAnsi="Consolas"/>
+        </w:rPr>
+        <w:t>-</w:t>
+      </w:r>
+      <w:proofErr w:type="gramStart"/>
+      <w:r>
+        <w:rPr>
+          <w:rFonts w:ascii="Consolas" w:hAnsi="Consolas"/>
+        </w:rPr>
+        <w:t>main * {</w:t>
+      </w:r>
+      <w:proofErr w:type="gramEnd"/>
+    </w:p>
+    <w:p>
+      <w:pPr>
+        <w:pBdr>
+          <w:top w:val="single" w:sz="4" w:space="1" w:color="auto"/>
+          <w:left w:val="single" w:sz="4" w:space="4" w:color="auto"/>
+          <w:bottom w:val="single" w:sz="4" w:space="1" w:color="auto"/>
+          <w:right w:val="single" w:sz="4" w:space="4" w:color="auto"/>
+        </w:pBdr>
+        <w:rPr>
+          <w:rFonts w:ascii="Consolas" w:hAnsi="Consolas"/>
+        </w:rPr>
+      </w:pPr>
+      <w:r>
+        <w:rPr>
+          <w:rFonts w:ascii="Consolas" w:hAnsi="Consolas"/>
+        </w:rPr>
+        <w:t xml:space="preserve">    flex: </w:t>
+      </w:r>
+      <w:proofErr w:type="gramStart"/>
+      <w:r>
+        <w:rPr>
+          <w:rFonts w:ascii="Consolas" w:hAnsi="Consolas"/>
+        </w:rPr>
+        <w:t>1;</w:t>
+      </w:r>
+      <w:proofErr w:type="gramEnd"/>
+    </w:p>
+    <w:p>
+      <w:pPr>
+        <w:pBdr>
+          <w:top w:val="single" w:sz="4" w:space="1" w:color="auto"/>
+          <w:left w:val="single" w:sz="4" w:space="4" w:color="auto"/>
+          <w:bottom w:val="single" w:sz="4" w:space="1" w:color="auto"/>
+          <w:right w:val="single" w:sz="4" w:space="4" w:color="auto"/>
+        </w:pBdr>
+        <w:rPr>
+          <w:rFonts w:ascii="Consolas" w:hAnsi="Consolas"/>
+        </w:rPr>
+      </w:pPr>
+      <w:r>
+        <w:rPr>
+          <w:rFonts w:ascii="Consolas" w:hAnsi="Consolas"/>
+        </w:rPr>
+        <w:t>}</w:t>
+      </w:r>
+    </w:p>
+    <w:p>
+      <w:pPr>
+        <w:pBdr>
+          <w:top w:val="single" w:sz="4" w:space="1" w:color="auto"/>
+          <w:left w:val="single" w:sz="4" w:space="4" w:color="auto"/>
+          <w:bottom w:val="single" w:sz="4" w:space="1" w:color="auto"/>
+          <w:right w:val="single" w:sz="4" w:space="4" w:color="auto"/>
+        </w:pBdr>
+        <w:rPr>
+          <w:rFonts w:ascii="Consolas" w:hAnsi="Consolas"/>
+        </w:rPr>
+      </w:pPr>
+    </w:p>
+    <w:p>
+      <w:pPr>
+        <w:pBdr>
+          <w:top w:val="single" w:sz="4" w:space="1" w:color="auto"/>
+          <w:left w:val="single" w:sz="4" w:space="4" w:color="auto"/>
+          <w:bottom w:val="single" w:sz="4" w:space="1" w:color="auto"/>
+          <w:right w:val="single" w:sz="4" w:space="4" w:color="auto"/>
+        </w:pBdr>
+        <w:rPr>
+          <w:rFonts w:ascii="Consolas" w:hAnsi="Consolas"/>
+        </w:rPr>
+      </w:pPr>
+      <w:proofErr w:type="gramStart"/>
+      <w:r>
+        <w:rPr>
+          <w:rFonts w:ascii="Consolas" w:hAnsi="Consolas"/>
+        </w:rPr>
+        <w:t>.side</w:t>
+      </w:r>
+      <w:proofErr w:type="gramEnd"/>
+      <w:r>
+        <w:rPr>
+          <w:rFonts w:ascii="Consolas" w:hAnsi="Consolas"/>
+        </w:rPr>
+        <w:t>-</w:t>
+      </w:r>
+      <w:proofErr w:type="gramStart"/>
+      <w:r>
+        <w:rPr>
+          <w:rFonts w:ascii="Consolas" w:hAnsi="Consolas"/>
+        </w:rPr>
+        <w:t>main</w:t>
+      </w:r>
+      <w:proofErr w:type="gramEnd"/>
+      <w:r>
+        <w:rPr>
+          <w:rFonts w:ascii="Consolas" w:hAnsi="Consolas"/>
+        </w:rPr>
+        <w:t xml:space="preserve"> main {</w:t>
+      </w:r>
+    </w:p>
+    <w:p>
+      <w:pPr>
+        <w:pBdr>
+          <w:top w:val="single" w:sz="4" w:space="1" w:color="auto"/>
+          <w:left w:val="single" w:sz="4" w:space="4" w:color="auto"/>
+          <w:bottom w:val="single" w:sz="4" w:space="1" w:color="auto"/>
+          <w:right w:val="single" w:sz="4" w:space="4" w:color="auto"/>
+        </w:pBdr>
+        <w:rPr>
+          <w:rFonts w:ascii="Consolas" w:hAnsi="Consolas"/>
+        </w:rPr>
+      </w:pPr>
+      <w:r>
+        <w:rPr>
+          <w:rFonts w:ascii="Consolas" w:hAnsi="Consolas"/>
+        </w:rPr>
+        <w:t xml:space="preserve">    flex: </w:t>
+      </w:r>
+      <w:proofErr w:type="gramStart"/>
+      <w:r>
+        <w:rPr>
+          <w:rFonts w:ascii="Consolas" w:hAnsi="Consolas"/>
+        </w:rPr>
+        <w:t>3;</w:t>
+      </w:r>
+      <w:proofErr w:type="gramEnd"/>
+    </w:p>
+    <w:p>
+      <w:pPr>
+        <w:pBdr>
+          <w:top w:val="single" w:sz="4" w:space="1" w:color="auto"/>
+          <w:left w:val="single" w:sz="4" w:space="4" w:color="auto"/>
+          <w:bottom w:val="single" w:sz="4" w:space="1" w:color="auto"/>
+          <w:right w:val="single" w:sz="4" w:space="4" w:color="auto"/>
+        </w:pBdr>
+        <w:rPr>
+          <w:rFonts w:ascii="Consolas" w:hAnsi="Consolas"/>
+        </w:rPr>
+      </w:pPr>
+      <w:r>
+        <w:rPr>
+          <w:rFonts w:ascii="Consolas" w:hAnsi="Consolas"/>
+        </w:rPr>
+        <w:t xml:space="preserve">    border-width: 0 </w:t>
+      </w:r>
+      <w:proofErr w:type="gramStart"/>
+      <w:r>
+        <w:rPr>
+          <w:rFonts w:ascii="Consolas" w:hAnsi="Consolas"/>
+        </w:rPr>
+        <w:t>2px;</w:t>
+      </w:r>
+      <w:proofErr w:type="gramEnd"/>
+    </w:p>
+    <w:p>
+      <w:pPr>
+        <w:pBdr>
+          <w:top w:val="single" w:sz="4" w:space="1" w:color="auto"/>
+          <w:left w:val="single" w:sz="4" w:space="4" w:color="auto"/>
+          <w:bottom w:val="single" w:sz="4" w:space="1" w:color="auto"/>
+          <w:right w:val="single" w:sz="4" w:space="4" w:color="auto"/>
+        </w:pBdr>
+        <w:rPr>
+          <w:rFonts w:ascii="Consolas" w:hAnsi="Consolas"/>
+        </w:rPr>
+      </w:pPr>
+      <w:r>
+        <w:rPr>
+          <w:rFonts w:ascii="Consolas" w:hAnsi="Consolas"/>
+        </w:rPr>
+        <w:t>}</w:t>
+      </w:r>
+    </w:p>
+    <w:p/>
+    <w:p>
+      <w:pPr>
+        <w:pStyle w:val="Heading2"/>
+      </w:pPr>
+      <w:r>
+        <w:lastRenderedPageBreak/>
+        <w:t>Result</w:t>
+      </w:r>
+    </w:p>
+    <w:p>
+      <w:r>
+        <w:rPr>
+          <w:noProof/>
+        </w:rPr>
+        <w:drawing>
+          <wp:inline distT="0" distB="0" distL="0" distR="0" wp14:anchorId="2460918C" wp14:editId="4EE49F3B">
+            <wp:extent cx="5943600" cy="2689860"/>
+            <wp:effectExtent l="0" t="0" r="0" b="0"/>
+            <wp:docPr id="566405742" name="Picture 1"/>
+            <wp:cNvGraphicFramePr>
+              <a:graphicFrameLocks xmlns:a="http://schemas.openxmlformats.org/drawingml/2006/main" noChangeAspect="1"/>
+            </wp:cNvGraphicFramePr>
+            <a:graphic xmlns:a="http://schemas.openxmlformats.org/drawingml/2006/main">
+              <a:graphicData uri="http://schemas.openxmlformats.org/drawingml/2006/picture">
+                <pic:pic xmlns:pic="http://schemas.openxmlformats.org/drawingml/2006/picture">
+                  <pic:nvPicPr>
+                    <pic:cNvPr id="566405742" name=""/>
+                    <pic:cNvPicPr/>
+                  </pic:nvPicPr>
+                  <pic:blipFill>
+                    <a:blip r:embed="rId7"/>
+                    <a:stretch>
+                      <a:fillRect/>
+                    </a:stretch>
+                  </pic:blipFill>
+                  <pic:spPr>
+                    <a:xfrm>
+                      <a:off x="0" y="0"/>
+                      <a:ext cx="5943600" cy="2689860"/>
+                    </a:xfrm>
+                    <a:prstGeom prst="rect">
+                      <a:avLst/>
+                    </a:prstGeom>
+                  </pic:spPr>
+                </pic:pic>
+              </a:graphicData>
+            </a:graphic>
+          </wp:inline>
+        </w:drawing>
+      </w:r>
+    </w:p>
+    <w:p/>
     <w:p/>
     <w:sectPr>
       <w:pgSz w:w="12240" w:h="15840"/>

</xml_diff>

<commit_message>
Exercise 4 of Lab 02 and directory page update
</commit_message>
<xml_diff>
--- a/02/WEB-Lab02-ITCSIU24039-Vũ Quốc Khánh.docx
+++ b/02/WEB-Lab02-ITCSIU24039-Vũ Quốc Khánh.docx
@@ -4564,6 +4564,4317 @@
       </w:r>
     </w:p>
     <w:p/>
+    <w:p>
+      <w:pPr>
+        <w:pStyle w:val="Heading1"/>
+      </w:pPr>
+      <w:r>
+        <w:t>Exercise 4</w:t>
+      </w:r>
+    </w:p>
+    <w:p>
+      <w:pPr>
+        <w:pStyle w:val="Heading2"/>
+      </w:pPr>
+      <w:r>
+        <w:t>HTML Code</w:t>
+      </w:r>
+    </w:p>
+    <w:p>
+      <w:pPr>
+        <w:pBdr>
+          <w:top w:val="single" w:sz="4" w:space="1" w:color="auto"/>
+          <w:left w:val="single" w:sz="4" w:space="1" w:color="auto"/>
+          <w:bottom w:val="single" w:sz="4" w:space="1" w:color="auto"/>
+          <w:right w:val="single" w:sz="4" w:space="1" w:color="auto"/>
+        </w:pBdr>
+        <w:rPr>
+          <w:rFonts w:ascii="Consolas" w:hAnsi="Consolas"/>
+        </w:rPr>
+      </w:pPr>
+      <w:r>
+        <w:rPr>
+          <w:rFonts w:ascii="Consolas" w:hAnsi="Consolas"/>
+        </w:rPr>
+        <w:t>&lt;!DOCTYPE html&gt;</w:t>
+      </w:r>
+    </w:p>
+    <w:p>
+      <w:pPr>
+        <w:pBdr>
+          <w:top w:val="single" w:sz="4" w:space="1" w:color="auto"/>
+          <w:left w:val="single" w:sz="4" w:space="1" w:color="auto"/>
+          <w:bottom w:val="single" w:sz="4" w:space="1" w:color="auto"/>
+          <w:right w:val="single" w:sz="4" w:space="1" w:color="auto"/>
+        </w:pBdr>
+        <w:rPr>
+          <w:rFonts w:ascii="Consolas" w:hAnsi="Consolas"/>
+        </w:rPr>
+      </w:pPr>
+      <w:r>
+        <w:rPr>
+          <w:rFonts w:ascii="Consolas" w:hAnsi="Consolas"/>
+        </w:rPr>
+        <w:t>&lt;html lang="</w:t>
+      </w:r>
+      <w:proofErr w:type="spellStart"/>
+      <w:r>
+        <w:rPr>
+          <w:rFonts w:ascii="Consolas" w:hAnsi="Consolas"/>
+        </w:rPr>
+        <w:t>en</w:t>
+      </w:r>
+      <w:proofErr w:type="spellEnd"/>
+      <w:r>
+        <w:rPr>
+          <w:rFonts w:ascii="Consolas" w:hAnsi="Consolas"/>
+        </w:rPr>
+        <w:t>"&gt;</w:t>
+      </w:r>
+    </w:p>
+    <w:p>
+      <w:pPr>
+        <w:pBdr>
+          <w:top w:val="single" w:sz="4" w:space="1" w:color="auto"/>
+          <w:left w:val="single" w:sz="4" w:space="1" w:color="auto"/>
+          <w:bottom w:val="single" w:sz="4" w:space="1" w:color="auto"/>
+          <w:right w:val="single" w:sz="4" w:space="1" w:color="auto"/>
+        </w:pBdr>
+        <w:rPr>
+          <w:rFonts w:ascii="Consolas" w:hAnsi="Consolas"/>
+        </w:rPr>
+      </w:pPr>
+      <w:r>
+        <w:rPr>
+          <w:rFonts w:ascii="Consolas" w:hAnsi="Consolas"/>
+        </w:rPr>
+        <w:t>&lt;head&gt;</w:t>
+      </w:r>
+    </w:p>
+    <w:p>
+      <w:pPr>
+        <w:pBdr>
+          <w:top w:val="single" w:sz="4" w:space="1" w:color="auto"/>
+          <w:left w:val="single" w:sz="4" w:space="1" w:color="auto"/>
+          <w:bottom w:val="single" w:sz="4" w:space="1" w:color="auto"/>
+          <w:right w:val="single" w:sz="4" w:space="1" w:color="auto"/>
+        </w:pBdr>
+        <w:rPr>
+          <w:rFonts w:ascii="Consolas" w:hAnsi="Consolas"/>
+        </w:rPr>
+      </w:pPr>
+      <w:r>
+        <w:rPr>
+          <w:rFonts w:ascii="Consolas" w:hAnsi="Consolas"/>
+        </w:rPr>
+        <w:t>    &lt;meta charset="UTF-8"&gt;</w:t>
+      </w:r>
+    </w:p>
+    <w:p>
+      <w:pPr>
+        <w:pBdr>
+          <w:top w:val="single" w:sz="4" w:space="1" w:color="auto"/>
+          <w:left w:val="single" w:sz="4" w:space="1" w:color="auto"/>
+          <w:bottom w:val="single" w:sz="4" w:space="1" w:color="auto"/>
+          <w:right w:val="single" w:sz="4" w:space="1" w:color="auto"/>
+        </w:pBdr>
+        <w:rPr>
+          <w:rFonts w:ascii="Consolas" w:hAnsi="Consolas"/>
+        </w:rPr>
+      </w:pPr>
+      <w:r>
+        <w:rPr>
+          <w:rFonts w:ascii="Consolas" w:hAnsi="Consolas"/>
+        </w:rPr>
+        <w:t>    &lt;meta name="viewport" content="width=device-width, initial-scale=1.0"&gt;</w:t>
+      </w:r>
+    </w:p>
+    <w:p>
+      <w:pPr>
+        <w:pBdr>
+          <w:top w:val="single" w:sz="4" w:space="1" w:color="auto"/>
+          <w:left w:val="single" w:sz="4" w:space="1" w:color="auto"/>
+          <w:bottom w:val="single" w:sz="4" w:space="1" w:color="auto"/>
+          <w:right w:val="single" w:sz="4" w:space="1" w:color="auto"/>
+        </w:pBdr>
+        <w:rPr>
+          <w:rFonts w:ascii="Consolas" w:hAnsi="Consolas"/>
+        </w:rPr>
+      </w:pPr>
+      <w:r>
+        <w:rPr>
+          <w:rFonts w:ascii="Consolas" w:hAnsi="Consolas"/>
+        </w:rPr>
+        <w:t xml:space="preserve">    &lt;link </w:t>
+      </w:r>
+      <w:proofErr w:type="spellStart"/>
+      <w:r>
+        <w:rPr>
+          <w:rFonts w:ascii="Consolas" w:hAnsi="Consolas"/>
+        </w:rPr>
+        <w:t>rel</w:t>
+      </w:r>
+      <w:proofErr w:type="spellEnd"/>
+      <w:r>
+        <w:rPr>
+          <w:rFonts w:ascii="Consolas" w:hAnsi="Consolas"/>
+        </w:rPr>
+        <w:t xml:space="preserve">="stylesheet" </w:t>
+      </w:r>
+      <w:proofErr w:type="spellStart"/>
+      <w:r>
+        <w:rPr>
+          <w:rFonts w:ascii="Consolas" w:hAnsi="Consolas"/>
+        </w:rPr>
+        <w:t>href</w:t>
+      </w:r>
+      <w:proofErr w:type="spellEnd"/>
+      <w:r>
+        <w:rPr>
+          <w:rFonts w:ascii="Consolas" w:hAnsi="Consolas"/>
+        </w:rPr>
+        <w:t>="./style.css"&gt;</w:t>
+      </w:r>
+    </w:p>
+    <w:p>
+      <w:pPr>
+        <w:pBdr>
+          <w:top w:val="single" w:sz="4" w:space="1" w:color="auto"/>
+          <w:left w:val="single" w:sz="4" w:space="1" w:color="auto"/>
+          <w:bottom w:val="single" w:sz="4" w:space="1" w:color="auto"/>
+          <w:right w:val="single" w:sz="4" w:space="1" w:color="auto"/>
+        </w:pBdr>
+        <w:rPr>
+          <w:rFonts w:ascii="Consolas" w:hAnsi="Consolas"/>
+        </w:rPr>
+      </w:pPr>
+      <w:r>
+        <w:rPr>
+          <w:rFonts w:ascii="Consolas" w:hAnsi="Consolas"/>
+        </w:rPr>
+        <w:t>    &lt;title&gt;San Joaquin Valley Town Hall&lt;/title&gt;</w:t>
+      </w:r>
+    </w:p>
+    <w:p>
+      <w:pPr>
+        <w:pBdr>
+          <w:top w:val="single" w:sz="4" w:space="1" w:color="auto"/>
+          <w:left w:val="single" w:sz="4" w:space="1" w:color="auto"/>
+          <w:bottom w:val="single" w:sz="4" w:space="1" w:color="auto"/>
+          <w:right w:val="single" w:sz="4" w:space="1" w:color="auto"/>
+        </w:pBdr>
+        <w:rPr>
+          <w:rFonts w:ascii="Consolas" w:hAnsi="Consolas"/>
+        </w:rPr>
+      </w:pPr>
+      <w:r>
+        <w:rPr>
+          <w:rFonts w:ascii="Consolas" w:hAnsi="Consolas"/>
+        </w:rPr>
+        <w:t>&lt;/head&gt;</w:t>
+      </w:r>
+    </w:p>
+    <w:p>
+      <w:pPr>
+        <w:pBdr>
+          <w:top w:val="single" w:sz="4" w:space="1" w:color="auto"/>
+          <w:left w:val="single" w:sz="4" w:space="1" w:color="auto"/>
+          <w:bottom w:val="single" w:sz="4" w:space="1" w:color="auto"/>
+          <w:right w:val="single" w:sz="4" w:space="1" w:color="auto"/>
+        </w:pBdr>
+        <w:rPr>
+          <w:rFonts w:ascii="Consolas" w:hAnsi="Consolas"/>
+        </w:rPr>
+      </w:pPr>
+      <w:r>
+        <w:rPr>
+          <w:rFonts w:ascii="Consolas" w:hAnsi="Consolas"/>
+        </w:rPr>
+        <w:t>&lt;body&gt;</w:t>
+      </w:r>
+    </w:p>
+    <w:p>
+      <w:pPr>
+        <w:pBdr>
+          <w:top w:val="single" w:sz="4" w:space="1" w:color="auto"/>
+          <w:left w:val="single" w:sz="4" w:space="1" w:color="auto"/>
+          <w:bottom w:val="single" w:sz="4" w:space="1" w:color="auto"/>
+          <w:right w:val="single" w:sz="4" w:space="1" w:color="auto"/>
+        </w:pBdr>
+        <w:rPr>
+          <w:rFonts w:ascii="Consolas" w:hAnsi="Consolas"/>
+        </w:rPr>
+      </w:pPr>
+      <w:r>
+        <w:rPr>
+          <w:rFonts w:ascii="Consolas" w:hAnsi="Consolas"/>
+        </w:rPr>
+        <w:t>    &lt;section class="container"&gt;</w:t>
+      </w:r>
+    </w:p>
+    <w:p>
+      <w:pPr>
+        <w:pBdr>
+          <w:top w:val="single" w:sz="4" w:space="1" w:color="auto"/>
+          <w:left w:val="single" w:sz="4" w:space="1" w:color="auto"/>
+          <w:bottom w:val="single" w:sz="4" w:space="1" w:color="auto"/>
+          <w:right w:val="single" w:sz="4" w:space="1" w:color="auto"/>
+        </w:pBdr>
+        <w:rPr>
+          <w:rFonts w:ascii="Consolas" w:hAnsi="Consolas"/>
+        </w:rPr>
+      </w:pPr>
+      <w:r>
+        <w:rPr>
+          <w:rFonts w:ascii="Consolas" w:hAnsi="Consolas"/>
+        </w:rPr>
+        <w:t>        &lt;header&gt;</w:t>
+      </w:r>
+    </w:p>
+    <w:p>
+      <w:pPr>
+        <w:pBdr>
+          <w:top w:val="single" w:sz="4" w:space="1" w:color="auto"/>
+          <w:left w:val="single" w:sz="4" w:space="1" w:color="auto"/>
+          <w:bottom w:val="single" w:sz="4" w:space="1" w:color="auto"/>
+          <w:right w:val="single" w:sz="4" w:space="1" w:color="auto"/>
+        </w:pBdr>
+        <w:rPr>
+          <w:rFonts w:ascii="Consolas" w:hAnsi="Consolas"/>
+        </w:rPr>
+      </w:pPr>
+      <w:r>
+        <w:rPr>
+          <w:rFonts w:ascii="Consolas" w:hAnsi="Consolas"/>
+        </w:rPr>
+        <w:t>            &lt;aside&gt;</w:t>
+      </w:r>
+    </w:p>
+    <w:p>
+      <w:pPr>
+        <w:pBdr>
+          <w:top w:val="single" w:sz="4" w:space="1" w:color="auto"/>
+          <w:left w:val="single" w:sz="4" w:space="1" w:color="auto"/>
+          <w:bottom w:val="single" w:sz="4" w:space="1" w:color="auto"/>
+          <w:right w:val="single" w:sz="4" w:space="1" w:color="auto"/>
+        </w:pBdr>
+        <w:rPr>
+          <w:rFonts w:ascii="Consolas" w:hAnsi="Consolas"/>
+        </w:rPr>
+      </w:pPr>
+      <w:r>
+        <w:rPr>
+          <w:rFonts w:ascii="Consolas" w:hAnsi="Consolas"/>
+        </w:rPr>
+        <w:lastRenderedPageBreak/>
+        <w:t>                &lt;</w:t>
+      </w:r>
+      <w:proofErr w:type="spellStart"/>
+      <w:r>
+        <w:rPr>
+          <w:rFonts w:ascii="Consolas" w:hAnsi="Consolas"/>
+        </w:rPr>
+        <w:t>img</w:t>
+      </w:r>
+      <w:proofErr w:type="spellEnd"/>
+      <w:r>
+        <w:rPr>
+          <w:rFonts w:ascii="Consolas" w:hAnsi="Consolas"/>
+        </w:rPr>
+        <w:t xml:space="preserve"> </w:t>
+      </w:r>
+      <w:proofErr w:type="spellStart"/>
+      <w:r>
+        <w:rPr>
+          <w:rFonts w:ascii="Consolas" w:hAnsi="Consolas"/>
+        </w:rPr>
+        <w:t>src</w:t>
+      </w:r>
+      <w:proofErr w:type="spellEnd"/>
+      <w:r>
+        <w:rPr>
+          <w:rFonts w:ascii="Consolas" w:hAnsi="Consolas"/>
+        </w:rPr>
+        <w:t>="./San-Joaquin-Valley-Town-Hall-logo.png" alt="Logo of San Joaquin Valley Town Hall"&gt;</w:t>
+      </w:r>
+    </w:p>
+    <w:p>
+      <w:pPr>
+        <w:pBdr>
+          <w:top w:val="single" w:sz="4" w:space="1" w:color="auto"/>
+          <w:left w:val="single" w:sz="4" w:space="1" w:color="auto"/>
+          <w:bottom w:val="single" w:sz="4" w:space="1" w:color="auto"/>
+          <w:right w:val="single" w:sz="4" w:space="1" w:color="auto"/>
+        </w:pBdr>
+        <w:rPr>
+          <w:rFonts w:ascii="Consolas" w:hAnsi="Consolas"/>
+        </w:rPr>
+      </w:pPr>
+      <w:r>
+        <w:rPr>
+          <w:rFonts w:ascii="Consolas" w:hAnsi="Consolas"/>
+        </w:rPr>
+        <w:t>            &lt;/aside&gt;</w:t>
+      </w:r>
+    </w:p>
+    <w:p>
+      <w:pPr>
+        <w:pBdr>
+          <w:top w:val="single" w:sz="4" w:space="1" w:color="auto"/>
+          <w:left w:val="single" w:sz="4" w:space="1" w:color="auto"/>
+          <w:bottom w:val="single" w:sz="4" w:space="1" w:color="auto"/>
+          <w:right w:val="single" w:sz="4" w:space="1" w:color="auto"/>
+        </w:pBdr>
+        <w:rPr>
+          <w:rFonts w:ascii="Consolas" w:hAnsi="Consolas"/>
+        </w:rPr>
+      </w:pPr>
+      <w:r>
+        <w:rPr>
+          <w:rFonts w:ascii="Consolas" w:hAnsi="Consolas"/>
+        </w:rPr>
+        <w:t>            &lt;div class="title"&gt;</w:t>
+      </w:r>
+    </w:p>
+    <w:p>
+      <w:pPr>
+        <w:pBdr>
+          <w:top w:val="single" w:sz="4" w:space="1" w:color="auto"/>
+          <w:left w:val="single" w:sz="4" w:space="1" w:color="auto"/>
+          <w:bottom w:val="single" w:sz="4" w:space="1" w:color="auto"/>
+          <w:right w:val="single" w:sz="4" w:space="1" w:color="auto"/>
+        </w:pBdr>
+        <w:rPr>
+          <w:rFonts w:ascii="Consolas" w:hAnsi="Consolas"/>
+        </w:rPr>
+      </w:pPr>
+      <w:r>
+        <w:rPr>
+          <w:rFonts w:ascii="Consolas" w:hAnsi="Consolas"/>
+        </w:rPr>
+        <w:t>                &lt;h1&gt;San Joaquin Valley Town Hall&lt;/h1&gt;</w:t>
+      </w:r>
+    </w:p>
+    <w:p>
+      <w:pPr>
+        <w:pBdr>
+          <w:top w:val="single" w:sz="4" w:space="1" w:color="auto"/>
+          <w:left w:val="single" w:sz="4" w:space="1" w:color="auto"/>
+          <w:bottom w:val="single" w:sz="4" w:space="1" w:color="auto"/>
+          <w:right w:val="single" w:sz="4" w:space="1" w:color="auto"/>
+        </w:pBdr>
+        <w:rPr>
+          <w:rFonts w:ascii="Consolas" w:hAnsi="Consolas"/>
+        </w:rPr>
+      </w:pPr>
+      <w:r>
+        <w:rPr>
+          <w:rFonts w:ascii="Consolas" w:hAnsi="Consolas"/>
+        </w:rPr>
+        <w:t>                &lt;span class="subtitles"&gt;</w:t>
+      </w:r>
+    </w:p>
+    <w:p>
+      <w:pPr>
+        <w:pBdr>
+          <w:top w:val="single" w:sz="4" w:space="1" w:color="auto"/>
+          <w:left w:val="single" w:sz="4" w:space="1" w:color="auto"/>
+          <w:bottom w:val="single" w:sz="4" w:space="1" w:color="auto"/>
+          <w:right w:val="single" w:sz="4" w:space="1" w:color="auto"/>
+        </w:pBdr>
+        <w:rPr>
+          <w:rFonts w:ascii="Consolas" w:hAnsi="Consolas"/>
+        </w:rPr>
+      </w:pPr>
+      <w:r>
+        <w:rPr>
+          <w:rFonts w:ascii="Consolas" w:hAnsi="Consolas"/>
+        </w:rPr>
+        <w:t>                    Bringing cutting-edge speakers to the valley</w:t>
+      </w:r>
+    </w:p>
+    <w:p>
+      <w:pPr>
+        <w:pBdr>
+          <w:top w:val="single" w:sz="4" w:space="1" w:color="auto"/>
+          <w:left w:val="single" w:sz="4" w:space="1" w:color="auto"/>
+          <w:bottom w:val="single" w:sz="4" w:space="1" w:color="auto"/>
+          <w:right w:val="single" w:sz="4" w:space="1" w:color="auto"/>
+        </w:pBdr>
+        <w:rPr>
+          <w:rFonts w:ascii="Consolas" w:hAnsi="Consolas"/>
+        </w:rPr>
+      </w:pPr>
+      <w:r>
+        <w:rPr>
+          <w:rFonts w:ascii="Consolas" w:hAnsi="Consolas"/>
+        </w:rPr>
+        <w:t>                &lt;/span&gt;</w:t>
+      </w:r>
+    </w:p>
+    <w:p>
+      <w:pPr>
+        <w:pBdr>
+          <w:top w:val="single" w:sz="4" w:space="1" w:color="auto"/>
+          <w:left w:val="single" w:sz="4" w:space="1" w:color="auto"/>
+          <w:bottom w:val="single" w:sz="4" w:space="1" w:color="auto"/>
+          <w:right w:val="single" w:sz="4" w:space="1" w:color="auto"/>
+        </w:pBdr>
+        <w:rPr>
+          <w:rFonts w:ascii="Consolas" w:hAnsi="Consolas"/>
+        </w:rPr>
+      </w:pPr>
+      <w:r>
+        <w:rPr>
+          <w:rFonts w:ascii="Consolas" w:hAnsi="Consolas"/>
+        </w:rPr>
+        <w:t>            &lt;/div&gt;</w:t>
+      </w:r>
+    </w:p>
+    <w:p>
+      <w:pPr>
+        <w:pBdr>
+          <w:top w:val="single" w:sz="4" w:space="1" w:color="auto"/>
+          <w:left w:val="single" w:sz="4" w:space="1" w:color="auto"/>
+          <w:bottom w:val="single" w:sz="4" w:space="1" w:color="auto"/>
+          <w:right w:val="single" w:sz="4" w:space="1" w:color="auto"/>
+        </w:pBdr>
+        <w:rPr>
+          <w:rFonts w:ascii="Consolas" w:hAnsi="Consolas"/>
+        </w:rPr>
+      </w:pPr>
+      <w:r>
+        <w:rPr>
+          <w:rFonts w:ascii="Consolas" w:hAnsi="Consolas"/>
+        </w:rPr>
+        <w:t>        &lt;/header&gt;</w:t>
+      </w:r>
+    </w:p>
+    <w:p>
+      <w:pPr>
+        <w:pBdr>
+          <w:top w:val="single" w:sz="4" w:space="1" w:color="auto"/>
+          <w:left w:val="single" w:sz="4" w:space="1" w:color="auto"/>
+          <w:bottom w:val="single" w:sz="4" w:space="1" w:color="auto"/>
+          <w:right w:val="single" w:sz="4" w:space="1" w:color="auto"/>
+        </w:pBdr>
+        <w:rPr>
+          <w:rFonts w:ascii="Consolas" w:hAnsi="Consolas"/>
+        </w:rPr>
+      </w:pPr>
+    </w:p>
+    <w:p>
+      <w:pPr>
+        <w:pBdr>
+          <w:top w:val="single" w:sz="4" w:space="1" w:color="auto"/>
+          <w:left w:val="single" w:sz="4" w:space="1" w:color="auto"/>
+          <w:bottom w:val="single" w:sz="4" w:space="1" w:color="auto"/>
+          <w:right w:val="single" w:sz="4" w:space="1" w:color="auto"/>
+        </w:pBdr>
+        <w:rPr>
+          <w:rFonts w:ascii="Consolas" w:hAnsi="Consolas"/>
+        </w:rPr>
+      </w:pPr>
+      <w:r>
+        <w:rPr>
+          <w:rFonts w:ascii="Consolas" w:hAnsi="Consolas"/>
+        </w:rPr>
+        <w:t>        &lt;section class="side-main"&gt;</w:t>
+      </w:r>
+    </w:p>
+    <w:p>
+      <w:pPr>
+        <w:pBdr>
+          <w:top w:val="single" w:sz="4" w:space="1" w:color="auto"/>
+          <w:left w:val="single" w:sz="4" w:space="1" w:color="auto"/>
+          <w:bottom w:val="single" w:sz="4" w:space="1" w:color="auto"/>
+          <w:right w:val="single" w:sz="4" w:space="1" w:color="auto"/>
+        </w:pBdr>
+        <w:rPr>
+          <w:rFonts w:ascii="Consolas" w:hAnsi="Consolas"/>
+        </w:rPr>
+      </w:pPr>
+      <w:r>
+        <w:rPr>
+          <w:rFonts w:ascii="Consolas" w:hAnsi="Consolas"/>
+        </w:rPr>
+        <w:t>            &lt;main&gt;</w:t>
+      </w:r>
+    </w:p>
+    <w:p>
+      <w:pPr>
+        <w:pBdr>
+          <w:top w:val="single" w:sz="4" w:space="1" w:color="auto"/>
+          <w:left w:val="single" w:sz="4" w:space="1" w:color="auto"/>
+          <w:bottom w:val="single" w:sz="4" w:space="1" w:color="auto"/>
+          <w:right w:val="single" w:sz="4" w:space="1" w:color="auto"/>
+        </w:pBdr>
+        <w:rPr>
+          <w:rFonts w:ascii="Consolas" w:hAnsi="Consolas"/>
+        </w:rPr>
+      </w:pPr>
+      <w:r>
+        <w:rPr>
+          <w:rFonts w:ascii="Consolas" w:hAnsi="Consolas"/>
+        </w:rPr>
+        <w:t>                &lt;h2&gt;This season's guest speakers&lt;/h2&gt;</w:t>
+      </w:r>
+    </w:p>
+    <w:p>
+      <w:pPr>
+        <w:pBdr>
+          <w:top w:val="single" w:sz="4" w:space="1" w:color="auto"/>
+          <w:left w:val="single" w:sz="4" w:space="1" w:color="auto"/>
+          <w:bottom w:val="single" w:sz="4" w:space="1" w:color="auto"/>
+          <w:right w:val="single" w:sz="4" w:space="1" w:color="auto"/>
+        </w:pBdr>
+        <w:rPr>
+          <w:rFonts w:ascii="Consolas" w:hAnsi="Consolas"/>
+        </w:rPr>
+      </w:pPr>
+      <w:r>
+        <w:rPr>
+          <w:rFonts w:ascii="Consolas" w:hAnsi="Consolas"/>
+        </w:rPr>
+        <w:t>                &lt;ul&gt;</w:t>
+      </w:r>
+    </w:p>
+    <w:p>
+      <w:pPr>
+        <w:pBdr>
+          <w:top w:val="single" w:sz="4" w:space="1" w:color="auto"/>
+          <w:left w:val="single" w:sz="4" w:space="1" w:color="auto"/>
+          <w:bottom w:val="single" w:sz="4" w:space="1" w:color="auto"/>
+          <w:right w:val="single" w:sz="4" w:space="1" w:color="auto"/>
+        </w:pBdr>
+        <w:rPr>
+          <w:rFonts w:ascii="Consolas" w:hAnsi="Consolas"/>
+        </w:rPr>
+      </w:pPr>
+      <w:r>
+        <w:rPr>
+          <w:rFonts w:ascii="Consolas" w:hAnsi="Consolas"/>
+        </w:rPr>
+        <w:t>                    &lt;li&gt;</w:t>
+      </w:r>
+    </w:p>
+    <w:p>
+      <w:pPr>
+        <w:pBdr>
+          <w:top w:val="single" w:sz="4" w:space="1" w:color="auto"/>
+          <w:left w:val="single" w:sz="4" w:space="1" w:color="auto"/>
+          <w:bottom w:val="single" w:sz="4" w:space="1" w:color="auto"/>
+          <w:right w:val="single" w:sz="4" w:space="1" w:color="auto"/>
+        </w:pBdr>
+        <w:rPr>
+          <w:rFonts w:ascii="Consolas" w:hAnsi="Consolas"/>
+        </w:rPr>
+      </w:pPr>
+      <w:r>
+        <w:rPr>
+          <w:rFonts w:ascii="Consolas" w:hAnsi="Consolas"/>
+        </w:rPr>
+        <w:t>                        October:</w:t>
+      </w:r>
+    </w:p>
+    <w:p>
+      <w:pPr>
+        <w:pBdr>
+          <w:top w:val="single" w:sz="4" w:space="1" w:color="auto"/>
+          <w:left w:val="single" w:sz="4" w:space="1" w:color="auto"/>
+          <w:bottom w:val="single" w:sz="4" w:space="1" w:color="auto"/>
+          <w:right w:val="single" w:sz="4" w:space="1" w:color="auto"/>
+        </w:pBdr>
+        <w:rPr>
+          <w:rFonts w:ascii="Consolas" w:hAnsi="Consolas"/>
+        </w:rPr>
+      </w:pPr>
+      <w:r>
+        <w:rPr>
+          <w:rFonts w:ascii="Consolas" w:hAnsi="Consolas"/>
+        </w:rPr>
+        <w:t>                        &lt;strong&gt;</w:t>
+      </w:r>
+    </w:p>
+    <w:p>
+      <w:pPr>
+        <w:pBdr>
+          <w:top w:val="single" w:sz="4" w:space="1" w:color="auto"/>
+          <w:left w:val="single" w:sz="4" w:space="1" w:color="auto"/>
+          <w:bottom w:val="single" w:sz="4" w:space="1" w:color="auto"/>
+          <w:right w:val="single" w:sz="4" w:space="1" w:color="auto"/>
+        </w:pBdr>
+        <w:rPr>
+          <w:rFonts w:ascii="Consolas" w:hAnsi="Consolas"/>
+        </w:rPr>
+      </w:pPr>
+      <w:r>
+        <w:rPr>
+          <w:rFonts w:ascii="Consolas" w:hAnsi="Consolas"/>
+        </w:rPr>
+        <w:t xml:space="preserve">                            &lt;a </w:t>
+      </w:r>
+      <w:proofErr w:type="spellStart"/>
+      <w:r>
+        <w:rPr>
+          <w:rFonts w:ascii="Consolas" w:hAnsi="Consolas"/>
+        </w:rPr>
+        <w:t>href</w:t>
+      </w:r>
+      <w:proofErr w:type="spellEnd"/>
+      <w:r>
+        <w:rPr>
+          <w:rFonts w:ascii="Consolas" w:hAnsi="Consolas"/>
+        </w:rPr>
+        <w:t>="https://en.wikipedia.org/wiki/</w:t>
+      </w:r>
+      <w:proofErr w:type="spellStart"/>
+      <w:r>
+        <w:rPr>
+          <w:rFonts w:ascii="Consolas" w:hAnsi="Consolas"/>
+        </w:rPr>
+        <w:t>David_Brancaccio</w:t>
+      </w:r>
+      <w:proofErr w:type="spellEnd"/>
+      <w:r>
+        <w:rPr>
+          <w:rFonts w:ascii="Consolas" w:hAnsi="Consolas"/>
+        </w:rPr>
+        <w:t>" class="link-gray"&gt;David Brancaccio&lt;/a&gt;</w:t>
+      </w:r>
+    </w:p>
+    <w:p>
+      <w:pPr>
+        <w:pBdr>
+          <w:top w:val="single" w:sz="4" w:space="1" w:color="auto"/>
+          <w:left w:val="single" w:sz="4" w:space="1" w:color="auto"/>
+          <w:bottom w:val="single" w:sz="4" w:space="1" w:color="auto"/>
+          <w:right w:val="single" w:sz="4" w:space="1" w:color="auto"/>
+        </w:pBdr>
+        <w:rPr>
+          <w:rFonts w:ascii="Consolas" w:hAnsi="Consolas"/>
+        </w:rPr>
+      </w:pPr>
+      <w:r>
+        <w:rPr>
+          <w:rFonts w:ascii="Consolas" w:hAnsi="Consolas"/>
+        </w:rPr>
+        <w:t>                        &lt;/strong&gt;</w:t>
+      </w:r>
+    </w:p>
+    <w:p>
+      <w:pPr>
+        <w:pBdr>
+          <w:top w:val="single" w:sz="4" w:space="1" w:color="auto"/>
+          <w:left w:val="single" w:sz="4" w:space="1" w:color="auto"/>
+          <w:bottom w:val="single" w:sz="4" w:space="1" w:color="auto"/>
+          <w:right w:val="single" w:sz="4" w:space="1" w:color="auto"/>
+        </w:pBdr>
+        <w:rPr>
+          <w:rFonts w:ascii="Consolas" w:hAnsi="Consolas"/>
+        </w:rPr>
+      </w:pPr>
+      <w:r>
+        <w:rPr>
+          <w:rFonts w:ascii="Consolas" w:hAnsi="Consolas"/>
+        </w:rPr>
+        <w:t>                    &lt;/li&gt;</w:t>
+      </w:r>
+    </w:p>
+    <w:p>
+      <w:pPr>
+        <w:pBdr>
+          <w:top w:val="single" w:sz="4" w:space="1" w:color="auto"/>
+          <w:left w:val="single" w:sz="4" w:space="1" w:color="auto"/>
+          <w:bottom w:val="single" w:sz="4" w:space="1" w:color="auto"/>
+          <w:right w:val="single" w:sz="4" w:space="1" w:color="auto"/>
+        </w:pBdr>
+        <w:rPr>
+          <w:rFonts w:ascii="Consolas" w:hAnsi="Consolas"/>
+        </w:rPr>
+      </w:pPr>
+      <w:r>
+        <w:rPr>
+          <w:rFonts w:ascii="Consolas" w:hAnsi="Consolas"/>
+        </w:rPr>
+        <w:t>                    &lt;li&gt;</w:t>
+      </w:r>
+    </w:p>
+    <w:p>
+      <w:pPr>
+        <w:pBdr>
+          <w:top w:val="single" w:sz="4" w:space="1" w:color="auto"/>
+          <w:left w:val="single" w:sz="4" w:space="1" w:color="auto"/>
+          <w:bottom w:val="single" w:sz="4" w:space="1" w:color="auto"/>
+          <w:right w:val="single" w:sz="4" w:space="1" w:color="auto"/>
+        </w:pBdr>
+        <w:rPr>
+          <w:rFonts w:ascii="Consolas" w:hAnsi="Consolas"/>
+        </w:rPr>
+      </w:pPr>
+      <w:r>
+        <w:rPr>
+          <w:rFonts w:ascii="Consolas" w:hAnsi="Consolas"/>
+        </w:rPr>
+        <w:t>                        November:</w:t>
+      </w:r>
+    </w:p>
+    <w:p>
+      <w:pPr>
+        <w:pBdr>
+          <w:top w:val="single" w:sz="4" w:space="1" w:color="auto"/>
+          <w:left w:val="single" w:sz="4" w:space="1" w:color="auto"/>
+          <w:bottom w:val="single" w:sz="4" w:space="1" w:color="auto"/>
+          <w:right w:val="single" w:sz="4" w:space="1" w:color="auto"/>
+        </w:pBdr>
+        <w:rPr>
+          <w:rFonts w:ascii="Consolas" w:hAnsi="Consolas"/>
+        </w:rPr>
+      </w:pPr>
+      <w:r>
+        <w:rPr>
+          <w:rFonts w:ascii="Consolas" w:hAnsi="Consolas"/>
+        </w:rPr>
+        <w:t>                        &lt;strong&gt;</w:t>
+      </w:r>
+    </w:p>
+    <w:p>
+      <w:pPr>
+        <w:pBdr>
+          <w:top w:val="single" w:sz="4" w:space="1" w:color="auto"/>
+          <w:left w:val="single" w:sz="4" w:space="1" w:color="auto"/>
+          <w:bottom w:val="single" w:sz="4" w:space="1" w:color="auto"/>
+          <w:right w:val="single" w:sz="4" w:space="1" w:color="auto"/>
+        </w:pBdr>
+        <w:rPr>
+          <w:rFonts w:ascii="Consolas" w:hAnsi="Consolas"/>
+        </w:rPr>
+      </w:pPr>
+      <w:r>
+        <w:rPr>
+          <w:rFonts w:ascii="Consolas" w:hAnsi="Consolas"/>
+        </w:rPr>
+        <w:lastRenderedPageBreak/>
+        <w:t xml:space="preserve">                            &lt;a </w:t>
+      </w:r>
+      <w:proofErr w:type="spellStart"/>
+      <w:r>
+        <w:rPr>
+          <w:rFonts w:ascii="Consolas" w:hAnsi="Consolas"/>
+        </w:rPr>
+        <w:t>href</w:t>
+      </w:r>
+      <w:proofErr w:type="spellEnd"/>
+      <w:r>
+        <w:rPr>
+          <w:rFonts w:ascii="Consolas" w:hAnsi="Consolas"/>
+        </w:rPr>
+        <w:t>="https://en.wikipedia.org/wiki/</w:t>
+      </w:r>
+      <w:proofErr w:type="spellStart"/>
+      <w:r>
+        <w:rPr>
+          <w:rFonts w:ascii="Consolas" w:hAnsi="Consolas"/>
+        </w:rPr>
+        <w:t>Andrew_Ross_Sorkin</w:t>
+      </w:r>
+      <w:proofErr w:type="spellEnd"/>
+      <w:r>
+        <w:rPr>
+          <w:rFonts w:ascii="Consolas" w:hAnsi="Consolas"/>
+        </w:rPr>
+        <w:t>" class="link-gray"&gt;Andrew Ross Sorkin&lt;/a&gt;</w:t>
+      </w:r>
+    </w:p>
+    <w:p>
+      <w:pPr>
+        <w:pBdr>
+          <w:top w:val="single" w:sz="4" w:space="1" w:color="auto"/>
+          <w:left w:val="single" w:sz="4" w:space="1" w:color="auto"/>
+          <w:bottom w:val="single" w:sz="4" w:space="1" w:color="auto"/>
+          <w:right w:val="single" w:sz="4" w:space="1" w:color="auto"/>
+        </w:pBdr>
+        <w:rPr>
+          <w:rFonts w:ascii="Consolas" w:hAnsi="Consolas"/>
+        </w:rPr>
+      </w:pPr>
+      <w:r>
+        <w:rPr>
+          <w:rFonts w:ascii="Consolas" w:hAnsi="Consolas"/>
+        </w:rPr>
+        <w:t>                        &lt;/strong&gt;</w:t>
+      </w:r>
+    </w:p>
+    <w:p>
+      <w:pPr>
+        <w:pBdr>
+          <w:top w:val="single" w:sz="4" w:space="1" w:color="auto"/>
+          <w:left w:val="single" w:sz="4" w:space="1" w:color="auto"/>
+          <w:bottom w:val="single" w:sz="4" w:space="1" w:color="auto"/>
+          <w:right w:val="single" w:sz="4" w:space="1" w:color="auto"/>
+        </w:pBdr>
+        <w:rPr>
+          <w:rFonts w:ascii="Consolas" w:hAnsi="Consolas"/>
+        </w:rPr>
+      </w:pPr>
+      <w:r>
+        <w:rPr>
+          <w:rFonts w:ascii="Consolas" w:hAnsi="Consolas"/>
+        </w:rPr>
+        <w:t>                    &lt;/li&gt;</w:t>
+      </w:r>
+    </w:p>
+    <w:p>
+      <w:pPr>
+        <w:pBdr>
+          <w:top w:val="single" w:sz="4" w:space="1" w:color="auto"/>
+          <w:left w:val="single" w:sz="4" w:space="1" w:color="auto"/>
+          <w:bottom w:val="single" w:sz="4" w:space="1" w:color="auto"/>
+          <w:right w:val="single" w:sz="4" w:space="1" w:color="auto"/>
+        </w:pBdr>
+        <w:rPr>
+          <w:rFonts w:ascii="Consolas" w:hAnsi="Consolas"/>
+        </w:rPr>
+      </w:pPr>
+      <w:r>
+        <w:rPr>
+          <w:rFonts w:ascii="Consolas" w:hAnsi="Consolas"/>
+        </w:rPr>
+        <w:t>                    &lt;li&gt;</w:t>
+      </w:r>
+    </w:p>
+    <w:p>
+      <w:pPr>
+        <w:pBdr>
+          <w:top w:val="single" w:sz="4" w:space="1" w:color="auto"/>
+          <w:left w:val="single" w:sz="4" w:space="1" w:color="auto"/>
+          <w:bottom w:val="single" w:sz="4" w:space="1" w:color="auto"/>
+          <w:right w:val="single" w:sz="4" w:space="1" w:color="auto"/>
+        </w:pBdr>
+        <w:rPr>
+          <w:rFonts w:ascii="Consolas" w:hAnsi="Consolas"/>
+        </w:rPr>
+      </w:pPr>
+      <w:r>
+        <w:rPr>
+          <w:rFonts w:ascii="Consolas" w:hAnsi="Consolas"/>
+        </w:rPr>
+        <w:t>                        January:</w:t>
+      </w:r>
+    </w:p>
+    <w:p>
+      <w:pPr>
+        <w:pBdr>
+          <w:top w:val="single" w:sz="4" w:space="1" w:color="auto"/>
+          <w:left w:val="single" w:sz="4" w:space="1" w:color="auto"/>
+          <w:bottom w:val="single" w:sz="4" w:space="1" w:color="auto"/>
+          <w:right w:val="single" w:sz="4" w:space="1" w:color="auto"/>
+        </w:pBdr>
+        <w:rPr>
+          <w:rFonts w:ascii="Consolas" w:hAnsi="Consolas"/>
+        </w:rPr>
+      </w:pPr>
+      <w:r>
+        <w:rPr>
+          <w:rFonts w:ascii="Consolas" w:hAnsi="Consolas"/>
+        </w:rPr>
+        <w:t>                        &lt;strong&gt;</w:t>
+      </w:r>
+    </w:p>
+    <w:p>
+      <w:pPr>
+        <w:pBdr>
+          <w:top w:val="single" w:sz="4" w:space="1" w:color="auto"/>
+          <w:left w:val="single" w:sz="4" w:space="1" w:color="auto"/>
+          <w:bottom w:val="single" w:sz="4" w:space="1" w:color="auto"/>
+          <w:right w:val="single" w:sz="4" w:space="1" w:color="auto"/>
+        </w:pBdr>
+        <w:rPr>
+          <w:rFonts w:ascii="Consolas" w:hAnsi="Consolas"/>
+        </w:rPr>
+      </w:pPr>
+      <w:r>
+        <w:rPr>
+          <w:rFonts w:ascii="Consolas" w:hAnsi="Consolas"/>
+        </w:rPr>
+        <w:t xml:space="preserve">                            &lt;a </w:t>
+      </w:r>
+      <w:proofErr w:type="spellStart"/>
+      <w:r>
+        <w:rPr>
+          <w:rFonts w:ascii="Consolas" w:hAnsi="Consolas"/>
+        </w:rPr>
+        <w:t>href</w:t>
+      </w:r>
+      <w:proofErr w:type="spellEnd"/>
+      <w:r>
+        <w:rPr>
+          <w:rFonts w:ascii="Consolas" w:hAnsi="Consolas"/>
+        </w:rPr>
+        <w:t>="https://en.wikipedia.org/wiki/</w:t>
+      </w:r>
+      <w:proofErr w:type="spellStart"/>
+      <w:r>
+        <w:rPr>
+          <w:rFonts w:ascii="Consolas" w:hAnsi="Consolas"/>
+        </w:rPr>
+        <w:t>Amy_Chua</w:t>
+      </w:r>
+      <w:proofErr w:type="spellEnd"/>
+      <w:r>
+        <w:rPr>
+          <w:rFonts w:ascii="Consolas" w:hAnsi="Consolas"/>
+        </w:rPr>
+        <w:t>" class="link-maroon"&gt;Amy Chua&lt;/a&gt;</w:t>
+      </w:r>
+    </w:p>
+    <w:p>
+      <w:pPr>
+        <w:pBdr>
+          <w:top w:val="single" w:sz="4" w:space="1" w:color="auto"/>
+          <w:left w:val="single" w:sz="4" w:space="1" w:color="auto"/>
+          <w:bottom w:val="single" w:sz="4" w:space="1" w:color="auto"/>
+          <w:right w:val="single" w:sz="4" w:space="1" w:color="auto"/>
+        </w:pBdr>
+        <w:rPr>
+          <w:rFonts w:ascii="Consolas" w:hAnsi="Consolas"/>
+        </w:rPr>
+      </w:pPr>
+      <w:r>
+        <w:rPr>
+          <w:rFonts w:ascii="Consolas" w:hAnsi="Consolas"/>
+        </w:rPr>
+        <w:t>                        &lt;/strong&gt;</w:t>
+      </w:r>
+    </w:p>
+    <w:p>
+      <w:pPr>
+        <w:pBdr>
+          <w:top w:val="single" w:sz="4" w:space="1" w:color="auto"/>
+          <w:left w:val="single" w:sz="4" w:space="1" w:color="auto"/>
+          <w:bottom w:val="single" w:sz="4" w:space="1" w:color="auto"/>
+          <w:right w:val="single" w:sz="4" w:space="1" w:color="auto"/>
+        </w:pBdr>
+        <w:rPr>
+          <w:rFonts w:ascii="Consolas" w:hAnsi="Consolas"/>
+        </w:rPr>
+      </w:pPr>
+      <w:r>
+        <w:rPr>
+          <w:rFonts w:ascii="Consolas" w:hAnsi="Consolas"/>
+        </w:rPr>
+        <w:t>                    &lt;/li&gt;</w:t>
+      </w:r>
+    </w:p>
+    <w:p>
+      <w:pPr>
+        <w:pBdr>
+          <w:top w:val="single" w:sz="4" w:space="1" w:color="auto"/>
+          <w:left w:val="single" w:sz="4" w:space="1" w:color="auto"/>
+          <w:bottom w:val="single" w:sz="4" w:space="1" w:color="auto"/>
+          <w:right w:val="single" w:sz="4" w:space="1" w:color="auto"/>
+        </w:pBdr>
+        <w:rPr>
+          <w:rFonts w:ascii="Consolas" w:hAnsi="Consolas"/>
+        </w:rPr>
+      </w:pPr>
+      <w:r>
+        <w:rPr>
+          <w:rFonts w:ascii="Consolas" w:hAnsi="Consolas"/>
+        </w:rPr>
+        <w:t>                    &lt;li&gt;</w:t>
+      </w:r>
+    </w:p>
+    <w:p>
+      <w:pPr>
+        <w:pBdr>
+          <w:top w:val="single" w:sz="4" w:space="1" w:color="auto"/>
+          <w:left w:val="single" w:sz="4" w:space="1" w:color="auto"/>
+          <w:bottom w:val="single" w:sz="4" w:space="1" w:color="auto"/>
+          <w:right w:val="single" w:sz="4" w:space="1" w:color="auto"/>
+        </w:pBdr>
+        <w:rPr>
+          <w:rFonts w:ascii="Consolas" w:hAnsi="Consolas"/>
+        </w:rPr>
+      </w:pPr>
+      <w:r>
+        <w:rPr>
+          <w:rFonts w:ascii="Consolas" w:hAnsi="Consolas"/>
+        </w:rPr>
+        <w:t>                        February:</w:t>
+      </w:r>
+    </w:p>
+    <w:p>
+      <w:pPr>
+        <w:pBdr>
+          <w:top w:val="single" w:sz="4" w:space="1" w:color="auto"/>
+          <w:left w:val="single" w:sz="4" w:space="1" w:color="auto"/>
+          <w:bottom w:val="single" w:sz="4" w:space="1" w:color="auto"/>
+          <w:right w:val="single" w:sz="4" w:space="1" w:color="auto"/>
+        </w:pBdr>
+        <w:rPr>
+          <w:rFonts w:ascii="Consolas" w:hAnsi="Consolas"/>
+        </w:rPr>
+      </w:pPr>
+      <w:r>
+        <w:rPr>
+          <w:rFonts w:ascii="Consolas" w:hAnsi="Consolas"/>
+        </w:rPr>
+        <w:t>                        &lt;strong&gt;</w:t>
+      </w:r>
+    </w:p>
+    <w:p>
+      <w:pPr>
+        <w:pBdr>
+          <w:top w:val="single" w:sz="4" w:space="1" w:color="auto"/>
+          <w:left w:val="single" w:sz="4" w:space="1" w:color="auto"/>
+          <w:bottom w:val="single" w:sz="4" w:space="1" w:color="auto"/>
+          <w:right w:val="single" w:sz="4" w:space="1" w:color="auto"/>
+        </w:pBdr>
+        <w:rPr>
+          <w:rFonts w:ascii="Consolas" w:hAnsi="Consolas"/>
+        </w:rPr>
+      </w:pPr>
+      <w:r>
+        <w:rPr>
+          <w:rFonts w:ascii="Consolas" w:hAnsi="Consolas"/>
+        </w:rPr>
+        <w:t xml:space="preserve">                            &lt;a </w:t>
+      </w:r>
+      <w:proofErr w:type="spellStart"/>
+      <w:r>
+        <w:rPr>
+          <w:rFonts w:ascii="Consolas" w:hAnsi="Consolas"/>
+        </w:rPr>
+        <w:t>href</w:t>
+      </w:r>
+      <w:proofErr w:type="spellEnd"/>
+      <w:r>
+        <w:rPr>
+          <w:rFonts w:ascii="Consolas" w:hAnsi="Consolas"/>
+        </w:rPr>
+        <w:t>="https://en.wikipedia.org/wiki/</w:t>
+      </w:r>
+      <w:proofErr w:type="spellStart"/>
+      <w:r>
+        <w:rPr>
+          <w:rFonts w:ascii="Consolas" w:hAnsi="Consolas"/>
+        </w:rPr>
+        <w:t>Scott_D._Sampson</w:t>
+      </w:r>
+      <w:proofErr w:type="spellEnd"/>
+      <w:r>
+        <w:rPr>
+          <w:rFonts w:ascii="Consolas" w:hAnsi="Consolas"/>
+        </w:rPr>
+        <w:t>" class="link-yellow"&gt;Scott Sampson&lt;/a&gt;</w:t>
+      </w:r>
+    </w:p>
+    <w:p>
+      <w:pPr>
+        <w:pBdr>
+          <w:top w:val="single" w:sz="4" w:space="1" w:color="auto"/>
+          <w:left w:val="single" w:sz="4" w:space="1" w:color="auto"/>
+          <w:bottom w:val="single" w:sz="4" w:space="1" w:color="auto"/>
+          <w:right w:val="single" w:sz="4" w:space="1" w:color="auto"/>
+        </w:pBdr>
+        <w:rPr>
+          <w:rFonts w:ascii="Consolas" w:hAnsi="Consolas"/>
+        </w:rPr>
+      </w:pPr>
+      <w:r>
+        <w:rPr>
+          <w:rFonts w:ascii="Consolas" w:hAnsi="Consolas"/>
+        </w:rPr>
+        <w:t>                        &lt;/strong&gt;</w:t>
+      </w:r>
+    </w:p>
+    <w:p>
+      <w:pPr>
+        <w:pBdr>
+          <w:top w:val="single" w:sz="4" w:space="1" w:color="auto"/>
+          <w:left w:val="single" w:sz="4" w:space="1" w:color="auto"/>
+          <w:bottom w:val="single" w:sz="4" w:space="1" w:color="auto"/>
+          <w:right w:val="single" w:sz="4" w:space="1" w:color="auto"/>
+        </w:pBdr>
+        <w:rPr>
+          <w:rFonts w:ascii="Consolas" w:hAnsi="Consolas"/>
+        </w:rPr>
+      </w:pPr>
+      <w:r>
+        <w:rPr>
+          <w:rFonts w:ascii="Consolas" w:hAnsi="Consolas"/>
+        </w:rPr>
+        <w:t>                    &lt;/li&gt;</w:t>
+      </w:r>
+    </w:p>
+    <w:p>
+      <w:pPr>
+        <w:pBdr>
+          <w:top w:val="single" w:sz="4" w:space="1" w:color="auto"/>
+          <w:left w:val="single" w:sz="4" w:space="1" w:color="auto"/>
+          <w:bottom w:val="single" w:sz="4" w:space="1" w:color="auto"/>
+          <w:right w:val="single" w:sz="4" w:space="1" w:color="auto"/>
+        </w:pBdr>
+        <w:rPr>
+          <w:rFonts w:ascii="Consolas" w:hAnsi="Consolas"/>
+        </w:rPr>
+      </w:pPr>
+      <w:r>
+        <w:rPr>
+          <w:rFonts w:ascii="Consolas" w:hAnsi="Consolas"/>
+        </w:rPr>
+        <w:t>                    &lt;li&gt;</w:t>
+      </w:r>
+    </w:p>
+    <w:p>
+      <w:pPr>
+        <w:pBdr>
+          <w:top w:val="single" w:sz="4" w:space="1" w:color="auto"/>
+          <w:left w:val="single" w:sz="4" w:space="1" w:color="auto"/>
+          <w:bottom w:val="single" w:sz="4" w:space="1" w:color="auto"/>
+          <w:right w:val="single" w:sz="4" w:space="1" w:color="auto"/>
+        </w:pBdr>
+        <w:rPr>
+          <w:rFonts w:ascii="Consolas" w:hAnsi="Consolas"/>
+        </w:rPr>
+      </w:pPr>
+      <w:r>
+        <w:rPr>
+          <w:rFonts w:ascii="Consolas" w:hAnsi="Consolas"/>
+        </w:rPr>
+        <w:t>                        March:</w:t>
+      </w:r>
+    </w:p>
+    <w:p>
+      <w:pPr>
+        <w:pBdr>
+          <w:top w:val="single" w:sz="4" w:space="1" w:color="auto"/>
+          <w:left w:val="single" w:sz="4" w:space="1" w:color="auto"/>
+          <w:bottom w:val="single" w:sz="4" w:space="1" w:color="auto"/>
+          <w:right w:val="single" w:sz="4" w:space="1" w:color="auto"/>
+        </w:pBdr>
+        <w:rPr>
+          <w:rFonts w:ascii="Consolas" w:hAnsi="Consolas"/>
+        </w:rPr>
+      </w:pPr>
+      <w:r>
+        <w:rPr>
+          <w:rFonts w:ascii="Consolas" w:hAnsi="Consolas"/>
+        </w:rPr>
+        <w:t>                        &lt;strong&gt;</w:t>
+      </w:r>
+    </w:p>
+    <w:p>
+      <w:pPr>
+        <w:pBdr>
+          <w:top w:val="single" w:sz="4" w:space="1" w:color="auto"/>
+          <w:left w:val="single" w:sz="4" w:space="1" w:color="auto"/>
+          <w:bottom w:val="single" w:sz="4" w:space="1" w:color="auto"/>
+          <w:right w:val="single" w:sz="4" w:space="1" w:color="auto"/>
+        </w:pBdr>
+        <w:rPr>
+          <w:rFonts w:ascii="Consolas" w:hAnsi="Consolas"/>
+        </w:rPr>
+      </w:pPr>
+      <w:r>
+        <w:rPr>
+          <w:rFonts w:ascii="Consolas" w:hAnsi="Consolas"/>
+        </w:rPr>
+        <w:t xml:space="preserve">                            &lt;a </w:t>
+      </w:r>
+      <w:proofErr w:type="spellStart"/>
+      <w:r>
+        <w:rPr>
+          <w:rFonts w:ascii="Consolas" w:hAnsi="Consolas"/>
+        </w:rPr>
+        <w:t>href</w:t>
+      </w:r>
+      <w:proofErr w:type="spellEnd"/>
+      <w:r>
+        <w:rPr>
+          <w:rFonts w:ascii="Consolas" w:hAnsi="Consolas"/>
+        </w:rPr>
+        <w:t>="https://en.wikipedia.org/wiki/</w:t>
+      </w:r>
+      <w:proofErr w:type="spellStart"/>
+      <w:r>
+        <w:rPr>
+          <w:rFonts w:ascii="Consolas" w:hAnsi="Consolas"/>
+        </w:rPr>
+        <w:t>Carlos_Eire</w:t>
+      </w:r>
+      <w:proofErr w:type="spellEnd"/>
+      <w:r>
+        <w:rPr>
+          <w:rFonts w:ascii="Consolas" w:hAnsi="Consolas"/>
+        </w:rPr>
+        <w:t>" class="link-maroon"&gt;Carlos Eire&lt;/a&gt;</w:t>
+      </w:r>
+    </w:p>
+    <w:p>
+      <w:pPr>
+        <w:pBdr>
+          <w:top w:val="single" w:sz="4" w:space="1" w:color="auto"/>
+          <w:left w:val="single" w:sz="4" w:space="1" w:color="auto"/>
+          <w:bottom w:val="single" w:sz="4" w:space="1" w:color="auto"/>
+          <w:right w:val="single" w:sz="4" w:space="1" w:color="auto"/>
+        </w:pBdr>
+        <w:rPr>
+          <w:rFonts w:ascii="Consolas" w:hAnsi="Consolas"/>
+        </w:rPr>
+      </w:pPr>
+      <w:r>
+        <w:rPr>
+          <w:rFonts w:ascii="Consolas" w:hAnsi="Consolas"/>
+        </w:rPr>
+        <w:t>                        &lt;/strong&gt;</w:t>
+      </w:r>
+    </w:p>
+    <w:p>
+      <w:pPr>
+        <w:pBdr>
+          <w:top w:val="single" w:sz="4" w:space="1" w:color="auto"/>
+          <w:left w:val="single" w:sz="4" w:space="1" w:color="auto"/>
+          <w:bottom w:val="single" w:sz="4" w:space="1" w:color="auto"/>
+          <w:right w:val="single" w:sz="4" w:space="1" w:color="auto"/>
+        </w:pBdr>
+        <w:rPr>
+          <w:rFonts w:ascii="Consolas" w:hAnsi="Consolas"/>
+        </w:rPr>
+      </w:pPr>
+      <w:r>
+        <w:rPr>
+          <w:rFonts w:ascii="Consolas" w:hAnsi="Consolas"/>
+        </w:rPr>
+        <w:t>                    &lt;/li&gt;</w:t>
+      </w:r>
+    </w:p>
+    <w:p>
+      <w:pPr>
+        <w:pBdr>
+          <w:top w:val="single" w:sz="4" w:space="1" w:color="auto"/>
+          <w:left w:val="single" w:sz="4" w:space="1" w:color="auto"/>
+          <w:bottom w:val="single" w:sz="4" w:space="1" w:color="auto"/>
+          <w:right w:val="single" w:sz="4" w:space="1" w:color="auto"/>
+        </w:pBdr>
+        <w:rPr>
+          <w:rFonts w:ascii="Consolas" w:hAnsi="Consolas"/>
+        </w:rPr>
+      </w:pPr>
+      <w:r>
+        <w:rPr>
+          <w:rFonts w:ascii="Consolas" w:hAnsi="Consolas"/>
+        </w:rPr>
+        <w:lastRenderedPageBreak/>
+        <w:t>                    &lt;li&gt;</w:t>
+      </w:r>
+    </w:p>
+    <w:p>
+      <w:pPr>
+        <w:pBdr>
+          <w:top w:val="single" w:sz="4" w:space="1" w:color="auto"/>
+          <w:left w:val="single" w:sz="4" w:space="1" w:color="auto"/>
+          <w:bottom w:val="single" w:sz="4" w:space="1" w:color="auto"/>
+          <w:right w:val="single" w:sz="4" w:space="1" w:color="auto"/>
+        </w:pBdr>
+        <w:rPr>
+          <w:rFonts w:ascii="Consolas" w:hAnsi="Consolas"/>
+        </w:rPr>
+      </w:pPr>
+      <w:r>
+        <w:rPr>
+          <w:rFonts w:ascii="Consolas" w:hAnsi="Consolas"/>
+        </w:rPr>
+        <w:t>                        April:</w:t>
+      </w:r>
+    </w:p>
+    <w:p>
+      <w:pPr>
+        <w:pBdr>
+          <w:top w:val="single" w:sz="4" w:space="1" w:color="auto"/>
+          <w:left w:val="single" w:sz="4" w:space="1" w:color="auto"/>
+          <w:bottom w:val="single" w:sz="4" w:space="1" w:color="auto"/>
+          <w:right w:val="single" w:sz="4" w:space="1" w:color="auto"/>
+        </w:pBdr>
+        <w:rPr>
+          <w:rFonts w:ascii="Consolas" w:hAnsi="Consolas"/>
+        </w:rPr>
+      </w:pPr>
+      <w:r>
+        <w:rPr>
+          <w:rFonts w:ascii="Consolas" w:hAnsi="Consolas"/>
+        </w:rPr>
+        <w:t>                        &lt;strong&gt;</w:t>
+      </w:r>
+    </w:p>
+    <w:p>
+      <w:pPr>
+        <w:pBdr>
+          <w:top w:val="single" w:sz="4" w:space="1" w:color="auto"/>
+          <w:left w:val="single" w:sz="4" w:space="1" w:color="auto"/>
+          <w:bottom w:val="single" w:sz="4" w:space="1" w:color="auto"/>
+          <w:right w:val="single" w:sz="4" w:space="1" w:color="auto"/>
+        </w:pBdr>
+        <w:rPr>
+          <w:rFonts w:ascii="Consolas" w:hAnsi="Consolas"/>
+        </w:rPr>
+      </w:pPr>
+      <w:r>
+        <w:rPr>
+          <w:rFonts w:ascii="Consolas" w:hAnsi="Consolas"/>
+        </w:rPr>
+        <w:t xml:space="preserve">                            &lt;a </w:t>
+      </w:r>
+      <w:proofErr w:type="spellStart"/>
+      <w:r>
+        <w:rPr>
+          <w:rFonts w:ascii="Consolas" w:hAnsi="Consolas"/>
+        </w:rPr>
+        <w:t>href</w:t>
+      </w:r>
+      <w:proofErr w:type="spellEnd"/>
+      <w:r>
+        <w:rPr>
+          <w:rFonts w:ascii="Consolas" w:hAnsi="Consolas"/>
+        </w:rPr>
+        <w:t>="https://en.wikipedia.org/wiki/</w:t>
+      </w:r>
+      <w:proofErr w:type="spellStart"/>
+      <w:r>
+        <w:rPr>
+          <w:rFonts w:ascii="Consolas" w:hAnsi="Consolas"/>
+        </w:rPr>
+        <w:t>Ronan_Tynan</w:t>
+      </w:r>
+      <w:proofErr w:type="spellEnd"/>
+      <w:r>
+        <w:rPr>
+          <w:rFonts w:ascii="Consolas" w:hAnsi="Consolas"/>
+        </w:rPr>
+        <w:t>" class="link-maroon"&gt;Ronan Tynan&lt;/a&gt;</w:t>
+      </w:r>
+    </w:p>
+    <w:p>
+      <w:pPr>
+        <w:pBdr>
+          <w:top w:val="single" w:sz="4" w:space="1" w:color="auto"/>
+          <w:left w:val="single" w:sz="4" w:space="1" w:color="auto"/>
+          <w:bottom w:val="single" w:sz="4" w:space="1" w:color="auto"/>
+          <w:right w:val="single" w:sz="4" w:space="1" w:color="auto"/>
+        </w:pBdr>
+        <w:rPr>
+          <w:rFonts w:ascii="Consolas" w:hAnsi="Consolas"/>
+        </w:rPr>
+      </w:pPr>
+      <w:r>
+        <w:rPr>
+          <w:rFonts w:ascii="Consolas" w:hAnsi="Consolas"/>
+        </w:rPr>
+        <w:t>                        &lt;/strong&gt;</w:t>
+      </w:r>
+    </w:p>
+    <w:p>
+      <w:pPr>
+        <w:pBdr>
+          <w:top w:val="single" w:sz="4" w:space="1" w:color="auto"/>
+          <w:left w:val="single" w:sz="4" w:space="1" w:color="auto"/>
+          <w:bottom w:val="single" w:sz="4" w:space="1" w:color="auto"/>
+          <w:right w:val="single" w:sz="4" w:space="1" w:color="auto"/>
+        </w:pBdr>
+        <w:rPr>
+          <w:rFonts w:ascii="Consolas" w:hAnsi="Consolas"/>
+        </w:rPr>
+      </w:pPr>
+      <w:r>
+        <w:rPr>
+          <w:rFonts w:ascii="Consolas" w:hAnsi="Consolas"/>
+        </w:rPr>
+        <w:t>                    &lt;/li&gt;</w:t>
+      </w:r>
+    </w:p>
+    <w:p>
+      <w:pPr>
+        <w:pBdr>
+          <w:top w:val="single" w:sz="4" w:space="1" w:color="auto"/>
+          <w:left w:val="single" w:sz="4" w:space="1" w:color="auto"/>
+          <w:bottom w:val="single" w:sz="4" w:space="1" w:color="auto"/>
+          <w:right w:val="single" w:sz="4" w:space="1" w:color="auto"/>
+        </w:pBdr>
+        <w:rPr>
+          <w:rFonts w:ascii="Consolas" w:hAnsi="Consolas"/>
+        </w:rPr>
+      </w:pPr>
+      <w:r>
+        <w:rPr>
+          <w:rFonts w:ascii="Consolas" w:hAnsi="Consolas"/>
+        </w:rPr>
+        <w:t>                &lt;/ul&gt;</w:t>
+      </w:r>
+    </w:p>
+    <w:p>
+      <w:pPr>
+        <w:pBdr>
+          <w:top w:val="single" w:sz="4" w:space="1" w:color="auto"/>
+          <w:left w:val="single" w:sz="4" w:space="1" w:color="auto"/>
+          <w:bottom w:val="single" w:sz="4" w:space="1" w:color="auto"/>
+          <w:right w:val="single" w:sz="4" w:space="1" w:color="auto"/>
+        </w:pBdr>
+        <w:rPr>
+          <w:rFonts w:ascii="Consolas" w:hAnsi="Consolas"/>
+        </w:rPr>
+      </w:pPr>
+      <w:r>
+        <w:rPr>
+          <w:rFonts w:ascii="Consolas" w:hAnsi="Consolas"/>
+        </w:rPr>
+        <w:t xml:space="preserve">    </w:t>
+      </w:r>
+    </w:p>
+    <w:p>
+      <w:pPr>
+        <w:pBdr>
+          <w:top w:val="single" w:sz="4" w:space="1" w:color="auto"/>
+          <w:left w:val="single" w:sz="4" w:space="1" w:color="auto"/>
+          <w:bottom w:val="single" w:sz="4" w:space="1" w:color="auto"/>
+          <w:right w:val="single" w:sz="4" w:space="1" w:color="auto"/>
+        </w:pBdr>
+        <w:rPr>
+          <w:rFonts w:ascii="Consolas" w:hAnsi="Consolas"/>
+        </w:rPr>
+      </w:pPr>
+      <w:r>
+        <w:rPr>
+          <w:rFonts w:ascii="Consolas" w:hAnsi="Consolas"/>
+        </w:rPr>
+        <w:t xml:space="preserve">                &lt;h2&gt;Looking for a unique </w:t>
+      </w:r>
+      <w:proofErr w:type="gramStart"/>
+      <w:r>
+        <w:rPr>
+          <w:rFonts w:ascii="Consolas" w:hAnsi="Consolas"/>
+        </w:rPr>
+        <w:t>gift?&lt;</w:t>
+      </w:r>
+      <w:proofErr w:type="gramEnd"/>
+      <w:r>
+        <w:rPr>
+          <w:rFonts w:ascii="Consolas" w:hAnsi="Consolas"/>
+        </w:rPr>
+        <w:t>/h2&gt;</w:t>
+      </w:r>
+    </w:p>
+    <w:p>
+      <w:pPr>
+        <w:pBdr>
+          <w:top w:val="single" w:sz="4" w:space="1" w:color="auto"/>
+          <w:left w:val="single" w:sz="4" w:space="1" w:color="auto"/>
+          <w:bottom w:val="single" w:sz="4" w:space="1" w:color="auto"/>
+          <w:right w:val="single" w:sz="4" w:space="1" w:color="auto"/>
+        </w:pBdr>
+        <w:rPr>
+          <w:rFonts w:ascii="Consolas" w:hAnsi="Consolas"/>
+        </w:rPr>
+      </w:pPr>
+      <w:r>
+        <w:rPr>
+          <w:rFonts w:ascii="Consolas" w:hAnsi="Consolas"/>
+        </w:rPr>
+        <w:t xml:space="preserve">                &lt;p&gt;Town Hall has the answer. For only $100, you can get a book of tickets for </w:t>
+      </w:r>
+      <w:proofErr w:type="gramStart"/>
+      <w:r>
+        <w:rPr>
+          <w:rFonts w:ascii="Consolas" w:hAnsi="Consolas"/>
+        </w:rPr>
+        <w:t>all of</w:t>
+      </w:r>
+      <w:proofErr w:type="gramEnd"/>
+      <w:r>
+        <w:rPr>
+          <w:rFonts w:ascii="Consolas" w:hAnsi="Consolas"/>
+        </w:rPr>
+        <w:t xml:space="preserve"> the remaining speakers. And the bargain includes a second book of tickets for a </w:t>
+      </w:r>
+      <w:proofErr w:type="gramStart"/>
+      <w:r>
+        <w:rPr>
+          <w:rFonts w:ascii="Consolas" w:hAnsi="Consolas"/>
+        </w:rPr>
+        <w:t>companion.&lt;</w:t>
+      </w:r>
+      <w:proofErr w:type="gramEnd"/>
+      <w:r>
+        <w:rPr>
+          <w:rFonts w:ascii="Consolas" w:hAnsi="Consolas"/>
+        </w:rPr>
+        <w:t>/p&gt;</w:t>
+      </w:r>
+    </w:p>
+    <w:p>
+      <w:pPr>
+        <w:pBdr>
+          <w:top w:val="single" w:sz="4" w:space="1" w:color="auto"/>
+          <w:left w:val="single" w:sz="4" w:space="1" w:color="auto"/>
+          <w:bottom w:val="single" w:sz="4" w:space="1" w:color="auto"/>
+          <w:right w:val="single" w:sz="4" w:space="1" w:color="auto"/>
+        </w:pBdr>
+        <w:rPr>
+          <w:rFonts w:ascii="Consolas" w:hAnsi="Consolas"/>
+        </w:rPr>
+      </w:pPr>
+      <w:r>
+        <w:rPr>
+          <w:rFonts w:ascii="Consolas" w:hAnsi="Consolas"/>
+        </w:rPr>
+        <w:t xml:space="preserve">                &lt;p&gt;Or, for $50, you can give yourself the gift of our speakers, and still get an extra ticket for a companion, but for just one of the </w:t>
+      </w:r>
+      <w:proofErr w:type="gramStart"/>
+      <w:r>
+        <w:rPr>
+          <w:rFonts w:ascii="Consolas" w:hAnsi="Consolas"/>
+        </w:rPr>
+        <w:t>events.&lt;</w:t>
+      </w:r>
+      <w:proofErr w:type="gramEnd"/>
+      <w:r>
+        <w:rPr>
+          <w:rFonts w:ascii="Consolas" w:hAnsi="Consolas"/>
+        </w:rPr>
+        <w:t>/p&gt;</w:t>
+      </w:r>
+    </w:p>
+    <w:p>
+      <w:pPr>
+        <w:pBdr>
+          <w:top w:val="single" w:sz="4" w:space="1" w:color="auto"/>
+          <w:left w:val="single" w:sz="4" w:space="1" w:color="auto"/>
+          <w:bottom w:val="single" w:sz="4" w:space="1" w:color="auto"/>
+          <w:right w:val="single" w:sz="4" w:space="1" w:color="auto"/>
+        </w:pBdr>
+        <w:rPr>
+          <w:rFonts w:ascii="Consolas" w:hAnsi="Consolas"/>
+        </w:rPr>
+      </w:pPr>
+      <w:r>
+        <w:rPr>
+          <w:rFonts w:ascii="Consolas" w:hAnsi="Consolas"/>
+        </w:rPr>
+        <w:t xml:space="preserve">                </w:t>
+      </w:r>
+      <w:proofErr w:type="gramStart"/>
+      <w:r>
+        <w:rPr>
+          <w:rFonts w:ascii="Consolas" w:hAnsi="Consolas"/>
+        </w:rPr>
+        <w:t>&lt;p&gt;See</w:t>
+      </w:r>
+      <w:proofErr w:type="gramEnd"/>
+      <w:r>
+        <w:rPr>
+          <w:rFonts w:ascii="Consolas" w:hAnsi="Consolas"/>
+        </w:rPr>
+        <w:t xml:space="preserve"> you at the next </w:t>
+      </w:r>
+      <w:proofErr w:type="gramStart"/>
+      <w:r>
+        <w:rPr>
+          <w:rFonts w:ascii="Consolas" w:hAnsi="Consolas"/>
+        </w:rPr>
+        <w:t>show?&lt;</w:t>
+      </w:r>
+      <w:proofErr w:type="gramEnd"/>
+      <w:r>
+        <w:rPr>
+          <w:rFonts w:ascii="Consolas" w:hAnsi="Consolas"/>
+        </w:rPr>
+        <w:t>/p&gt;</w:t>
+      </w:r>
+    </w:p>
+    <w:p>
+      <w:pPr>
+        <w:pBdr>
+          <w:top w:val="single" w:sz="4" w:space="1" w:color="auto"/>
+          <w:left w:val="single" w:sz="4" w:space="1" w:color="auto"/>
+          <w:bottom w:val="single" w:sz="4" w:space="1" w:color="auto"/>
+          <w:right w:val="single" w:sz="4" w:space="1" w:color="auto"/>
+        </w:pBdr>
+        <w:rPr>
+          <w:rFonts w:ascii="Consolas" w:hAnsi="Consolas"/>
+        </w:rPr>
+      </w:pPr>
+      <w:r>
+        <w:rPr>
+          <w:rFonts w:ascii="Consolas" w:hAnsi="Consolas"/>
+        </w:rPr>
+        <w:t xml:space="preserve">    </w:t>
+      </w:r>
+    </w:p>
+    <w:p>
+      <w:pPr>
+        <w:pBdr>
+          <w:top w:val="single" w:sz="4" w:space="1" w:color="auto"/>
+          <w:left w:val="single" w:sz="4" w:space="1" w:color="auto"/>
+          <w:bottom w:val="single" w:sz="4" w:space="1" w:color="auto"/>
+          <w:right w:val="single" w:sz="4" w:space="1" w:color="auto"/>
+        </w:pBdr>
+        <w:rPr>
+          <w:rFonts w:ascii="Consolas" w:hAnsi="Consolas"/>
+        </w:rPr>
+      </w:pPr>
+      <w:r>
+        <w:rPr>
+          <w:rFonts w:ascii="Consolas" w:hAnsi="Consolas"/>
+        </w:rPr>
+        <w:t>                &lt;p&gt;&lt;strong&gt;&lt;</w:t>
+      </w:r>
+      <w:proofErr w:type="spellStart"/>
+      <w:r>
+        <w:rPr>
+          <w:rFonts w:ascii="Consolas" w:hAnsi="Consolas"/>
+        </w:rPr>
+        <w:t>em</w:t>
+      </w:r>
+      <w:proofErr w:type="spellEnd"/>
+      <w:r>
+        <w:rPr>
+          <w:rFonts w:ascii="Consolas" w:hAnsi="Consolas"/>
+        </w:rPr>
+        <w:t>&gt;Contact us by phone&lt;/</w:t>
+      </w:r>
+      <w:proofErr w:type="spellStart"/>
+      <w:r>
+        <w:rPr>
+          <w:rFonts w:ascii="Consolas" w:hAnsi="Consolas"/>
+        </w:rPr>
+        <w:t>em</w:t>
+      </w:r>
+      <w:proofErr w:type="spellEnd"/>
+      <w:r>
+        <w:rPr>
+          <w:rFonts w:ascii="Consolas" w:hAnsi="Consolas"/>
+        </w:rPr>
+        <w:t xml:space="preserve">&gt;&lt;/strong&gt; at (559) 555-1212 for ticket </w:t>
+      </w:r>
+      <w:proofErr w:type="gramStart"/>
+      <w:r>
+        <w:rPr>
+          <w:rFonts w:ascii="Consolas" w:hAnsi="Consolas"/>
+        </w:rPr>
+        <w:t>information.&lt;</w:t>
+      </w:r>
+      <w:proofErr w:type="gramEnd"/>
+      <w:r>
+        <w:rPr>
+          <w:rFonts w:ascii="Consolas" w:hAnsi="Consolas"/>
+        </w:rPr>
+        <w:t>/p&gt;</w:t>
+      </w:r>
+    </w:p>
+    <w:p>
+      <w:pPr>
+        <w:pBdr>
+          <w:top w:val="single" w:sz="4" w:space="1" w:color="auto"/>
+          <w:left w:val="single" w:sz="4" w:space="1" w:color="auto"/>
+          <w:bottom w:val="single" w:sz="4" w:space="1" w:color="auto"/>
+          <w:right w:val="single" w:sz="4" w:space="1" w:color="auto"/>
+        </w:pBdr>
+        <w:rPr>
+          <w:rFonts w:ascii="Consolas" w:hAnsi="Consolas"/>
+        </w:rPr>
+      </w:pPr>
+      <w:r>
+        <w:rPr>
+          <w:rFonts w:ascii="Consolas" w:hAnsi="Consolas"/>
+        </w:rPr>
+        <w:t>            &lt;/main&gt;</w:t>
+      </w:r>
+    </w:p>
+    <w:p>
+      <w:pPr>
+        <w:pBdr>
+          <w:top w:val="single" w:sz="4" w:space="1" w:color="auto"/>
+          <w:left w:val="single" w:sz="4" w:space="1" w:color="auto"/>
+          <w:bottom w:val="single" w:sz="4" w:space="1" w:color="auto"/>
+          <w:right w:val="single" w:sz="4" w:space="1" w:color="auto"/>
+        </w:pBdr>
+        <w:rPr>
+          <w:rFonts w:ascii="Consolas" w:hAnsi="Consolas"/>
+        </w:rPr>
+      </w:pPr>
+    </w:p>
+    <w:p>
+      <w:pPr>
+        <w:pBdr>
+          <w:top w:val="single" w:sz="4" w:space="1" w:color="auto"/>
+          <w:left w:val="single" w:sz="4" w:space="1" w:color="auto"/>
+          <w:bottom w:val="single" w:sz="4" w:space="1" w:color="auto"/>
+          <w:right w:val="single" w:sz="4" w:space="1" w:color="auto"/>
+        </w:pBdr>
+        <w:rPr>
+          <w:rFonts w:ascii="Consolas" w:hAnsi="Consolas"/>
+        </w:rPr>
+      </w:pPr>
+      <w:r>
+        <w:rPr>
+          <w:rFonts w:ascii="Consolas" w:hAnsi="Consolas"/>
+        </w:rPr>
+        <w:t>            &lt;aside&gt;</w:t>
+      </w:r>
+    </w:p>
+    <w:p>
+      <w:pPr>
+        <w:pBdr>
+          <w:top w:val="single" w:sz="4" w:space="1" w:color="auto"/>
+          <w:left w:val="single" w:sz="4" w:space="1" w:color="auto"/>
+          <w:bottom w:val="single" w:sz="4" w:space="1" w:color="auto"/>
+          <w:right w:val="single" w:sz="4" w:space="1" w:color="auto"/>
+        </w:pBdr>
+        <w:rPr>
+          <w:rFonts w:ascii="Consolas" w:hAnsi="Consolas"/>
+        </w:rPr>
+      </w:pPr>
+      <w:r>
+        <w:rPr>
+          <w:rFonts w:ascii="Consolas" w:hAnsi="Consolas"/>
+        </w:rPr>
+        <w:t>                &lt;h2&gt;Lecture notes&lt;/h2&gt;</w:t>
+      </w:r>
+    </w:p>
+    <w:p>
+      <w:pPr>
+        <w:pBdr>
+          <w:top w:val="single" w:sz="4" w:space="1" w:color="auto"/>
+          <w:left w:val="single" w:sz="4" w:space="1" w:color="auto"/>
+          <w:bottom w:val="single" w:sz="4" w:space="1" w:color="auto"/>
+          <w:right w:val="single" w:sz="4" w:space="1" w:color="auto"/>
+        </w:pBdr>
+        <w:rPr>
+          <w:rFonts w:ascii="Consolas" w:hAnsi="Consolas"/>
+        </w:rPr>
+      </w:pPr>
+      <w:r>
+        <w:rPr>
+          <w:rFonts w:ascii="Consolas" w:hAnsi="Consolas"/>
+        </w:rPr>
+        <w:t>                &lt;h3&gt;Event change for November&lt;/h3&gt;</w:t>
+      </w:r>
+    </w:p>
+    <w:p>
+      <w:pPr>
+        <w:pBdr>
+          <w:top w:val="single" w:sz="4" w:space="1" w:color="auto"/>
+          <w:left w:val="single" w:sz="4" w:space="1" w:color="auto"/>
+          <w:bottom w:val="single" w:sz="4" w:space="1" w:color="auto"/>
+          <w:right w:val="single" w:sz="4" w:space="1" w:color="auto"/>
+        </w:pBdr>
+        <w:rPr>
+          <w:rFonts w:ascii="Consolas" w:hAnsi="Consolas"/>
+        </w:rPr>
+      </w:pPr>
+      <w:r>
+        <w:rPr>
+          <w:rFonts w:ascii="Consolas" w:hAnsi="Consolas"/>
+        </w:rPr>
+        <w:t xml:space="preserve">                &lt;p&gt;SJV Town Hall is pleased to announce the addition of award-winning author Andrew Ross Sorkin. The appearance of previously scheduled speaker, Greg Mortenson, has been </w:t>
+      </w:r>
+      <w:proofErr w:type="gramStart"/>
+      <w:r>
+        <w:rPr>
+          <w:rFonts w:ascii="Consolas" w:hAnsi="Consolas"/>
+        </w:rPr>
+        <w:t>postponed.&lt;</w:t>
+      </w:r>
+      <w:proofErr w:type="gramEnd"/>
+      <w:r>
+        <w:rPr>
+          <w:rFonts w:ascii="Consolas" w:hAnsi="Consolas"/>
+        </w:rPr>
+        <w:t>/p&gt;</w:t>
+      </w:r>
+    </w:p>
+    <w:p>
+      <w:pPr>
+        <w:pBdr>
+          <w:top w:val="single" w:sz="4" w:space="1" w:color="auto"/>
+          <w:left w:val="single" w:sz="4" w:space="1" w:color="auto"/>
+          <w:bottom w:val="single" w:sz="4" w:space="1" w:color="auto"/>
+          <w:right w:val="single" w:sz="4" w:space="1" w:color="auto"/>
+        </w:pBdr>
+        <w:rPr>
+          <w:rFonts w:ascii="Consolas" w:hAnsi="Consolas"/>
+        </w:rPr>
+      </w:pPr>
+    </w:p>
+    <w:p>
+      <w:pPr>
+        <w:pBdr>
+          <w:top w:val="single" w:sz="4" w:space="1" w:color="auto"/>
+          <w:left w:val="single" w:sz="4" w:space="1" w:color="auto"/>
+          <w:bottom w:val="single" w:sz="4" w:space="1" w:color="auto"/>
+          <w:right w:val="single" w:sz="4" w:space="1" w:color="auto"/>
+        </w:pBdr>
+        <w:rPr>
+          <w:rFonts w:ascii="Consolas" w:hAnsi="Consolas"/>
+        </w:rPr>
+      </w:pPr>
+      <w:r>
+        <w:rPr>
+          <w:rFonts w:ascii="Consolas" w:hAnsi="Consolas"/>
+        </w:rPr>
+        <w:lastRenderedPageBreak/>
+        <w:t>                &lt;h3&gt;</w:t>
+      </w:r>
+      <w:proofErr w:type="gramStart"/>
+      <w:r>
+        <w:rPr>
+          <w:rFonts w:ascii="Consolas" w:hAnsi="Consolas"/>
+        </w:rPr>
+        <w:t>Lecture day</w:t>
+      </w:r>
+      <w:proofErr w:type="gramEnd"/>
+      <w:r>
+        <w:rPr>
+          <w:rFonts w:ascii="Consolas" w:hAnsi="Consolas"/>
+        </w:rPr>
+        <w:t>, time, and location&lt;/h3&gt;</w:t>
+      </w:r>
+    </w:p>
+    <w:p>
+      <w:pPr>
+        <w:pBdr>
+          <w:top w:val="single" w:sz="4" w:space="1" w:color="auto"/>
+          <w:left w:val="single" w:sz="4" w:space="1" w:color="auto"/>
+          <w:bottom w:val="single" w:sz="4" w:space="1" w:color="auto"/>
+          <w:right w:val="single" w:sz="4" w:space="1" w:color="auto"/>
+        </w:pBdr>
+        <w:rPr>
+          <w:rFonts w:ascii="Consolas" w:hAnsi="Consolas"/>
+        </w:rPr>
+      </w:pPr>
+      <w:r>
+        <w:rPr>
+          <w:rFonts w:ascii="Consolas" w:hAnsi="Consolas"/>
+        </w:rPr>
+        <w:t>                &lt;p&gt;All one-hour lectures are on the second Wednesday of the month beginning at 10:30 a.m. at William Saroyan Theatre, 700 M Street, Fresco, CA.&lt;/p&gt;</w:t>
+      </w:r>
+    </w:p>
+    <w:p>
+      <w:pPr>
+        <w:pBdr>
+          <w:top w:val="single" w:sz="4" w:space="1" w:color="auto"/>
+          <w:left w:val="single" w:sz="4" w:space="1" w:color="auto"/>
+          <w:bottom w:val="single" w:sz="4" w:space="1" w:color="auto"/>
+          <w:right w:val="single" w:sz="4" w:space="1" w:color="auto"/>
+        </w:pBdr>
+        <w:rPr>
+          <w:rFonts w:ascii="Consolas" w:hAnsi="Consolas"/>
+        </w:rPr>
+      </w:pPr>
+      <w:r>
+        <w:rPr>
+          <w:rFonts w:ascii="Consolas" w:hAnsi="Consolas"/>
+        </w:rPr>
+        <w:t>            &lt;/aside&gt;</w:t>
+      </w:r>
+    </w:p>
+    <w:p>
+      <w:pPr>
+        <w:pBdr>
+          <w:top w:val="single" w:sz="4" w:space="1" w:color="auto"/>
+          <w:left w:val="single" w:sz="4" w:space="1" w:color="auto"/>
+          <w:bottom w:val="single" w:sz="4" w:space="1" w:color="auto"/>
+          <w:right w:val="single" w:sz="4" w:space="1" w:color="auto"/>
+        </w:pBdr>
+        <w:rPr>
+          <w:rFonts w:ascii="Consolas" w:hAnsi="Consolas"/>
+        </w:rPr>
+      </w:pPr>
+      <w:r>
+        <w:rPr>
+          <w:rFonts w:ascii="Consolas" w:hAnsi="Consolas"/>
+        </w:rPr>
+        <w:t>        &lt;/section&gt;</w:t>
+      </w:r>
+    </w:p>
+    <w:p>
+      <w:pPr>
+        <w:pBdr>
+          <w:top w:val="single" w:sz="4" w:space="1" w:color="auto"/>
+          <w:left w:val="single" w:sz="4" w:space="1" w:color="auto"/>
+          <w:bottom w:val="single" w:sz="4" w:space="1" w:color="auto"/>
+          <w:right w:val="single" w:sz="4" w:space="1" w:color="auto"/>
+        </w:pBdr>
+        <w:rPr>
+          <w:rFonts w:ascii="Consolas" w:hAnsi="Consolas"/>
+        </w:rPr>
+      </w:pPr>
+    </w:p>
+    <w:p>
+      <w:pPr>
+        <w:pBdr>
+          <w:top w:val="single" w:sz="4" w:space="1" w:color="auto"/>
+          <w:left w:val="single" w:sz="4" w:space="1" w:color="auto"/>
+          <w:bottom w:val="single" w:sz="4" w:space="1" w:color="auto"/>
+          <w:right w:val="single" w:sz="4" w:space="1" w:color="auto"/>
+        </w:pBdr>
+        <w:rPr>
+          <w:rFonts w:ascii="Consolas" w:hAnsi="Consolas"/>
+        </w:rPr>
+      </w:pPr>
+      <w:r>
+        <w:rPr>
+          <w:rFonts w:ascii="Consolas" w:hAnsi="Consolas"/>
+        </w:rPr>
+        <w:t>        &lt;footer&gt;</w:t>
+      </w:r>
+    </w:p>
+    <w:p>
+      <w:pPr>
+        <w:pBdr>
+          <w:top w:val="single" w:sz="4" w:space="1" w:color="auto"/>
+          <w:left w:val="single" w:sz="4" w:space="1" w:color="auto"/>
+          <w:bottom w:val="single" w:sz="4" w:space="1" w:color="auto"/>
+          <w:right w:val="single" w:sz="4" w:space="1" w:color="auto"/>
+        </w:pBdr>
+        <w:rPr>
+          <w:rFonts w:ascii="Consolas" w:hAnsi="Consolas"/>
+        </w:rPr>
+      </w:pPr>
+      <w:r>
+        <w:rPr>
+          <w:rFonts w:ascii="Consolas" w:hAnsi="Consolas"/>
+        </w:rPr>
+        <w:t>            &lt;small&gt;</w:t>
+      </w:r>
+    </w:p>
+    <w:p>
+      <w:pPr>
+        <w:pBdr>
+          <w:top w:val="single" w:sz="4" w:space="1" w:color="auto"/>
+          <w:left w:val="single" w:sz="4" w:space="1" w:color="auto"/>
+          <w:bottom w:val="single" w:sz="4" w:space="1" w:color="auto"/>
+          <w:right w:val="single" w:sz="4" w:space="1" w:color="auto"/>
+        </w:pBdr>
+        <w:rPr>
+          <w:rFonts w:ascii="Consolas" w:hAnsi="Consolas"/>
+        </w:rPr>
+      </w:pPr>
+      <w:r>
+        <w:rPr>
+          <w:rFonts w:ascii="Consolas" w:hAnsi="Consolas"/>
+        </w:rPr>
+        <w:t>                © Copyright 2022 San Joaquin Valley Town Hall.</w:t>
+      </w:r>
+    </w:p>
+    <w:p>
+      <w:pPr>
+        <w:pBdr>
+          <w:top w:val="single" w:sz="4" w:space="1" w:color="auto"/>
+          <w:left w:val="single" w:sz="4" w:space="1" w:color="auto"/>
+          <w:bottom w:val="single" w:sz="4" w:space="1" w:color="auto"/>
+          <w:right w:val="single" w:sz="4" w:space="1" w:color="auto"/>
+        </w:pBdr>
+        <w:rPr>
+          <w:rFonts w:ascii="Consolas" w:hAnsi="Consolas"/>
+        </w:rPr>
+      </w:pPr>
+      <w:r>
+        <w:rPr>
+          <w:rFonts w:ascii="Consolas" w:hAnsi="Consolas"/>
+        </w:rPr>
+        <w:t>            &lt;/small&gt;</w:t>
+      </w:r>
+    </w:p>
+    <w:p>
+      <w:pPr>
+        <w:pBdr>
+          <w:top w:val="single" w:sz="4" w:space="1" w:color="auto"/>
+          <w:left w:val="single" w:sz="4" w:space="1" w:color="auto"/>
+          <w:bottom w:val="single" w:sz="4" w:space="1" w:color="auto"/>
+          <w:right w:val="single" w:sz="4" w:space="1" w:color="auto"/>
+        </w:pBdr>
+        <w:rPr>
+          <w:rFonts w:ascii="Consolas" w:hAnsi="Consolas"/>
+        </w:rPr>
+      </w:pPr>
+      <w:r>
+        <w:rPr>
+          <w:rFonts w:ascii="Consolas" w:hAnsi="Consolas"/>
+        </w:rPr>
+        <w:t>        &lt;/footer&gt;</w:t>
+      </w:r>
+    </w:p>
+    <w:p>
+      <w:pPr>
+        <w:pBdr>
+          <w:top w:val="single" w:sz="4" w:space="1" w:color="auto"/>
+          <w:left w:val="single" w:sz="4" w:space="1" w:color="auto"/>
+          <w:bottom w:val="single" w:sz="4" w:space="1" w:color="auto"/>
+          <w:right w:val="single" w:sz="4" w:space="1" w:color="auto"/>
+        </w:pBdr>
+        <w:rPr>
+          <w:rFonts w:ascii="Consolas" w:hAnsi="Consolas"/>
+        </w:rPr>
+      </w:pPr>
+      <w:r>
+        <w:rPr>
+          <w:rFonts w:ascii="Consolas" w:hAnsi="Consolas"/>
+        </w:rPr>
+        <w:t>    &lt;/section&gt;</w:t>
+      </w:r>
+    </w:p>
+    <w:p>
+      <w:pPr>
+        <w:pBdr>
+          <w:top w:val="single" w:sz="4" w:space="1" w:color="auto"/>
+          <w:left w:val="single" w:sz="4" w:space="1" w:color="auto"/>
+          <w:bottom w:val="single" w:sz="4" w:space="1" w:color="auto"/>
+          <w:right w:val="single" w:sz="4" w:space="1" w:color="auto"/>
+        </w:pBdr>
+        <w:rPr>
+          <w:rFonts w:ascii="Consolas" w:hAnsi="Consolas"/>
+        </w:rPr>
+      </w:pPr>
+      <w:r>
+        <w:rPr>
+          <w:rFonts w:ascii="Consolas" w:hAnsi="Consolas"/>
+        </w:rPr>
+        <w:t>&lt;/body&gt;</w:t>
+      </w:r>
+    </w:p>
+    <w:p>
+      <w:pPr>
+        <w:pBdr>
+          <w:top w:val="single" w:sz="4" w:space="1" w:color="auto"/>
+          <w:left w:val="single" w:sz="4" w:space="1" w:color="auto"/>
+          <w:bottom w:val="single" w:sz="4" w:space="1" w:color="auto"/>
+          <w:right w:val="single" w:sz="4" w:space="1" w:color="auto"/>
+        </w:pBdr>
+        <w:rPr>
+          <w:rFonts w:ascii="Consolas" w:hAnsi="Consolas"/>
+        </w:rPr>
+      </w:pPr>
+      <w:r>
+        <w:rPr>
+          <w:rFonts w:ascii="Consolas" w:hAnsi="Consolas"/>
+        </w:rPr>
+        <w:t>&lt;/html&gt;</w:t>
+      </w:r>
+    </w:p>
+    <w:p/>
+    <w:p>
+      <w:pPr>
+        <w:pStyle w:val="Heading2"/>
+      </w:pPr>
+      <w:r>
+        <w:t>CSS Code</w:t>
+      </w:r>
+    </w:p>
+    <w:p>
+      <w:pPr>
+        <w:pBdr>
+          <w:top w:val="single" w:sz="4" w:space="1" w:color="auto"/>
+          <w:left w:val="single" w:sz="4" w:space="1" w:color="auto"/>
+          <w:bottom w:val="single" w:sz="4" w:space="1" w:color="auto"/>
+          <w:right w:val="single" w:sz="4" w:space="1" w:color="auto"/>
+        </w:pBdr>
+        <w:rPr>
+          <w:rFonts w:ascii="Consolas" w:hAnsi="Consolas"/>
+        </w:rPr>
+      </w:pPr>
+      <w:r>
+        <w:rPr>
+          <w:rFonts w:ascii="Consolas" w:hAnsi="Consolas"/>
+        </w:rPr>
+        <w:t>body {</w:t>
+      </w:r>
+    </w:p>
+    <w:p>
+      <w:pPr>
+        <w:pBdr>
+          <w:top w:val="single" w:sz="4" w:space="1" w:color="auto"/>
+          <w:left w:val="single" w:sz="4" w:space="1" w:color="auto"/>
+          <w:bottom w:val="single" w:sz="4" w:space="1" w:color="auto"/>
+          <w:right w:val="single" w:sz="4" w:space="1" w:color="auto"/>
+        </w:pBdr>
+        <w:rPr>
+          <w:rFonts w:ascii="Consolas" w:hAnsi="Consolas"/>
+        </w:rPr>
+      </w:pPr>
+      <w:r>
+        <w:rPr>
+          <w:rFonts w:ascii="Consolas" w:hAnsi="Consolas"/>
+        </w:rPr>
+        <w:t>    font-family: sans-</w:t>
+      </w:r>
+      <w:proofErr w:type="gramStart"/>
+      <w:r>
+        <w:rPr>
+          <w:rFonts w:ascii="Consolas" w:hAnsi="Consolas"/>
+        </w:rPr>
+        <w:t>serif;</w:t>
+      </w:r>
+      <w:proofErr w:type="gramEnd"/>
+    </w:p>
+    <w:p>
+      <w:pPr>
+        <w:pBdr>
+          <w:top w:val="single" w:sz="4" w:space="1" w:color="auto"/>
+          <w:left w:val="single" w:sz="4" w:space="1" w:color="auto"/>
+          <w:bottom w:val="single" w:sz="4" w:space="1" w:color="auto"/>
+          <w:right w:val="single" w:sz="4" w:space="1" w:color="auto"/>
+        </w:pBdr>
+        <w:rPr>
+          <w:rFonts w:ascii="Consolas" w:hAnsi="Consolas"/>
+        </w:rPr>
+      </w:pPr>
+    </w:p>
+    <w:p>
+      <w:pPr>
+        <w:pBdr>
+          <w:top w:val="single" w:sz="4" w:space="1" w:color="auto"/>
+          <w:left w:val="single" w:sz="4" w:space="1" w:color="auto"/>
+          <w:bottom w:val="single" w:sz="4" w:space="1" w:color="auto"/>
+          <w:right w:val="single" w:sz="4" w:space="1" w:color="auto"/>
+        </w:pBdr>
+        <w:rPr>
+          <w:rFonts w:ascii="Consolas" w:hAnsi="Consolas"/>
+        </w:rPr>
+      </w:pPr>
+      <w:r>
+        <w:rPr>
+          <w:rFonts w:ascii="Consolas" w:hAnsi="Consolas"/>
+        </w:rPr>
+        <w:t xml:space="preserve">    height: </w:t>
+      </w:r>
+      <w:proofErr w:type="gramStart"/>
+      <w:r>
+        <w:rPr>
+          <w:rFonts w:ascii="Consolas" w:hAnsi="Consolas"/>
+        </w:rPr>
+        <w:t>100vh;</w:t>
+      </w:r>
+      <w:proofErr w:type="gramEnd"/>
+    </w:p>
+    <w:p>
+      <w:pPr>
+        <w:pBdr>
+          <w:top w:val="single" w:sz="4" w:space="1" w:color="auto"/>
+          <w:left w:val="single" w:sz="4" w:space="1" w:color="auto"/>
+          <w:bottom w:val="single" w:sz="4" w:space="1" w:color="auto"/>
+          <w:right w:val="single" w:sz="4" w:space="1" w:color="auto"/>
+        </w:pBdr>
+        <w:rPr>
+          <w:rFonts w:ascii="Consolas" w:hAnsi="Consolas"/>
+        </w:rPr>
+      </w:pPr>
+      <w:r>
+        <w:rPr>
+          <w:rFonts w:ascii="Consolas" w:hAnsi="Consolas"/>
+        </w:rPr>
+        <w:t xml:space="preserve">    width: </w:t>
+      </w:r>
+      <w:proofErr w:type="gramStart"/>
+      <w:r>
+        <w:rPr>
+          <w:rFonts w:ascii="Consolas" w:hAnsi="Consolas"/>
+        </w:rPr>
+        <w:t>75%;</w:t>
+      </w:r>
+      <w:proofErr w:type="gramEnd"/>
+    </w:p>
+    <w:p>
+      <w:pPr>
+        <w:pBdr>
+          <w:top w:val="single" w:sz="4" w:space="1" w:color="auto"/>
+          <w:left w:val="single" w:sz="4" w:space="1" w:color="auto"/>
+          <w:bottom w:val="single" w:sz="4" w:space="1" w:color="auto"/>
+          <w:right w:val="single" w:sz="4" w:space="1" w:color="auto"/>
+        </w:pBdr>
+        <w:rPr>
+          <w:rFonts w:ascii="Consolas" w:hAnsi="Consolas"/>
+        </w:rPr>
+      </w:pPr>
+    </w:p>
+    <w:p>
+      <w:pPr>
+        <w:pBdr>
+          <w:top w:val="single" w:sz="4" w:space="1" w:color="auto"/>
+          <w:left w:val="single" w:sz="4" w:space="1" w:color="auto"/>
+          <w:bottom w:val="single" w:sz="4" w:space="1" w:color="auto"/>
+          <w:right w:val="single" w:sz="4" w:space="1" w:color="auto"/>
+        </w:pBdr>
+        <w:rPr>
+          <w:rFonts w:ascii="Consolas" w:hAnsi="Consolas"/>
+        </w:rPr>
+      </w:pPr>
+      <w:r>
+        <w:rPr>
+          <w:rFonts w:ascii="Consolas" w:hAnsi="Consolas"/>
+        </w:rPr>
+        <w:t xml:space="preserve">    margin: 0 </w:t>
+      </w:r>
+      <w:proofErr w:type="gramStart"/>
+      <w:r>
+        <w:rPr>
+          <w:rFonts w:ascii="Consolas" w:hAnsi="Consolas"/>
+        </w:rPr>
+        <w:t>auto;</w:t>
+      </w:r>
+      <w:proofErr w:type="gramEnd"/>
+    </w:p>
+    <w:p>
+      <w:pPr>
+        <w:pBdr>
+          <w:top w:val="single" w:sz="4" w:space="1" w:color="auto"/>
+          <w:left w:val="single" w:sz="4" w:space="1" w:color="auto"/>
+          <w:bottom w:val="single" w:sz="4" w:space="1" w:color="auto"/>
+          <w:right w:val="single" w:sz="4" w:space="1" w:color="auto"/>
+        </w:pBdr>
+        <w:rPr>
+          <w:rFonts w:ascii="Consolas" w:hAnsi="Consolas"/>
+        </w:rPr>
+      </w:pPr>
+    </w:p>
+    <w:p>
+      <w:pPr>
+        <w:pBdr>
+          <w:top w:val="single" w:sz="4" w:space="1" w:color="auto"/>
+          <w:left w:val="single" w:sz="4" w:space="1" w:color="auto"/>
+          <w:bottom w:val="single" w:sz="4" w:space="1" w:color="auto"/>
+          <w:right w:val="single" w:sz="4" w:space="1" w:color="auto"/>
+        </w:pBdr>
+        <w:rPr>
+          <w:rFonts w:ascii="Consolas" w:hAnsi="Consolas"/>
+        </w:rPr>
+      </w:pPr>
+      <w:r>
+        <w:rPr>
+          <w:rFonts w:ascii="Consolas" w:hAnsi="Consolas"/>
+        </w:rPr>
+        <w:t xml:space="preserve">    display: </w:t>
+      </w:r>
+      <w:proofErr w:type="gramStart"/>
+      <w:r>
+        <w:rPr>
+          <w:rFonts w:ascii="Consolas" w:hAnsi="Consolas"/>
+        </w:rPr>
+        <w:t>flex;</w:t>
+      </w:r>
+      <w:proofErr w:type="gramEnd"/>
+    </w:p>
+    <w:p>
+      <w:pPr>
+        <w:pBdr>
+          <w:top w:val="single" w:sz="4" w:space="1" w:color="auto"/>
+          <w:left w:val="single" w:sz="4" w:space="1" w:color="auto"/>
+          <w:bottom w:val="single" w:sz="4" w:space="1" w:color="auto"/>
+          <w:right w:val="single" w:sz="4" w:space="1" w:color="auto"/>
+        </w:pBdr>
+        <w:rPr>
+          <w:rFonts w:ascii="Consolas" w:hAnsi="Consolas"/>
+        </w:rPr>
+      </w:pPr>
+      <w:r>
+        <w:rPr>
+          <w:rFonts w:ascii="Consolas" w:hAnsi="Consolas"/>
+        </w:rPr>
+        <w:t xml:space="preserve">    flex-direction: </w:t>
+      </w:r>
+      <w:proofErr w:type="gramStart"/>
+      <w:r>
+        <w:rPr>
+          <w:rFonts w:ascii="Consolas" w:hAnsi="Consolas"/>
+        </w:rPr>
+        <w:t>column;</w:t>
+      </w:r>
+      <w:proofErr w:type="gramEnd"/>
+    </w:p>
+    <w:p>
+      <w:pPr>
+        <w:pBdr>
+          <w:top w:val="single" w:sz="4" w:space="1" w:color="auto"/>
+          <w:left w:val="single" w:sz="4" w:space="1" w:color="auto"/>
+          <w:bottom w:val="single" w:sz="4" w:space="1" w:color="auto"/>
+          <w:right w:val="single" w:sz="4" w:space="1" w:color="auto"/>
+        </w:pBdr>
+        <w:rPr>
+          <w:rFonts w:ascii="Consolas" w:hAnsi="Consolas"/>
+        </w:rPr>
+      </w:pPr>
+    </w:p>
+    <w:p>
+      <w:pPr>
+        <w:pBdr>
+          <w:top w:val="single" w:sz="4" w:space="1" w:color="auto"/>
+          <w:left w:val="single" w:sz="4" w:space="1" w:color="auto"/>
+          <w:bottom w:val="single" w:sz="4" w:space="1" w:color="auto"/>
+          <w:right w:val="single" w:sz="4" w:space="1" w:color="auto"/>
+        </w:pBdr>
+        <w:rPr>
+          <w:rFonts w:ascii="Consolas" w:hAnsi="Consolas"/>
+        </w:rPr>
+      </w:pPr>
+      <w:r>
+        <w:rPr>
+          <w:rFonts w:ascii="Consolas" w:hAnsi="Consolas"/>
+        </w:rPr>
+        <w:t>    background: linear-</w:t>
+      </w:r>
+      <w:proofErr w:type="gramStart"/>
+      <w:r>
+        <w:rPr>
+          <w:rFonts w:ascii="Consolas" w:hAnsi="Consolas"/>
+        </w:rPr>
+        <w:t>gradient(white, #</w:t>
+      </w:r>
+      <w:proofErr w:type="gramEnd"/>
+      <w:r>
+        <w:rPr>
+          <w:rFonts w:ascii="Consolas" w:hAnsi="Consolas"/>
+        </w:rPr>
+        <w:t>f9d395</w:t>
+      </w:r>
+      <w:proofErr w:type="gramStart"/>
+      <w:r>
+        <w:rPr>
+          <w:rFonts w:ascii="Consolas" w:hAnsi="Consolas"/>
+        </w:rPr>
+        <w:t>);</w:t>
+      </w:r>
+      <w:proofErr w:type="gramEnd"/>
+    </w:p>
+    <w:p>
+      <w:pPr>
+        <w:pBdr>
+          <w:top w:val="single" w:sz="4" w:space="1" w:color="auto"/>
+          <w:left w:val="single" w:sz="4" w:space="1" w:color="auto"/>
+          <w:bottom w:val="single" w:sz="4" w:space="1" w:color="auto"/>
+          <w:right w:val="single" w:sz="4" w:space="1" w:color="auto"/>
+        </w:pBdr>
+        <w:rPr>
+          <w:rFonts w:ascii="Consolas" w:hAnsi="Consolas"/>
+        </w:rPr>
+      </w:pPr>
+      <w:r>
+        <w:rPr>
+          <w:rFonts w:ascii="Consolas" w:hAnsi="Consolas"/>
+        </w:rPr>
+        <w:t>}</w:t>
+      </w:r>
+    </w:p>
+    <w:p>
+      <w:pPr>
+        <w:pBdr>
+          <w:top w:val="single" w:sz="4" w:space="1" w:color="auto"/>
+          <w:left w:val="single" w:sz="4" w:space="1" w:color="auto"/>
+          <w:bottom w:val="single" w:sz="4" w:space="1" w:color="auto"/>
+          <w:right w:val="single" w:sz="4" w:space="1" w:color="auto"/>
+        </w:pBdr>
+        <w:rPr>
+          <w:rFonts w:ascii="Consolas" w:hAnsi="Consolas"/>
+        </w:rPr>
+      </w:pPr>
+    </w:p>
+    <w:p>
+      <w:pPr>
+        <w:pBdr>
+          <w:top w:val="single" w:sz="4" w:space="1" w:color="auto"/>
+          <w:left w:val="single" w:sz="4" w:space="1" w:color="auto"/>
+          <w:bottom w:val="single" w:sz="4" w:space="1" w:color="auto"/>
+          <w:right w:val="single" w:sz="4" w:space="1" w:color="auto"/>
+        </w:pBdr>
+        <w:rPr>
+          <w:rFonts w:ascii="Consolas" w:hAnsi="Consolas"/>
+        </w:rPr>
+      </w:pPr>
+      <w:r>
+        <w:rPr>
+          <w:rFonts w:ascii="Consolas" w:hAnsi="Consolas"/>
+        </w:rPr>
+        <w:t>.container {</w:t>
+      </w:r>
+    </w:p>
+    <w:p>
+      <w:pPr>
+        <w:pBdr>
+          <w:top w:val="single" w:sz="4" w:space="1" w:color="auto"/>
+          <w:left w:val="single" w:sz="4" w:space="1" w:color="auto"/>
+          <w:bottom w:val="single" w:sz="4" w:space="1" w:color="auto"/>
+          <w:right w:val="single" w:sz="4" w:space="1" w:color="auto"/>
+        </w:pBdr>
+        <w:rPr>
+          <w:rFonts w:ascii="Consolas" w:hAnsi="Consolas"/>
+        </w:rPr>
+      </w:pPr>
+      <w:r>
+        <w:rPr>
+          <w:rFonts w:ascii="Consolas" w:hAnsi="Consolas"/>
+        </w:rPr>
+        <w:t xml:space="preserve">    background-color: </w:t>
+      </w:r>
+      <w:proofErr w:type="gramStart"/>
+      <w:r>
+        <w:rPr>
+          <w:rFonts w:ascii="Consolas" w:hAnsi="Consolas"/>
+        </w:rPr>
+        <w:t>white;</w:t>
+      </w:r>
+      <w:proofErr w:type="gramEnd"/>
+    </w:p>
+    <w:p>
+      <w:pPr>
+        <w:pBdr>
+          <w:top w:val="single" w:sz="4" w:space="1" w:color="auto"/>
+          <w:left w:val="single" w:sz="4" w:space="1" w:color="auto"/>
+          <w:bottom w:val="single" w:sz="4" w:space="1" w:color="auto"/>
+          <w:right w:val="single" w:sz="4" w:space="1" w:color="auto"/>
+        </w:pBdr>
+        <w:rPr>
+          <w:rFonts w:ascii="Consolas" w:hAnsi="Consolas"/>
+        </w:rPr>
+      </w:pPr>
+      <w:r>
+        <w:rPr>
+          <w:rFonts w:ascii="Consolas" w:hAnsi="Consolas"/>
+        </w:rPr>
+        <w:t xml:space="preserve">    border: 2px solid </w:t>
+      </w:r>
+      <w:proofErr w:type="gramStart"/>
+      <w:r>
+        <w:rPr>
+          <w:rFonts w:ascii="Consolas" w:hAnsi="Consolas"/>
+        </w:rPr>
+        <w:t>black;</w:t>
+      </w:r>
+      <w:proofErr w:type="gramEnd"/>
+    </w:p>
+    <w:p>
+      <w:pPr>
+        <w:pBdr>
+          <w:top w:val="single" w:sz="4" w:space="1" w:color="auto"/>
+          <w:left w:val="single" w:sz="4" w:space="1" w:color="auto"/>
+          <w:bottom w:val="single" w:sz="4" w:space="1" w:color="auto"/>
+          <w:right w:val="single" w:sz="4" w:space="1" w:color="auto"/>
+        </w:pBdr>
+        <w:rPr>
+          <w:rFonts w:ascii="Consolas" w:hAnsi="Consolas"/>
+        </w:rPr>
+      </w:pPr>
+      <w:r>
+        <w:rPr>
+          <w:rFonts w:ascii="Consolas" w:hAnsi="Consolas"/>
+        </w:rPr>
+        <w:t xml:space="preserve">    </w:t>
+      </w:r>
+    </w:p>
+    <w:p>
+      <w:pPr>
+        <w:pBdr>
+          <w:top w:val="single" w:sz="4" w:space="1" w:color="auto"/>
+          <w:left w:val="single" w:sz="4" w:space="1" w:color="auto"/>
+          <w:bottom w:val="single" w:sz="4" w:space="1" w:color="auto"/>
+          <w:right w:val="single" w:sz="4" w:space="1" w:color="auto"/>
+        </w:pBdr>
+        <w:rPr>
+          <w:rFonts w:ascii="Consolas" w:hAnsi="Consolas"/>
+        </w:rPr>
+      </w:pPr>
+      <w:r>
+        <w:rPr>
+          <w:rFonts w:ascii="Consolas" w:hAnsi="Consolas"/>
+        </w:rPr>
+        <w:t>    margin: 0.</w:t>
+      </w:r>
+      <w:proofErr w:type="gramStart"/>
+      <w:r>
+        <w:rPr>
+          <w:rFonts w:ascii="Consolas" w:hAnsi="Consolas"/>
+        </w:rPr>
+        <w:t>5em;</w:t>
+      </w:r>
+      <w:proofErr w:type="gramEnd"/>
+    </w:p>
+    <w:p>
+      <w:pPr>
+        <w:pBdr>
+          <w:top w:val="single" w:sz="4" w:space="1" w:color="auto"/>
+          <w:left w:val="single" w:sz="4" w:space="1" w:color="auto"/>
+          <w:bottom w:val="single" w:sz="4" w:space="1" w:color="auto"/>
+          <w:right w:val="single" w:sz="4" w:space="1" w:color="auto"/>
+        </w:pBdr>
+        <w:rPr>
+          <w:rFonts w:ascii="Consolas" w:hAnsi="Consolas"/>
+        </w:rPr>
+      </w:pPr>
+      <w:r>
+        <w:rPr>
+          <w:rFonts w:ascii="Consolas" w:hAnsi="Consolas"/>
+        </w:rPr>
+        <w:t xml:space="preserve">    height: </w:t>
+      </w:r>
+      <w:proofErr w:type="gramStart"/>
+      <w:r>
+        <w:rPr>
+          <w:rFonts w:ascii="Consolas" w:hAnsi="Consolas"/>
+        </w:rPr>
+        <w:t>100%;</w:t>
+      </w:r>
+      <w:proofErr w:type="gramEnd"/>
+    </w:p>
+    <w:p>
+      <w:pPr>
+        <w:pBdr>
+          <w:top w:val="single" w:sz="4" w:space="1" w:color="auto"/>
+          <w:left w:val="single" w:sz="4" w:space="1" w:color="auto"/>
+          <w:bottom w:val="single" w:sz="4" w:space="1" w:color="auto"/>
+          <w:right w:val="single" w:sz="4" w:space="1" w:color="auto"/>
+        </w:pBdr>
+        <w:rPr>
+          <w:rFonts w:ascii="Consolas" w:hAnsi="Consolas"/>
+        </w:rPr>
+      </w:pPr>
+    </w:p>
+    <w:p>
+      <w:pPr>
+        <w:pBdr>
+          <w:top w:val="single" w:sz="4" w:space="1" w:color="auto"/>
+          <w:left w:val="single" w:sz="4" w:space="1" w:color="auto"/>
+          <w:bottom w:val="single" w:sz="4" w:space="1" w:color="auto"/>
+          <w:right w:val="single" w:sz="4" w:space="1" w:color="auto"/>
+        </w:pBdr>
+        <w:rPr>
+          <w:rFonts w:ascii="Consolas" w:hAnsi="Consolas"/>
+        </w:rPr>
+      </w:pPr>
+      <w:r>
+        <w:rPr>
+          <w:rFonts w:ascii="Consolas" w:hAnsi="Consolas"/>
+        </w:rPr>
+        <w:t xml:space="preserve">    display: </w:t>
+      </w:r>
+      <w:proofErr w:type="gramStart"/>
+      <w:r>
+        <w:rPr>
+          <w:rFonts w:ascii="Consolas" w:hAnsi="Consolas"/>
+        </w:rPr>
+        <w:t>flex;</w:t>
+      </w:r>
+      <w:proofErr w:type="gramEnd"/>
+    </w:p>
+    <w:p>
+      <w:pPr>
+        <w:pBdr>
+          <w:top w:val="single" w:sz="4" w:space="1" w:color="auto"/>
+          <w:left w:val="single" w:sz="4" w:space="1" w:color="auto"/>
+          <w:bottom w:val="single" w:sz="4" w:space="1" w:color="auto"/>
+          <w:right w:val="single" w:sz="4" w:space="1" w:color="auto"/>
+        </w:pBdr>
+        <w:rPr>
+          <w:rFonts w:ascii="Consolas" w:hAnsi="Consolas"/>
+        </w:rPr>
+      </w:pPr>
+      <w:r>
+        <w:rPr>
+          <w:rFonts w:ascii="Consolas" w:hAnsi="Consolas"/>
+        </w:rPr>
+        <w:t xml:space="preserve">    flex-direction: </w:t>
+      </w:r>
+      <w:proofErr w:type="gramStart"/>
+      <w:r>
+        <w:rPr>
+          <w:rFonts w:ascii="Consolas" w:hAnsi="Consolas"/>
+        </w:rPr>
+        <w:t>column;</w:t>
+      </w:r>
+      <w:proofErr w:type="gramEnd"/>
+    </w:p>
+    <w:p>
+      <w:pPr>
+        <w:pBdr>
+          <w:top w:val="single" w:sz="4" w:space="1" w:color="auto"/>
+          <w:left w:val="single" w:sz="4" w:space="1" w:color="auto"/>
+          <w:bottom w:val="single" w:sz="4" w:space="1" w:color="auto"/>
+          <w:right w:val="single" w:sz="4" w:space="1" w:color="auto"/>
+        </w:pBdr>
+        <w:rPr>
+          <w:rFonts w:ascii="Consolas" w:hAnsi="Consolas"/>
+        </w:rPr>
+      </w:pPr>
+      <w:r>
+        <w:rPr>
+          <w:rFonts w:ascii="Consolas" w:hAnsi="Consolas"/>
+        </w:rPr>
+        <w:t>}</w:t>
+      </w:r>
+    </w:p>
+    <w:p>
+      <w:pPr>
+        <w:pBdr>
+          <w:top w:val="single" w:sz="4" w:space="1" w:color="auto"/>
+          <w:left w:val="single" w:sz="4" w:space="1" w:color="auto"/>
+          <w:bottom w:val="single" w:sz="4" w:space="1" w:color="auto"/>
+          <w:right w:val="single" w:sz="4" w:space="1" w:color="auto"/>
+        </w:pBdr>
+        <w:rPr>
+          <w:rFonts w:ascii="Consolas" w:hAnsi="Consolas"/>
+        </w:rPr>
+      </w:pPr>
+    </w:p>
+    <w:p>
+      <w:pPr>
+        <w:pBdr>
+          <w:top w:val="single" w:sz="4" w:space="1" w:color="auto"/>
+          <w:left w:val="single" w:sz="4" w:space="1" w:color="auto"/>
+          <w:bottom w:val="single" w:sz="4" w:space="1" w:color="auto"/>
+          <w:right w:val="single" w:sz="4" w:space="1" w:color="auto"/>
+        </w:pBdr>
+        <w:rPr>
+          <w:rFonts w:ascii="Consolas" w:hAnsi="Consolas"/>
+        </w:rPr>
+      </w:pPr>
+      <w:r>
+        <w:rPr>
+          <w:rFonts w:ascii="Consolas" w:hAnsi="Consolas"/>
+        </w:rPr>
+        <w:t xml:space="preserve">.container </w:t>
+      </w:r>
+      <w:proofErr w:type="gramStart"/>
+      <w:r>
+        <w:rPr>
+          <w:rFonts w:ascii="Consolas" w:hAnsi="Consolas"/>
+        </w:rPr>
+        <w:t>&gt; * {</w:t>
+      </w:r>
+      <w:proofErr w:type="gramEnd"/>
+    </w:p>
+    <w:p>
+      <w:pPr>
+        <w:pBdr>
+          <w:top w:val="single" w:sz="4" w:space="1" w:color="auto"/>
+          <w:left w:val="single" w:sz="4" w:space="1" w:color="auto"/>
+          <w:bottom w:val="single" w:sz="4" w:space="1" w:color="auto"/>
+          <w:right w:val="single" w:sz="4" w:space="1" w:color="auto"/>
+        </w:pBdr>
+        <w:rPr>
+          <w:rFonts w:ascii="Consolas" w:hAnsi="Consolas"/>
+        </w:rPr>
+      </w:pPr>
+      <w:r>
+        <w:rPr>
+          <w:rFonts w:ascii="Consolas" w:hAnsi="Consolas"/>
+        </w:rPr>
+        <w:t xml:space="preserve">    padding: </w:t>
+      </w:r>
+      <w:proofErr w:type="gramStart"/>
+      <w:r>
+        <w:rPr>
+          <w:rFonts w:ascii="Consolas" w:hAnsi="Consolas"/>
+        </w:rPr>
+        <w:t>1em;</w:t>
+      </w:r>
+      <w:proofErr w:type="gramEnd"/>
+    </w:p>
+    <w:p>
+      <w:pPr>
+        <w:pBdr>
+          <w:top w:val="single" w:sz="4" w:space="1" w:color="auto"/>
+          <w:left w:val="single" w:sz="4" w:space="1" w:color="auto"/>
+          <w:bottom w:val="single" w:sz="4" w:space="1" w:color="auto"/>
+          <w:right w:val="single" w:sz="4" w:space="1" w:color="auto"/>
+        </w:pBdr>
+        <w:rPr>
+          <w:rFonts w:ascii="Consolas" w:hAnsi="Consolas"/>
+        </w:rPr>
+      </w:pPr>
+      <w:r>
+        <w:rPr>
+          <w:rFonts w:ascii="Consolas" w:hAnsi="Consolas"/>
+        </w:rPr>
+        <w:t>}</w:t>
+      </w:r>
+    </w:p>
+    <w:p>
+      <w:pPr>
+        <w:pBdr>
+          <w:top w:val="single" w:sz="4" w:space="1" w:color="auto"/>
+          <w:left w:val="single" w:sz="4" w:space="1" w:color="auto"/>
+          <w:bottom w:val="single" w:sz="4" w:space="1" w:color="auto"/>
+          <w:right w:val="single" w:sz="4" w:space="1" w:color="auto"/>
+        </w:pBdr>
+        <w:rPr>
+          <w:rFonts w:ascii="Consolas" w:hAnsi="Consolas"/>
+        </w:rPr>
+      </w:pPr>
+    </w:p>
+    <w:p>
+      <w:pPr>
+        <w:pBdr>
+          <w:top w:val="single" w:sz="4" w:space="1" w:color="auto"/>
+          <w:left w:val="single" w:sz="4" w:space="1" w:color="auto"/>
+          <w:bottom w:val="single" w:sz="4" w:space="1" w:color="auto"/>
+          <w:right w:val="single" w:sz="4" w:space="1" w:color="auto"/>
+        </w:pBdr>
+        <w:rPr>
+          <w:rFonts w:ascii="Consolas" w:hAnsi="Consolas"/>
+        </w:rPr>
+      </w:pPr>
+      <w:r>
+        <w:rPr>
+          <w:rFonts w:ascii="Consolas" w:hAnsi="Consolas"/>
+        </w:rPr>
+        <w:t>.container header {</w:t>
+      </w:r>
+    </w:p>
+    <w:p>
+      <w:pPr>
+        <w:pBdr>
+          <w:top w:val="single" w:sz="4" w:space="1" w:color="auto"/>
+          <w:left w:val="single" w:sz="4" w:space="1" w:color="auto"/>
+          <w:bottom w:val="single" w:sz="4" w:space="1" w:color="auto"/>
+          <w:right w:val="single" w:sz="4" w:space="1" w:color="auto"/>
+        </w:pBdr>
+        <w:rPr>
+          <w:rFonts w:ascii="Consolas" w:hAnsi="Consolas"/>
+        </w:rPr>
+      </w:pPr>
+      <w:r>
+        <w:rPr>
+          <w:rFonts w:ascii="Consolas" w:hAnsi="Consolas"/>
+        </w:rPr>
+        <w:t>    border-bottom: 3px solid #</w:t>
+      </w:r>
+      <w:proofErr w:type="gramStart"/>
+      <w:r>
+        <w:rPr>
+          <w:rFonts w:ascii="Consolas" w:hAnsi="Consolas"/>
+        </w:rPr>
+        <w:t>cbc494;</w:t>
+      </w:r>
+      <w:proofErr w:type="gramEnd"/>
+    </w:p>
+    <w:p>
+      <w:pPr>
+        <w:pBdr>
+          <w:top w:val="single" w:sz="4" w:space="1" w:color="auto"/>
+          <w:left w:val="single" w:sz="4" w:space="1" w:color="auto"/>
+          <w:bottom w:val="single" w:sz="4" w:space="1" w:color="auto"/>
+          <w:right w:val="single" w:sz="4" w:space="1" w:color="auto"/>
+        </w:pBdr>
+        <w:rPr>
+          <w:rFonts w:ascii="Consolas" w:hAnsi="Consolas"/>
+        </w:rPr>
+      </w:pPr>
+      <w:r>
+        <w:rPr>
+          <w:rFonts w:ascii="Consolas" w:hAnsi="Consolas"/>
+        </w:rPr>
+        <w:t>}</w:t>
+      </w:r>
+    </w:p>
+    <w:p>
+      <w:pPr>
+        <w:pBdr>
+          <w:top w:val="single" w:sz="4" w:space="1" w:color="auto"/>
+          <w:left w:val="single" w:sz="4" w:space="1" w:color="auto"/>
+          <w:bottom w:val="single" w:sz="4" w:space="1" w:color="auto"/>
+          <w:right w:val="single" w:sz="4" w:space="1" w:color="auto"/>
+        </w:pBdr>
+        <w:rPr>
+          <w:rFonts w:ascii="Consolas" w:hAnsi="Consolas"/>
+        </w:rPr>
+      </w:pPr>
+    </w:p>
+    <w:p>
+      <w:pPr>
+        <w:pBdr>
+          <w:top w:val="single" w:sz="4" w:space="1" w:color="auto"/>
+          <w:left w:val="single" w:sz="4" w:space="1" w:color="auto"/>
+          <w:bottom w:val="single" w:sz="4" w:space="1" w:color="auto"/>
+          <w:right w:val="single" w:sz="4" w:space="1" w:color="auto"/>
+        </w:pBdr>
+        <w:rPr>
+          <w:rFonts w:ascii="Consolas" w:hAnsi="Consolas"/>
+        </w:rPr>
+      </w:pPr>
+      <w:r>
+        <w:rPr>
+          <w:rFonts w:ascii="Consolas" w:hAnsi="Consolas"/>
+        </w:rPr>
+        <w:t xml:space="preserve">.container header </w:t>
+      </w:r>
+      <w:proofErr w:type="spellStart"/>
+      <w:r>
+        <w:rPr>
+          <w:rFonts w:ascii="Consolas" w:hAnsi="Consolas"/>
+        </w:rPr>
+        <w:t>img</w:t>
+      </w:r>
+      <w:proofErr w:type="spellEnd"/>
+      <w:r>
+        <w:rPr>
+          <w:rFonts w:ascii="Consolas" w:hAnsi="Consolas"/>
+        </w:rPr>
+        <w:t xml:space="preserve"> {</w:t>
+      </w:r>
+    </w:p>
+    <w:p>
+      <w:pPr>
+        <w:pBdr>
+          <w:top w:val="single" w:sz="4" w:space="1" w:color="auto"/>
+          <w:left w:val="single" w:sz="4" w:space="1" w:color="auto"/>
+          <w:bottom w:val="single" w:sz="4" w:space="1" w:color="auto"/>
+          <w:right w:val="single" w:sz="4" w:space="1" w:color="auto"/>
+        </w:pBdr>
+        <w:rPr>
+          <w:rFonts w:ascii="Consolas" w:hAnsi="Consolas"/>
+        </w:rPr>
+      </w:pPr>
+      <w:r>
+        <w:rPr>
+          <w:rFonts w:ascii="Consolas" w:hAnsi="Consolas"/>
+        </w:rPr>
+        <w:t xml:space="preserve">    float: </w:t>
+      </w:r>
+      <w:proofErr w:type="gramStart"/>
+      <w:r>
+        <w:rPr>
+          <w:rFonts w:ascii="Consolas" w:hAnsi="Consolas"/>
+        </w:rPr>
+        <w:t>left;</w:t>
+      </w:r>
+      <w:proofErr w:type="gramEnd"/>
+    </w:p>
+    <w:p>
+      <w:pPr>
+        <w:pBdr>
+          <w:top w:val="single" w:sz="4" w:space="1" w:color="auto"/>
+          <w:left w:val="single" w:sz="4" w:space="1" w:color="auto"/>
+          <w:bottom w:val="single" w:sz="4" w:space="1" w:color="auto"/>
+          <w:right w:val="single" w:sz="4" w:space="1" w:color="auto"/>
+        </w:pBdr>
+        <w:rPr>
+          <w:rFonts w:ascii="Consolas" w:hAnsi="Consolas"/>
+        </w:rPr>
+      </w:pPr>
+      <w:r>
+        <w:rPr>
+          <w:rFonts w:ascii="Consolas" w:hAnsi="Consolas"/>
+        </w:rPr>
+        <w:t xml:space="preserve">    width: </w:t>
+      </w:r>
+      <w:proofErr w:type="gramStart"/>
+      <w:r>
+        <w:rPr>
+          <w:rFonts w:ascii="Consolas" w:hAnsi="Consolas"/>
+        </w:rPr>
+        <w:t>80px;</w:t>
+      </w:r>
+      <w:proofErr w:type="gramEnd"/>
+    </w:p>
+    <w:p>
+      <w:pPr>
+        <w:pBdr>
+          <w:top w:val="single" w:sz="4" w:space="1" w:color="auto"/>
+          <w:left w:val="single" w:sz="4" w:space="1" w:color="auto"/>
+          <w:bottom w:val="single" w:sz="4" w:space="1" w:color="auto"/>
+          <w:right w:val="single" w:sz="4" w:space="1" w:color="auto"/>
+        </w:pBdr>
+        <w:rPr>
+          <w:rFonts w:ascii="Consolas" w:hAnsi="Consolas"/>
+        </w:rPr>
+      </w:pPr>
+      <w:r>
+        <w:rPr>
+          <w:rFonts w:ascii="Consolas" w:hAnsi="Consolas"/>
+        </w:rPr>
+        <w:t>}</w:t>
+      </w:r>
+    </w:p>
+    <w:p>
+      <w:pPr>
+        <w:pBdr>
+          <w:top w:val="single" w:sz="4" w:space="1" w:color="auto"/>
+          <w:left w:val="single" w:sz="4" w:space="1" w:color="auto"/>
+          <w:bottom w:val="single" w:sz="4" w:space="1" w:color="auto"/>
+          <w:right w:val="single" w:sz="4" w:space="1" w:color="auto"/>
+        </w:pBdr>
+        <w:rPr>
+          <w:rFonts w:ascii="Consolas" w:hAnsi="Consolas"/>
+        </w:rPr>
+      </w:pPr>
+    </w:p>
+    <w:p>
+      <w:pPr>
+        <w:pBdr>
+          <w:top w:val="single" w:sz="4" w:space="1" w:color="auto"/>
+          <w:left w:val="single" w:sz="4" w:space="1" w:color="auto"/>
+          <w:bottom w:val="single" w:sz="4" w:space="1" w:color="auto"/>
+          <w:right w:val="single" w:sz="4" w:space="1" w:color="auto"/>
+        </w:pBdr>
+        <w:rPr>
+          <w:rFonts w:ascii="Consolas" w:hAnsi="Consolas"/>
+        </w:rPr>
+      </w:pPr>
+      <w:proofErr w:type="gramStart"/>
+      <w:r>
+        <w:rPr>
+          <w:rFonts w:ascii="Consolas" w:hAnsi="Consolas"/>
+        </w:rPr>
+        <w:t>.title</w:t>
+      </w:r>
+      <w:proofErr w:type="gramEnd"/>
+      <w:r>
+        <w:rPr>
+          <w:rFonts w:ascii="Consolas" w:hAnsi="Consolas"/>
+        </w:rPr>
+        <w:t xml:space="preserve"> {</w:t>
+      </w:r>
+    </w:p>
+    <w:p>
+      <w:pPr>
+        <w:pBdr>
+          <w:top w:val="single" w:sz="4" w:space="1" w:color="auto"/>
+          <w:left w:val="single" w:sz="4" w:space="1" w:color="auto"/>
+          <w:bottom w:val="single" w:sz="4" w:space="1" w:color="auto"/>
+          <w:right w:val="single" w:sz="4" w:space="1" w:color="auto"/>
+        </w:pBdr>
+        <w:rPr>
+          <w:rFonts w:ascii="Consolas" w:hAnsi="Consolas"/>
+        </w:rPr>
+      </w:pPr>
+      <w:r>
+        <w:rPr>
+          <w:rFonts w:ascii="Consolas" w:hAnsi="Consolas"/>
+        </w:rPr>
+        <w:t xml:space="preserve">    margin-left: </w:t>
+      </w:r>
+      <w:proofErr w:type="gramStart"/>
+      <w:r>
+        <w:rPr>
+          <w:rFonts w:ascii="Consolas" w:hAnsi="Consolas"/>
+        </w:rPr>
+        <w:t>6em;</w:t>
+      </w:r>
+      <w:proofErr w:type="gramEnd"/>
+    </w:p>
+    <w:p>
+      <w:pPr>
+        <w:pBdr>
+          <w:top w:val="single" w:sz="4" w:space="1" w:color="auto"/>
+          <w:left w:val="single" w:sz="4" w:space="1" w:color="auto"/>
+          <w:bottom w:val="single" w:sz="4" w:space="1" w:color="auto"/>
+          <w:right w:val="single" w:sz="4" w:space="1" w:color="auto"/>
+        </w:pBdr>
+        <w:rPr>
+          <w:rFonts w:ascii="Consolas" w:hAnsi="Consolas"/>
+        </w:rPr>
+      </w:pPr>
+      <w:r>
+        <w:rPr>
+          <w:rFonts w:ascii="Consolas" w:hAnsi="Consolas"/>
+        </w:rPr>
+        <w:t>}</w:t>
+      </w:r>
+    </w:p>
+    <w:p>
+      <w:pPr>
+        <w:pBdr>
+          <w:top w:val="single" w:sz="4" w:space="1" w:color="auto"/>
+          <w:left w:val="single" w:sz="4" w:space="1" w:color="auto"/>
+          <w:bottom w:val="single" w:sz="4" w:space="1" w:color="auto"/>
+          <w:right w:val="single" w:sz="4" w:space="1" w:color="auto"/>
+        </w:pBdr>
+        <w:rPr>
+          <w:rFonts w:ascii="Consolas" w:hAnsi="Consolas"/>
+        </w:rPr>
+      </w:pPr>
+    </w:p>
+    <w:p>
+      <w:pPr>
+        <w:pBdr>
+          <w:top w:val="single" w:sz="4" w:space="1" w:color="auto"/>
+          <w:left w:val="single" w:sz="4" w:space="1" w:color="auto"/>
+          <w:bottom w:val="single" w:sz="4" w:space="1" w:color="auto"/>
+          <w:right w:val="single" w:sz="4" w:space="1" w:color="auto"/>
+        </w:pBdr>
+        <w:rPr>
+          <w:rFonts w:ascii="Consolas" w:hAnsi="Consolas"/>
+        </w:rPr>
+      </w:pPr>
+      <w:proofErr w:type="gramStart"/>
+      <w:r>
+        <w:rPr>
+          <w:rFonts w:ascii="Consolas" w:hAnsi="Consolas"/>
+        </w:rPr>
+        <w:t>.title</w:t>
+      </w:r>
+      <w:proofErr w:type="gramEnd"/>
+      <w:r>
+        <w:rPr>
+          <w:rFonts w:ascii="Consolas" w:hAnsi="Consolas"/>
+        </w:rPr>
+        <w:t xml:space="preserve"> h1 {</w:t>
+      </w:r>
+    </w:p>
+    <w:p>
+      <w:pPr>
+        <w:pBdr>
+          <w:top w:val="single" w:sz="4" w:space="1" w:color="auto"/>
+          <w:left w:val="single" w:sz="4" w:space="1" w:color="auto"/>
+          <w:bottom w:val="single" w:sz="4" w:space="1" w:color="auto"/>
+          <w:right w:val="single" w:sz="4" w:space="1" w:color="auto"/>
+        </w:pBdr>
+        <w:rPr>
+          <w:rFonts w:ascii="Consolas" w:hAnsi="Consolas"/>
+        </w:rPr>
+      </w:pPr>
+      <w:r>
+        <w:rPr>
+          <w:rFonts w:ascii="Consolas" w:hAnsi="Consolas"/>
+        </w:rPr>
+        <w:t xml:space="preserve">    margin: 0.25em </w:t>
+      </w:r>
+      <w:proofErr w:type="gramStart"/>
+      <w:r>
+        <w:rPr>
+          <w:rFonts w:ascii="Consolas" w:hAnsi="Consolas"/>
+        </w:rPr>
+        <w:t>0;</w:t>
+      </w:r>
+      <w:proofErr w:type="gramEnd"/>
+    </w:p>
+    <w:p>
+      <w:pPr>
+        <w:pBdr>
+          <w:top w:val="single" w:sz="4" w:space="1" w:color="auto"/>
+          <w:left w:val="single" w:sz="4" w:space="1" w:color="auto"/>
+          <w:bottom w:val="single" w:sz="4" w:space="1" w:color="auto"/>
+          <w:right w:val="single" w:sz="4" w:space="1" w:color="auto"/>
+        </w:pBdr>
+        <w:rPr>
+          <w:rFonts w:ascii="Consolas" w:hAnsi="Consolas"/>
+        </w:rPr>
+      </w:pPr>
+    </w:p>
+    <w:p>
+      <w:pPr>
+        <w:pBdr>
+          <w:top w:val="single" w:sz="4" w:space="1" w:color="auto"/>
+          <w:left w:val="single" w:sz="4" w:space="1" w:color="auto"/>
+          <w:bottom w:val="single" w:sz="4" w:space="1" w:color="auto"/>
+          <w:right w:val="single" w:sz="4" w:space="1" w:color="auto"/>
+        </w:pBdr>
+        <w:rPr>
+          <w:rFonts w:ascii="Consolas" w:hAnsi="Consolas"/>
+        </w:rPr>
+      </w:pPr>
+      <w:r>
+        <w:rPr>
+          <w:rFonts w:ascii="Consolas" w:hAnsi="Consolas"/>
+        </w:rPr>
+        <w:t>    color: #</w:t>
+      </w:r>
+      <w:proofErr w:type="gramStart"/>
+      <w:r>
+        <w:rPr>
+          <w:rFonts w:ascii="Consolas" w:hAnsi="Consolas"/>
+        </w:rPr>
+        <w:t>f49d30;</w:t>
+      </w:r>
+      <w:proofErr w:type="gramEnd"/>
+    </w:p>
+    <w:p>
+      <w:pPr>
+        <w:pBdr>
+          <w:top w:val="single" w:sz="4" w:space="1" w:color="auto"/>
+          <w:left w:val="single" w:sz="4" w:space="1" w:color="auto"/>
+          <w:bottom w:val="single" w:sz="4" w:space="1" w:color="auto"/>
+          <w:right w:val="single" w:sz="4" w:space="1" w:color="auto"/>
+        </w:pBdr>
+        <w:rPr>
+          <w:rFonts w:ascii="Consolas" w:hAnsi="Consolas"/>
+        </w:rPr>
+      </w:pPr>
+      <w:r>
+        <w:rPr>
+          <w:rFonts w:ascii="Consolas" w:hAnsi="Consolas"/>
+        </w:rPr>
+        <w:t xml:space="preserve">    text-shadow: 3px </w:t>
+      </w:r>
+      <w:proofErr w:type="spellStart"/>
+      <w:r>
+        <w:rPr>
+          <w:rFonts w:ascii="Consolas" w:hAnsi="Consolas"/>
+        </w:rPr>
+        <w:t>3px</w:t>
+      </w:r>
+      <w:proofErr w:type="spellEnd"/>
+      <w:r>
+        <w:rPr>
+          <w:rFonts w:ascii="Consolas" w:hAnsi="Consolas"/>
+        </w:rPr>
+        <w:t xml:space="preserve"> 1px </w:t>
+      </w:r>
+      <w:proofErr w:type="gramStart"/>
+      <w:r>
+        <w:rPr>
+          <w:rFonts w:ascii="Consolas" w:hAnsi="Consolas"/>
+        </w:rPr>
+        <w:t>black;</w:t>
+      </w:r>
+      <w:proofErr w:type="gramEnd"/>
+    </w:p>
+    <w:p>
+      <w:pPr>
+        <w:pBdr>
+          <w:top w:val="single" w:sz="4" w:space="1" w:color="auto"/>
+          <w:left w:val="single" w:sz="4" w:space="1" w:color="auto"/>
+          <w:bottom w:val="single" w:sz="4" w:space="1" w:color="auto"/>
+          <w:right w:val="single" w:sz="4" w:space="1" w:color="auto"/>
+        </w:pBdr>
+        <w:rPr>
+          <w:rFonts w:ascii="Consolas" w:hAnsi="Consolas"/>
+        </w:rPr>
+      </w:pPr>
+      <w:r>
+        <w:rPr>
+          <w:rFonts w:ascii="Consolas" w:hAnsi="Consolas"/>
+        </w:rPr>
+        <w:t>}</w:t>
+      </w:r>
+    </w:p>
+    <w:p>
+      <w:pPr>
+        <w:pBdr>
+          <w:top w:val="single" w:sz="4" w:space="1" w:color="auto"/>
+          <w:left w:val="single" w:sz="4" w:space="1" w:color="auto"/>
+          <w:bottom w:val="single" w:sz="4" w:space="1" w:color="auto"/>
+          <w:right w:val="single" w:sz="4" w:space="1" w:color="auto"/>
+        </w:pBdr>
+        <w:rPr>
+          <w:rFonts w:ascii="Consolas" w:hAnsi="Consolas"/>
+        </w:rPr>
+      </w:pPr>
+    </w:p>
+    <w:p>
+      <w:pPr>
+        <w:pBdr>
+          <w:top w:val="single" w:sz="4" w:space="1" w:color="auto"/>
+          <w:left w:val="single" w:sz="4" w:space="1" w:color="auto"/>
+          <w:bottom w:val="single" w:sz="4" w:space="1" w:color="auto"/>
+          <w:right w:val="single" w:sz="4" w:space="1" w:color="auto"/>
+        </w:pBdr>
+        <w:rPr>
+          <w:rFonts w:ascii="Consolas" w:hAnsi="Consolas"/>
+        </w:rPr>
+      </w:pPr>
+      <w:proofErr w:type="gramStart"/>
+      <w:r>
+        <w:rPr>
+          <w:rFonts w:ascii="Consolas" w:hAnsi="Consolas"/>
+        </w:rPr>
+        <w:t>.subtitles</w:t>
+      </w:r>
+      <w:proofErr w:type="gramEnd"/>
+      <w:r>
+        <w:rPr>
+          <w:rFonts w:ascii="Consolas" w:hAnsi="Consolas"/>
+        </w:rPr>
+        <w:t xml:space="preserve"> {</w:t>
+      </w:r>
+    </w:p>
+    <w:p>
+      <w:pPr>
+        <w:pBdr>
+          <w:top w:val="single" w:sz="4" w:space="1" w:color="auto"/>
+          <w:left w:val="single" w:sz="4" w:space="1" w:color="auto"/>
+          <w:bottom w:val="single" w:sz="4" w:space="1" w:color="auto"/>
+          <w:right w:val="single" w:sz="4" w:space="1" w:color="auto"/>
+        </w:pBdr>
+        <w:rPr>
+          <w:rFonts w:ascii="Consolas" w:hAnsi="Consolas"/>
+        </w:rPr>
+      </w:pPr>
+      <w:r>
+        <w:rPr>
+          <w:rFonts w:ascii="Consolas" w:hAnsi="Consolas"/>
+        </w:rPr>
+        <w:t xml:space="preserve">    font-weight: </w:t>
+      </w:r>
+      <w:proofErr w:type="gramStart"/>
+      <w:r>
+        <w:rPr>
+          <w:rFonts w:ascii="Consolas" w:hAnsi="Consolas"/>
+        </w:rPr>
+        <w:t>bolder;</w:t>
+      </w:r>
+      <w:proofErr w:type="gramEnd"/>
+    </w:p>
+    <w:p>
+      <w:pPr>
+        <w:pBdr>
+          <w:top w:val="single" w:sz="4" w:space="1" w:color="auto"/>
+          <w:left w:val="single" w:sz="4" w:space="1" w:color="auto"/>
+          <w:bottom w:val="single" w:sz="4" w:space="1" w:color="auto"/>
+          <w:right w:val="single" w:sz="4" w:space="1" w:color="auto"/>
+        </w:pBdr>
+        <w:rPr>
+          <w:rFonts w:ascii="Consolas" w:hAnsi="Consolas"/>
+        </w:rPr>
+      </w:pPr>
+      <w:r>
+        <w:rPr>
+          <w:rFonts w:ascii="Consolas" w:hAnsi="Consolas"/>
+        </w:rPr>
+        <w:t xml:space="preserve">    font-style: </w:t>
+      </w:r>
+      <w:proofErr w:type="gramStart"/>
+      <w:r>
+        <w:rPr>
+          <w:rFonts w:ascii="Consolas" w:hAnsi="Consolas"/>
+        </w:rPr>
+        <w:t>italic;</w:t>
+      </w:r>
+      <w:proofErr w:type="gramEnd"/>
+    </w:p>
+    <w:p>
+      <w:pPr>
+        <w:pBdr>
+          <w:top w:val="single" w:sz="4" w:space="1" w:color="auto"/>
+          <w:left w:val="single" w:sz="4" w:space="1" w:color="auto"/>
+          <w:bottom w:val="single" w:sz="4" w:space="1" w:color="auto"/>
+          <w:right w:val="single" w:sz="4" w:space="1" w:color="auto"/>
+        </w:pBdr>
+        <w:rPr>
+          <w:rFonts w:ascii="Consolas" w:hAnsi="Consolas"/>
+        </w:rPr>
+      </w:pPr>
+      <w:r>
+        <w:rPr>
+          <w:rFonts w:ascii="Consolas" w:hAnsi="Consolas"/>
+        </w:rPr>
+        <w:t>    font-size: 1.</w:t>
+      </w:r>
+      <w:proofErr w:type="gramStart"/>
+      <w:r>
+        <w:rPr>
+          <w:rFonts w:ascii="Consolas" w:hAnsi="Consolas"/>
+        </w:rPr>
+        <w:t>25em;</w:t>
+      </w:r>
+      <w:proofErr w:type="gramEnd"/>
+    </w:p>
+    <w:p>
+      <w:pPr>
+        <w:pBdr>
+          <w:top w:val="single" w:sz="4" w:space="1" w:color="auto"/>
+          <w:left w:val="single" w:sz="4" w:space="1" w:color="auto"/>
+          <w:bottom w:val="single" w:sz="4" w:space="1" w:color="auto"/>
+          <w:right w:val="single" w:sz="4" w:space="1" w:color="auto"/>
+        </w:pBdr>
+        <w:rPr>
+          <w:rFonts w:ascii="Consolas" w:hAnsi="Consolas"/>
+        </w:rPr>
+      </w:pPr>
+      <w:r>
+        <w:rPr>
+          <w:rFonts w:ascii="Consolas" w:hAnsi="Consolas"/>
+        </w:rPr>
+        <w:t>}</w:t>
+      </w:r>
+    </w:p>
+    <w:p>
+      <w:pPr>
+        <w:pBdr>
+          <w:top w:val="single" w:sz="4" w:space="1" w:color="auto"/>
+          <w:left w:val="single" w:sz="4" w:space="1" w:color="auto"/>
+          <w:bottom w:val="single" w:sz="4" w:space="1" w:color="auto"/>
+          <w:right w:val="single" w:sz="4" w:space="1" w:color="auto"/>
+        </w:pBdr>
+        <w:rPr>
+          <w:rFonts w:ascii="Consolas" w:hAnsi="Consolas"/>
+        </w:rPr>
+      </w:pPr>
+    </w:p>
+    <w:p>
+      <w:pPr>
+        <w:pBdr>
+          <w:top w:val="single" w:sz="4" w:space="1" w:color="auto"/>
+          <w:left w:val="single" w:sz="4" w:space="1" w:color="auto"/>
+          <w:bottom w:val="single" w:sz="4" w:space="1" w:color="auto"/>
+          <w:right w:val="single" w:sz="4" w:space="1" w:color="auto"/>
+        </w:pBdr>
+        <w:rPr>
+          <w:rFonts w:ascii="Consolas" w:hAnsi="Consolas"/>
+        </w:rPr>
+      </w:pPr>
+      <w:proofErr w:type="gramStart"/>
+      <w:r>
+        <w:rPr>
+          <w:rFonts w:ascii="Consolas" w:hAnsi="Consolas"/>
+        </w:rPr>
+        <w:t>.side</w:t>
+      </w:r>
+      <w:proofErr w:type="gramEnd"/>
+      <w:r>
+        <w:rPr>
+          <w:rFonts w:ascii="Consolas" w:hAnsi="Consolas"/>
+        </w:rPr>
+        <w:t>-main {</w:t>
+      </w:r>
+    </w:p>
+    <w:p>
+      <w:pPr>
+        <w:pBdr>
+          <w:top w:val="single" w:sz="4" w:space="1" w:color="auto"/>
+          <w:left w:val="single" w:sz="4" w:space="1" w:color="auto"/>
+          <w:bottom w:val="single" w:sz="4" w:space="1" w:color="auto"/>
+          <w:right w:val="single" w:sz="4" w:space="1" w:color="auto"/>
+        </w:pBdr>
+        <w:rPr>
+          <w:rFonts w:ascii="Consolas" w:hAnsi="Consolas"/>
+        </w:rPr>
+      </w:pPr>
+      <w:r>
+        <w:rPr>
+          <w:rFonts w:ascii="Consolas" w:hAnsi="Consolas"/>
+        </w:rPr>
+        <w:t xml:space="preserve">    height: </w:t>
+      </w:r>
+      <w:proofErr w:type="gramStart"/>
+      <w:r>
+        <w:rPr>
+          <w:rFonts w:ascii="Consolas" w:hAnsi="Consolas"/>
+        </w:rPr>
+        <w:t>100%;</w:t>
+      </w:r>
+      <w:proofErr w:type="gramEnd"/>
+    </w:p>
+    <w:p>
+      <w:pPr>
+        <w:pBdr>
+          <w:top w:val="single" w:sz="4" w:space="1" w:color="auto"/>
+          <w:left w:val="single" w:sz="4" w:space="1" w:color="auto"/>
+          <w:bottom w:val="single" w:sz="4" w:space="1" w:color="auto"/>
+          <w:right w:val="single" w:sz="4" w:space="1" w:color="auto"/>
+        </w:pBdr>
+        <w:rPr>
+          <w:rFonts w:ascii="Consolas" w:hAnsi="Consolas"/>
+        </w:rPr>
+      </w:pPr>
+      <w:r>
+        <w:rPr>
+          <w:rFonts w:ascii="Consolas" w:hAnsi="Consolas"/>
+        </w:rPr>
+        <w:t xml:space="preserve">    padding: 0 </w:t>
+      </w:r>
+      <w:proofErr w:type="gramStart"/>
+      <w:r>
+        <w:rPr>
+          <w:rFonts w:ascii="Consolas" w:hAnsi="Consolas"/>
+        </w:rPr>
+        <w:t>1em;</w:t>
+      </w:r>
+      <w:proofErr w:type="gramEnd"/>
+    </w:p>
+    <w:p>
+      <w:pPr>
+        <w:pBdr>
+          <w:top w:val="single" w:sz="4" w:space="1" w:color="auto"/>
+          <w:left w:val="single" w:sz="4" w:space="1" w:color="auto"/>
+          <w:bottom w:val="single" w:sz="4" w:space="1" w:color="auto"/>
+          <w:right w:val="single" w:sz="4" w:space="1" w:color="auto"/>
+        </w:pBdr>
+        <w:rPr>
+          <w:rFonts w:ascii="Consolas" w:hAnsi="Consolas"/>
+        </w:rPr>
+      </w:pPr>
+    </w:p>
+    <w:p>
+      <w:pPr>
+        <w:pBdr>
+          <w:top w:val="single" w:sz="4" w:space="1" w:color="auto"/>
+          <w:left w:val="single" w:sz="4" w:space="1" w:color="auto"/>
+          <w:bottom w:val="single" w:sz="4" w:space="1" w:color="auto"/>
+          <w:right w:val="single" w:sz="4" w:space="1" w:color="auto"/>
+        </w:pBdr>
+        <w:rPr>
+          <w:rFonts w:ascii="Consolas" w:hAnsi="Consolas"/>
+        </w:rPr>
+      </w:pPr>
+      <w:r>
+        <w:rPr>
+          <w:rFonts w:ascii="Consolas" w:hAnsi="Consolas"/>
+        </w:rPr>
+        <w:t xml:space="preserve">    display: </w:t>
+      </w:r>
+      <w:proofErr w:type="gramStart"/>
+      <w:r>
+        <w:rPr>
+          <w:rFonts w:ascii="Consolas" w:hAnsi="Consolas"/>
+        </w:rPr>
+        <w:t>flex;</w:t>
+      </w:r>
+      <w:proofErr w:type="gramEnd"/>
+    </w:p>
+    <w:p>
+      <w:pPr>
+        <w:pBdr>
+          <w:top w:val="single" w:sz="4" w:space="1" w:color="auto"/>
+          <w:left w:val="single" w:sz="4" w:space="1" w:color="auto"/>
+          <w:bottom w:val="single" w:sz="4" w:space="1" w:color="auto"/>
+          <w:right w:val="single" w:sz="4" w:space="1" w:color="auto"/>
+        </w:pBdr>
+        <w:rPr>
+          <w:rFonts w:ascii="Consolas" w:hAnsi="Consolas"/>
+        </w:rPr>
+      </w:pPr>
+      <w:r>
+        <w:rPr>
+          <w:rFonts w:ascii="Consolas" w:hAnsi="Consolas"/>
+        </w:rPr>
+        <w:t>}</w:t>
+      </w:r>
+    </w:p>
+    <w:p>
+      <w:pPr>
+        <w:pBdr>
+          <w:top w:val="single" w:sz="4" w:space="1" w:color="auto"/>
+          <w:left w:val="single" w:sz="4" w:space="1" w:color="auto"/>
+          <w:bottom w:val="single" w:sz="4" w:space="1" w:color="auto"/>
+          <w:right w:val="single" w:sz="4" w:space="1" w:color="auto"/>
+        </w:pBdr>
+        <w:rPr>
+          <w:rFonts w:ascii="Consolas" w:hAnsi="Consolas"/>
+        </w:rPr>
+      </w:pPr>
+    </w:p>
+    <w:p>
+      <w:pPr>
+        <w:pBdr>
+          <w:top w:val="single" w:sz="4" w:space="1" w:color="auto"/>
+          <w:left w:val="single" w:sz="4" w:space="1" w:color="auto"/>
+          <w:bottom w:val="single" w:sz="4" w:space="1" w:color="auto"/>
+          <w:right w:val="single" w:sz="4" w:space="1" w:color="auto"/>
+        </w:pBdr>
+        <w:rPr>
+          <w:rFonts w:ascii="Consolas" w:hAnsi="Consolas"/>
+        </w:rPr>
+      </w:pPr>
+      <w:proofErr w:type="gramStart"/>
+      <w:r>
+        <w:rPr>
+          <w:rFonts w:ascii="Consolas" w:hAnsi="Consolas"/>
+        </w:rPr>
+        <w:t>.side</w:t>
+      </w:r>
+      <w:proofErr w:type="gramEnd"/>
+      <w:r>
+        <w:rPr>
+          <w:rFonts w:ascii="Consolas" w:hAnsi="Consolas"/>
+        </w:rPr>
+        <w:t>-</w:t>
+      </w:r>
+      <w:proofErr w:type="gramStart"/>
+      <w:r>
+        <w:rPr>
+          <w:rFonts w:ascii="Consolas" w:hAnsi="Consolas"/>
+        </w:rPr>
+        <w:t>main</w:t>
+      </w:r>
+      <w:proofErr w:type="gramEnd"/>
+      <w:r>
+        <w:rPr>
+          <w:rFonts w:ascii="Consolas" w:hAnsi="Consolas"/>
+        </w:rPr>
+        <w:t xml:space="preserve"> main {</w:t>
+      </w:r>
+    </w:p>
+    <w:p>
+      <w:pPr>
+        <w:pBdr>
+          <w:top w:val="single" w:sz="4" w:space="1" w:color="auto"/>
+          <w:left w:val="single" w:sz="4" w:space="1" w:color="auto"/>
+          <w:bottom w:val="single" w:sz="4" w:space="1" w:color="auto"/>
+          <w:right w:val="single" w:sz="4" w:space="1" w:color="auto"/>
+        </w:pBdr>
+        <w:rPr>
+          <w:rFonts w:ascii="Consolas" w:hAnsi="Consolas"/>
+        </w:rPr>
+      </w:pPr>
+      <w:r>
+        <w:rPr>
+          <w:rFonts w:ascii="Consolas" w:hAnsi="Consolas"/>
+        </w:rPr>
+        <w:t xml:space="preserve">    flex: </w:t>
+      </w:r>
+      <w:proofErr w:type="gramStart"/>
+      <w:r>
+        <w:rPr>
+          <w:rFonts w:ascii="Consolas" w:hAnsi="Consolas"/>
+        </w:rPr>
+        <w:t>1.5;</w:t>
+      </w:r>
+      <w:proofErr w:type="gramEnd"/>
+    </w:p>
+    <w:p>
+      <w:pPr>
+        <w:pBdr>
+          <w:top w:val="single" w:sz="4" w:space="1" w:color="auto"/>
+          <w:left w:val="single" w:sz="4" w:space="1" w:color="auto"/>
+          <w:bottom w:val="single" w:sz="4" w:space="1" w:color="auto"/>
+          <w:right w:val="single" w:sz="4" w:space="1" w:color="auto"/>
+        </w:pBdr>
+        <w:rPr>
+          <w:rFonts w:ascii="Consolas" w:hAnsi="Consolas"/>
+        </w:rPr>
+      </w:pPr>
+      <w:r>
+        <w:rPr>
+          <w:rFonts w:ascii="Consolas" w:hAnsi="Consolas"/>
+        </w:rPr>
+        <w:lastRenderedPageBreak/>
+        <w:t>}</w:t>
+      </w:r>
+    </w:p>
+    <w:p>
+      <w:pPr>
+        <w:pBdr>
+          <w:top w:val="single" w:sz="4" w:space="1" w:color="auto"/>
+          <w:left w:val="single" w:sz="4" w:space="1" w:color="auto"/>
+          <w:bottom w:val="single" w:sz="4" w:space="1" w:color="auto"/>
+          <w:right w:val="single" w:sz="4" w:space="1" w:color="auto"/>
+        </w:pBdr>
+        <w:rPr>
+          <w:rFonts w:ascii="Consolas" w:hAnsi="Consolas"/>
+        </w:rPr>
+      </w:pPr>
+    </w:p>
+    <w:p>
+      <w:pPr>
+        <w:pBdr>
+          <w:top w:val="single" w:sz="4" w:space="1" w:color="auto"/>
+          <w:left w:val="single" w:sz="4" w:space="1" w:color="auto"/>
+          <w:bottom w:val="single" w:sz="4" w:space="1" w:color="auto"/>
+          <w:right w:val="single" w:sz="4" w:space="1" w:color="auto"/>
+        </w:pBdr>
+        <w:rPr>
+          <w:rFonts w:ascii="Consolas" w:hAnsi="Consolas"/>
+        </w:rPr>
+      </w:pPr>
+      <w:proofErr w:type="gramStart"/>
+      <w:r>
+        <w:rPr>
+          <w:rFonts w:ascii="Consolas" w:hAnsi="Consolas"/>
+        </w:rPr>
+        <w:t>.link</w:t>
+      </w:r>
+      <w:proofErr w:type="gramEnd"/>
+      <w:r>
+        <w:rPr>
+          <w:rFonts w:ascii="Consolas" w:hAnsi="Consolas"/>
+        </w:rPr>
+        <w:t>-gray {</w:t>
+      </w:r>
+    </w:p>
+    <w:p>
+      <w:pPr>
+        <w:pBdr>
+          <w:top w:val="single" w:sz="4" w:space="1" w:color="auto"/>
+          <w:left w:val="single" w:sz="4" w:space="1" w:color="auto"/>
+          <w:bottom w:val="single" w:sz="4" w:space="1" w:color="auto"/>
+          <w:right w:val="single" w:sz="4" w:space="1" w:color="auto"/>
+        </w:pBdr>
+        <w:rPr>
+          <w:rFonts w:ascii="Consolas" w:hAnsi="Consolas"/>
+        </w:rPr>
+      </w:pPr>
+      <w:r>
+        <w:rPr>
+          <w:rFonts w:ascii="Consolas" w:hAnsi="Consolas"/>
+        </w:rPr>
+        <w:t xml:space="preserve">    color: </w:t>
+      </w:r>
+      <w:proofErr w:type="gramStart"/>
+      <w:r>
+        <w:rPr>
+          <w:rFonts w:ascii="Consolas" w:hAnsi="Consolas"/>
+        </w:rPr>
+        <w:t>gray;</w:t>
+      </w:r>
+      <w:proofErr w:type="gramEnd"/>
+    </w:p>
+    <w:p>
+      <w:pPr>
+        <w:pBdr>
+          <w:top w:val="single" w:sz="4" w:space="1" w:color="auto"/>
+          <w:left w:val="single" w:sz="4" w:space="1" w:color="auto"/>
+          <w:bottom w:val="single" w:sz="4" w:space="1" w:color="auto"/>
+          <w:right w:val="single" w:sz="4" w:space="1" w:color="auto"/>
+        </w:pBdr>
+        <w:rPr>
+          <w:rFonts w:ascii="Consolas" w:hAnsi="Consolas"/>
+        </w:rPr>
+      </w:pPr>
+      <w:r>
+        <w:rPr>
+          <w:rFonts w:ascii="Consolas" w:hAnsi="Consolas"/>
+        </w:rPr>
+        <w:t>}</w:t>
+      </w:r>
+    </w:p>
+    <w:p>
+      <w:pPr>
+        <w:pBdr>
+          <w:top w:val="single" w:sz="4" w:space="1" w:color="auto"/>
+          <w:left w:val="single" w:sz="4" w:space="1" w:color="auto"/>
+          <w:bottom w:val="single" w:sz="4" w:space="1" w:color="auto"/>
+          <w:right w:val="single" w:sz="4" w:space="1" w:color="auto"/>
+        </w:pBdr>
+        <w:rPr>
+          <w:rFonts w:ascii="Consolas" w:hAnsi="Consolas"/>
+        </w:rPr>
+      </w:pPr>
+    </w:p>
+    <w:p>
+      <w:pPr>
+        <w:pBdr>
+          <w:top w:val="single" w:sz="4" w:space="1" w:color="auto"/>
+          <w:left w:val="single" w:sz="4" w:space="1" w:color="auto"/>
+          <w:bottom w:val="single" w:sz="4" w:space="1" w:color="auto"/>
+          <w:right w:val="single" w:sz="4" w:space="1" w:color="auto"/>
+        </w:pBdr>
+        <w:rPr>
+          <w:rFonts w:ascii="Consolas" w:hAnsi="Consolas"/>
+        </w:rPr>
+      </w:pPr>
+      <w:proofErr w:type="gramStart"/>
+      <w:r>
+        <w:rPr>
+          <w:rFonts w:ascii="Consolas" w:hAnsi="Consolas"/>
+        </w:rPr>
+        <w:t>.link</w:t>
+      </w:r>
+      <w:proofErr w:type="gramEnd"/>
+      <w:r>
+        <w:rPr>
+          <w:rFonts w:ascii="Consolas" w:hAnsi="Consolas"/>
+        </w:rPr>
+        <w:t>-maroon {</w:t>
+      </w:r>
+    </w:p>
+    <w:p>
+      <w:pPr>
+        <w:pBdr>
+          <w:top w:val="single" w:sz="4" w:space="1" w:color="auto"/>
+          <w:left w:val="single" w:sz="4" w:space="1" w:color="auto"/>
+          <w:bottom w:val="single" w:sz="4" w:space="1" w:color="auto"/>
+          <w:right w:val="single" w:sz="4" w:space="1" w:color="auto"/>
+        </w:pBdr>
+        <w:rPr>
+          <w:rFonts w:ascii="Consolas" w:hAnsi="Consolas"/>
+        </w:rPr>
+      </w:pPr>
+      <w:r>
+        <w:rPr>
+          <w:rFonts w:ascii="Consolas" w:hAnsi="Consolas"/>
+        </w:rPr>
+        <w:t xml:space="preserve">    color: </w:t>
+      </w:r>
+      <w:proofErr w:type="gramStart"/>
+      <w:r>
+        <w:rPr>
+          <w:rFonts w:ascii="Consolas" w:hAnsi="Consolas"/>
+        </w:rPr>
+        <w:t>maroon;</w:t>
+      </w:r>
+      <w:proofErr w:type="gramEnd"/>
+    </w:p>
+    <w:p>
+      <w:pPr>
+        <w:pBdr>
+          <w:top w:val="single" w:sz="4" w:space="1" w:color="auto"/>
+          <w:left w:val="single" w:sz="4" w:space="1" w:color="auto"/>
+          <w:bottom w:val="single" w:sz="4" w:space="1" w:color="auto"/>
+          <w:right w:val="single" w:sz="4" w:space="1" w:color="auto"/>
+        </w:pBdr>
+        <w:rPr>
+          <w:rFonts w:ascii="Consolas" w:hAnsi="Consolas"/>
+        </w:rPr>
+      </w:pPr>
+      <w:r>
+        <w:rPr>
+          <w:rFonts w:ascii="Consolas" w:hAnsi="Consolas"/>
+        </w:rPr>
+        <w:t>}</w:t>
+      </w:r>
+    </w:p>
+    <w:p>
+      <w:pPr>
+        <w:pBdr>
+          <w:top w:val="single" w:sz="4" w:space="1" w:color="auto"/>
+          <w:left w:val="single" w:sz="4" w:space="1" w:color="auto"/>
+          <w:bottom w:val="single" w:sz="4" w:space="1" w:color="auto"/>
+          <w:right w:val="single" w:sz="4" w:space="1" w:color="auto"/>
+        </w:pBdr>
+        <w:rPr>
+          <w:rFonts w:ascii="Consolas" w:hAnsi="Consolas"/>
+        </w:rPr>
+      </w:pPr>
+    </w:p>
+    <w:p>
+      <w:pPr>
+        <w:pBdr>
+          <w:top w:val="single" w:sz="4" w:space="1" w:color="auto"/>
+          <w:left w:val="single" w:sz="4" w:space="1" w:color="auto"/>
+          <w:bottom w:val="single" w:sz="4" w:space="1" w:color="auto"/>
+          <w:right w:val="single" w:sz="4" w:space="1" w:color="auto"/>
+        </w:pBdr>
+        <w:rPr>
+          <w:rFonts w:ascii="Consolas" w:hAnsi="Consolas"/>
+        </w:rPr>
+      </w:pPr>
+      <w:proofErr w:type="gramStart"/>
+      <w:r>
+        <w:rPr>
+          <w:rFonts w:ascii="Consolas" w:hAnsi="Consolas"/>
+        </w:rPr>
+        <w:t>.link</w:t>
+      </w:r>
+      <w:proofErr w:type="gramEnd"/>
+      <w:r>
+        <w:rPr>
+          <w:rFonts w:ascii="Consolas" w:hAnsi="Consolas"/>
+        </w:rPr>
+        <w:t>-yellow {</w:t>
+      </w:r>
+    </w:p>
+    <w:p>
+      <w:pPr>
+        <w:pBdr>
+          <w:top w:val="single" w:sz="4" w:space="1" w:color="auto"/>
+          <w:left w:val="single" w:sz="4" w:space="1" w:color="auto"/>
+          <w:bottom w:val="single" w:sz="4" w:space="1" w:color="auto"/>
+          <w:right w:val="single" w:sz="4" w:space="1" w:color="auto"/>
+        </w:pBdr>
+        <w:rPr>
+          <w:rFonts w:ascii="Consolas" w:hAnsi="Consolas"/>
+        </w:rPr>
+      </w:pPr>
+      <w:r>
+        <w:rPr>
+          <w:rFonts w:ascii="Consolas" w:hAnsi="Consolas"/>
+        </w:rPr>
+        <w:t xml:space="preserve">    color: </w:t>
+      </w:r>
+      <w:proofErr w:type="gramStart"/>
+      <w:r>
+        <w:rPr>
+          <w:rFonts w:ascii="Consolas" w:hAnsi="Consolas"/>
+        </w:rPr>
+        <w:t>goldenrod;</w:t>
+      </w:r>
+      <w:proofErr w:type="gramEnd"/>
+    </w:p>
+    <w:p>
+      <w:pPr>
+        <w:pBdr>
+          <w:top w:val="single" w:sz="4" w:space="1" w:color="auto"/>
+          <w:left w:val="single" w:sz="4" w:space="1" w:color="auto"/>
+          <w:bottom w:val="single" w:sz="4" w:space="1" w:color="auto"/>
+          <w:right w:val="single" w:sz="4" w:space="1" w:color="auto"/>
+        </w:pBdr>
+        <w:rPr>
+          <w:rFonts w:ascii="Consolas" w:hAnsi="Consolas"/>
+        </w:rPr>
+      </w:pPr>
+      <w:r>
+        <w:rPr>
+          <w:rFonts w:ascii="Consolas" w:hAnsi="Consolas"/>
+        </w:rPr>
+        <w:t>}</w:t>
+      </w:r>
+    </w:p>
+    <w:p>
+      <w:pPr>
+        <w:pBdr>
+          <w:top w:val="single" w:sz="4" w:space="1" w:color="auto"/>
+          <w:left w:val="single" w:sz="4" w:space="1" w:color="auto"/>
+          <w:bottom w:val="single" w:sz="4" w:space="1" w:color="auto"/>
+          <w:right w:val="single" w:sz="4" w:space="1" w:color="auto"/>
+        </w:pBdr>
+        <w:rPr>
+          <w:rFonts w:ascii="Consolas" w:hAnsi="Consolas"/>
+        </w:rPr>
+      </w:pPr>
+    </w:p>
+    <w:p>
+      <w:pPr>
+        <w:pBdr>
+          <w:top w:val="single" w:sz="4" w:space="1" w:color="auto"/>
+          <w:left w:val="single" w:sz="4" w:space="1" w:color="auto"/>
+          <w:bottom w:val="single" w:sz="4" w:space="1" w:color="auto"/>
+          <w:right w:val="single" w:sz="4" w:space="1" w:color="auto"/>
+        </w:pBdr>
+        <w:rPr>
+          <w:rFonts w:ascii="Consolas" w:hAnsi="Consolas"/>
+        </w:rPr>
+      </w:pPr>
+      <w:proofErr w:type="gramStart"/>
+      <w:r>
+        <w:rPr>
+          <w:rFonts w:ascii="Consolas" w:hAnsi="Consolas"/>
+        </w:rPr>
+        <w:t>.side</w:t>
+      </w:r>
+      <w:proofErr w:type="gramEnd"/>
+      <w:r>
+        <w:rPr>
+          <w:rFonts w:ascii="Consolas" w:hAnsi="Consolas"/>
+        </w:rPr>
+        <w:t>-main aside {</w:t>
+      </w:r>
+    </w:p>
+    <w:p>
+      <w:pPr>
+        <w:pBdr>
+          <w:top w:val="single" w:sz="4" w:space="1" w:color="auto"/>
+          <w:left w:val="single" w:sz="4" w:space="1" w:color="auto"/>
+          <w:bottom w:val="single" w:sz="4" w:space="1" w:color="auto"/>
+          <w:right w:val="single" w:sz="4" w:space="1" w:color="auto"/>
+        </w:pBdr>
+        <w:rPr>
+          <w:rFonts w:ascii="Consolas" w:hAnsi="Consolas"/>
+        </w:rPr>
+      </w:pPr>
+      <w:r>
+        <w:rPr>
+          <w:rFonts w:ascii="Consolas" w:hAnsi="Consolas"/>
+        </w:rPr>
+        <w:t>    background-color: #</w:t>
+      </w:r>
+      <w:proofErr w:type="gramStart"/>
+      <w:r>
+        <w:rPr>
+          <w:rFonts w:ascii="Consolas" w:hAnsi="Consolas"/>
+        </w:rPr>
+        <w:t>feeecc;</w:t>
+      </w:r>
+      <w:proofErr w:type="gramEnd"/>
+    </w:p>
+    <w:p>
+      <w:pPr>
+        <w:pBdr>
+          <w:top w:val="single" w:sz="4" w:space="1" w:color="auto"/>
+          <w:left w:val="single" w:sz="4" w:space="1" w:color="auto"/>
+          <w:bottom w:val="single" w:sz="4" w:space="1" w:color="auto"/>
+          <w:right w:val="single" w:sz="4" w:space="1" w:color="auto"/>
+        </w:pBdr>
+        <w:rPr>
+          <w:rFonts w:ascii="Consolas" w:hAnsi="Consolas"/>
+        </w:rPr>
+      </w:pPr>
+      <w:r>
+        <w:rPr>
+          <w:rFonts w:ascii="Consolas" w:hAnsi="Consolas"/>
+        </w:rPr>
+        <w:t xml:space="preserve">    margin: 1em 0 1em </w:t>
+      </w:r>
+      <w:proofErr w:type="spellStart"/>
+      <w:proofErr w:type="gramStart"/>
+      <w:r>
+        <w:rPr>
+          <w:rFonts w:ascii="Consolas" w:hAnsi="Consolas"/>
+        </w:rPr>
+        <w:t>1em</w:t>
+      </w:r>
+      <w:proofErr w:type="spellEnd"/>
+      <w:r>
+        <w:rPr>
+          <w:rFonts w:ascii="Consolas" w:hAnsi="Consolas"/>
+        </w:rPr>
+        <w:t>;</w:t>
+      </w:r>
+      <w:proofErr w:type="gramEnd"/>
+    </w:p>
+    <w:p>
+      <w:pPr>
+        <w:pBdr>
+          <w:top w:val="single" w:sz="4" w:space="1" w:color="auto"/>
+          <w:left w:val="single" w:sz="4" w:space="1" w:color="auto"/>
+          <w:bottom w:val="single" w:sz="4" w:space="1" w:color="auto"/>
+          <w:right w:val="single" w:sz="4" w:space="1" w:color="auto"/>
+        </w:pBdr>
+        <w:rPr>
+          <w:rFonts w:ascii="Consolas" w:hAnsi="Consolas"/>
+        </w:rPr>
+      </w:pPr>
+      <w:r>
+        <w:rPr>
+          <w:rFonts w:ascii="Consolas" w:hAnsi="Consolas"/>
+        </w:rPr>
+        <w:t xml:space="preserve">    padding: 0 1em </w:t>
+      </w:r>
+      <w:proofErr w:type="spellStart"/>
+      <w:proofErr w:type="gramStart"/>
+      <w:r>
+        <w:rPr>
+          <w:rFonts w:ascii="Consolas" w:hAnsi="Consolas"/>
+        </w:rPr>
+        <w:t>1em</w:t>
+      </w:r>
+      <w:proofErr w:type="spellEnd"/>
+      <w:r>
+        <w:rPr>
+          <w:rFonts w:ascii="Consolas" w:hAnsi="Consolas"/>
+        </w:rPr>
+        <w:t>;</w:t>
+      </w:r>
+      <w:proofErr w:type="gramEnd"/>
+    </w:p>
+    <w:p>
+      <w:pPr>
+        <w:pBdr>
+          <w:top w:val="single" w:sz="4" w:space="1" w:color="auto"/>
+          <w:left w:val="single" w:sz="4" w:space="1" w:color="auto"/>
+          <w:bottom w:val="single" w:sz="4" w:space="1" w:color="auto"/>
+          <w:right w:val="single" w:sz="4" w:space="1" w:color="auto"/>
+        </w:pBdr>
+        <w:rPr>
+          <w:rFonts w:ascii="Consolas" w:hAnsi="Consolas"/>
+        </w:rPr>
+      </w:pPr>
+    </w:p>
+    <w:p>
+      <w:pPr>
+        <w:pBdr>
+          <w:top w:val="single" w:sz="4" w:space="1" w:color="auto"/>
+          <w:left w:val="single" w:sz="4" w:space="1" w:color="auto"/>
+          <w:bottom w:val="single" w:sz="4" w:space="1" w:color="auto"/>
+          <w:right w:val="single" w:sz="4" w:space="1" w:color="auto"/>
+        </w:pBdr>
+        <w:rPr>
+          <w:rFonts w:ascii="Consolas" w:hAnsi="Consolas"/>
+        </w:rPr>
+      </w:pPr>
+      <w:r>
+        <w:rPr>
+          <w:rFonts w:ascii="Consolas" w:hAnsi="Consolas"/>
+        </w:rPr>
+        <w:t xml:space="preserve">    flex: </w:t>
+      </w:r>
+      <w:proofErr w:type="gramStart"/>
+      <w:r>
+        <w:rPr>
+          <w:rFonts w:ascii="Consolas" w:hAnsi="Consolas"/>
+        </w:rPr>
+        <w:t>1;</w:t>
+      </w:r>
+      <w:proofErr w:type="gramEnd"/>
+    </w:p>
+    <w:p>
+      <w:pPr>
+        <w:pBdr>
+          <w:top w:val="single" w:sz="4" w:space="1" w:color="auto"/>
+          <w:left w:val="single" w:sz="4" w:space="1" w:color="auto"/>
+          <w:bottom w:val="single" w:sz="4" w:space="1" w:color="auto"/>
+          <w:right w:val="single" w:sz="4" w:space="1" w:color="auto"/>
+        </w:pBdr>
+        <w:rPr>
+          <w:rFonts w:ascii="Consolas" w:hAnsi="Consolas"/>
+        </w:rPr>
+      </w:pPr>
+    </w:p>
+    <w:p>
+      <w:pPr>
+        <w:pBdr>
+          <w:top w:val="single" w:sz="4" w:space="1" w:color="auto"/>
+          <w:left w:val="single" w:sz="4" w:space="1" w:color="auto"/>
+          <w:bottom w:val="single" w:sz="4" w:space="1" w:color="auto"/>
+          <w:right w:val="single" w:sz="4" w:space="1" w:color="auto"/>
+        </w:pBdr>
+        <w:rPr>
+          <w:rFonts w:ascii="Consolas" w:hAnsi="Consolas"/>
+        </w:rPr>
+      </w:pPr>
+      <w:r>
+        <w:rPr>
+          <w:rFonts w:ascii="Consolas" w:hAnsi="Consolas"/>
+        </w:rPr>
+        <w:t>    height: fit-</w:t>
+      </w:r>
+      <w:proofErr w:type="gramStart"/>
+      <w:r>
+        <w:rPr>
+          <w:rFonts w:ascii="Consolas" w:hAnsi="Consolas"/>
+        </w:rPr>
+        <w:t>content;</w:t>
+      </w:r>
+      <w:proofErr w:type="gramEnd"/>
+    </w:p>
+    <w:p>
+      <w:pPr>
+        <w:pBdr>
+          <w:top w:val="single" w:sz="4" w:space="1" w:color="auto"/>
+          <w:left w:val="single" w:sz="4" w:space="1" w:color="auto"/>
+          <w:bottom w:val="single" w:sz="4" w:space="1" w:color="auto"/>
+          <w:right w:val="single" w:sz="4" w:space="1" w:color="auto"/>
+        </w:pBdr>
+        <w:rPr>
+          <w:rFonts w:ascii="Consolas" w:hAnsi="Consolas"/>
+        </w:rPr>
+      </w:pPr>
+      <w:r>
+        <w:rPr>
+          <w:rFonts w:ascii="Consolas" w:hAnsi="Consolas"/>
+        </w:rPr>
+        <w:t>}</w:t>
+      </w:r>
+    </w:p>
+    <w:p>
+      <w:pPr>
+        <w:pBdr>
+          <w:top w:val="single" w:sz="4" w:space="1" w:color="auto"/>
+          <w:left w:val="single" w:sz="4" w:space="1" w:color="auto"/>
+          <w:bottom w:val="single" w:sz="4" w:space="1" w:color="auto"/>
+          <w:right w:val="single" w:sz="4" w:space="1" w:color="auto"/>
+        </w:pBdr>
+        <w:rPr>
+          <w:rFonts w:ascii="Consolas" w:hAnsi="Consolas"/>
+        </w:rPr>
+      </w:pPr>
+    </w:p>
+    <w:p>
+      <w:pPr>
+        <w:pBdr>
+          <w:top w:val="single" w:sz="4" w:space="1" w:color="auto"/>
+          <w:left w:val="single" w:sz="4" w:space="1" w:color="auto"/>
+          <w:bottom w:val="single" w:sz="4" w:space="1" w:color="auto"/>
+          <w:right w:val="single" w:sz="4" w:space="1" w:color="auto"/>
+        </w:pBdr>
+        <w:rPr>
+          <w:rFonts w:ascii="Consolas" w:hAnsi="Consolas"/>
+        </w:rPr>
+      </w:pPr>
+      <w:proofErr w:type="gramStart"/>
+      <w:r>
+        <w:rPr>
+          <w:rFonts w:ascii="Consolas" w:hAnsi="Consolas"/>
+        </w:rPr>
+        <w:t>.side</w:t>
+      </w:r>
+      <w:proofErr w:type="gramEnd"/>
+      <w:r>
+        <w:rPr>
+          <w:rFonts w:ascii="Consolas" w:hAnsi="Consolas"/>
+        </w:rPr>
+        <w:t>-main aside h3 {</w:t>
+      </w:r>
+    </w:p>
+    <w:p>
+      <w:pPr>
+        <w:pBdr>
+          <w:top w:val="single" w:sz="4" w:space="1" w:color="auto"/>
+          <w:left w:val="single" w:sz="4" w:space="1" w:color="auto"/>
+          <w:bottom w:val="single" w:sz="4" w:space="1" w:color="auto"/>
+          <w:right w:val="single" w:sz="4" w:space="1" w:color="auto"/>
+        </w:pBdr>
+        <w:rPr>
+          <w:rFonts w:ascii="Consolas" w:hAnsi="Consolas"/>
+        </w:rPr>
+      </w:pPr>
+      <w:r>
+        <w:rPr>
+          <w:rFonts w:ascii="Consolas" w:hAnsi="Consolas"/>
+        </w:rPr>
+        <w:t xml:space="preserve">    color: </w:t>
+      </w:r>
+      <w:proofErr w:type="gramStart"/>
+      <w:r>
+        <w:rPr>
+          <w:rFonts w:ascii="Consolas" w:hAnsi="Consolas"/>
+        </w:rPr>
+        <w:t>maroon;</w:t>
+      </w:r>
+      <w:proofErr w:type="gramEnd"/>
+    </w:p>
+    <w:p>
+      <w:pPr>
+        <w:pBdr>
+          <w:top w:val="single" w:sz="4" w:space="1" w:color="auto"/>
+          <w:left w:val="single" w:sz="4" w:space="1" w:color="auto"/>
+          <w:bottom w:val="single" w:sz="4" w:space="1" w:color="auto"/>
+          <w:right w:val="single" w:sz="4" w:space="1" w:color="auto"/>
+        </w:pBdr>
+        <w:rPr>
+          <w:rFonts w:ascii="Consolas" w:hAnsi="Consolas"/>
+        </w:rPr>
+      </w:pPr>
+      <w:r>
+        <w:rPr>
+          <w:rFonts w:ascii="Consolas" w:hAnsi="Consolas"/>
+        </w:rPr>
+        <w:t xml:space="preserve">} </w:t>
+      </w:r>
+    </w:p>
+    <w:p>
+      <w:pPr>
+        <w:pBdr>
+          <w:top w:val="single" w:sz="4" w:space="1" w:color="auto"/>
+          <w:left w:val="single" w:sz="4" w:space="1" w:color="auto"/>
+          <w:bottom w:val="single" w:sz="4" w:space="1" w:color="auto"/>
+          <w:right w:val="single" w:sz="4" w:space="1" w:color="auto"/>
+        </w:pBdr>
+        <w:rPr>
+          <w:rFonts w:ascii="Consolas" w:hAnsi="Consolas"/>
+        </w:rPr>
+      </w:pPr>
+    </w:p>
+    <w:p>
+      <w:pPr>
+        <w:pBdr>
+          <w:top w:val="single" w:sz="4" w:space="1" w:color="auto"/>
+          <w:left w:val="single" w:sz="4" w:space="1" w:color="auto"/>
+          <w:bottom w:val="single" w:sz="4" w:space="1" w:color="auto"/>
+          <w:right w:val="single" w:sz="4" w:space="1" w:color="auto"/>
+        </w:pBdr>
+        <w:rPr>
+          <w:rFonts w:ascii="Consolas" w:hAnsi="Consolas"/>
+        </w:rPr>
+      </w:pPr>
+      <w:r>
+        <w:rPr>
+          <w:rFonts w:ascii="Consolas" w:hAnsi="Consolas"/>
+        </w:rPr>
+        <w:t>.container footer {</w:t>
+      </w:r>
+    </w:p>
+    <w:p>
+      <w:pPr>
+        <w:pBdr>
+          <w:top w:val="single" w:sz="4" w:space="1" w:color="auto"/>
+          <w:left w:val="single" w:sz="4" w:space="1" w:color="auto"/>
+          <w:bottom w:val="single" w:sz="4" w:space="1" w:color="auto"/>
+          <w:right w:val="single" w:sz="4" w:space="1" w:color="auto"/>
+        </w:pBdr>
+        <w:rPr>
+          <w:rFonts w:ascii="Consolas" w:hAnsi="Consolas"/>
+        </w:rPr>
+      </w:pPr>
+      <w:r>
+        <w:rPr>
+          <w:rFonts w:ascii="Consolas" w:hAnsi="Consolas"/>
+        </w:rPr>
+        <w:t xml:space="preserve">    text-align: </w:t>
+      </w:r>
+      <w:proofErr w:type="gramStart"/>
+      <w:r>
+        <w:rPr>
+          <w:rFonts w:ascii="Consolas" w:hAnsi="Consolas"/>
+        </w:rPr>
+        <w:t>right;</w:t>
+      </w:r>
+      <w:proofErr w:type="gramEnd"/>
+    </w:p>
+    <w:p>
+      <w:pPr>
+        <w:pBdr>
+          <w:top w:val="single" w:sz="4" w:space="1" w:color="auto"/>
+          <w:left w:val="single" w:sz="4" w:space="1" w:color="auto"/>
+          <w:bottom w:val="single" w:sz="4" w:space="1" w:color="auto"/>
+          <w:right w:val="single" w:sz="4" w:space="1" w:color="auto"/>
+        </w:pBdr>
+        <w:rPr>
+          <w:rFonts w:ascii="Consolas" w:hAnsi="Consolas"/>
+        </w:rPr>
+      </w:pPr>
+      <w:r>
+        <w:rPr>
+          <w:rFonts w:ascii="Consolas" w:hAnsi="Consolas"/>
+        </w:rPr>
+        <w:t>    border-top: 3px solid #</w:t>
+      </w:r>
+      <w:proofErr w:type="gramStart"/>
+      <w:r>
+        <w:rPr>
+          <w:rFonts w:ascii="Consolas" w:hAnsi="Consolas"/>
+        </w:rPr>
+        <w:t>cbc494;</w:t>
+      </w:r>
+      <w:proofErr w:type="gramEnd"/>
+    </w:p>
+    <w:p>
+      <w:pPr>
+        <w:pBdr>
+          <w:top w:val="single" w:sz="4" w:space="1" w:color="auto"/>
+          <w:left w:val="single" w:sz="4" w:space="1" w:color="auto"/>
+          <w:bottom w:val="single" w:sz="4" w:space="1" w:color="auto"/>
+          <w:right w:val="single" w:sz="4" w:space="1" w:color="auto"/>
+        </w:pBdr>
+        <w:rPr>
+          <w:rFonts w:ascii="Consolas" w:hAnsi="Consolas"/>
+        </w:rPr>
+      </w:pPr>
+      <w:r>
+        <w:rPr>
+          <w:rFonts w:ascii="Consolas" w:hAnsi="Consolas"/>
+        </w:rPr>
+        <w:t>}</w:t>
+      </w:r>
+    </w:p>
+    <w:p/>
+    <w:p>
+      <w:pPr>
+        <w:pStyle w:val="Heading2"/>
+      </w:pPr>
+      <w:r>
+        <w:t>Result</w:t>
+      </w:r>
+    </w:p>
+    <w:p>
+      <w:r>
+        <w:rPr>
+          <w:noProof/>
+        </w:rPr>
+        <w:drawing>
+          <wp:inline distT="0" distB="0" distL="0" distR="0" wp14:anchorId="248BEB01" wp14:editId="5B6AD1E8">
+            <wp:extent cx="5943600" cy="2689860"/>
+            <wp:effectExtent l="0" t="0" r="0" b="0"/>
+            <wp:docPr id="1532947964" name="Picture 1"/>
+            <wp:cNvGraphicFramePr>
+              <a:graphicFrameLocks xmlns:a="http://schemas.openxmlformats.org/drawingml/2006/main" noChangeAspect="1"/>
+            </wp:cNvGraphicFramePr>
+            <a:graphic xmlns:a="http://schemas.openxmlformats.org/drawingml/2006/main">
+              <a:graphicData uri="http://schemas.openxmlformats.org/drawingml/2006/picture">
+                <pic:pic xmlns:pic="http://schemas.openxmlformats.org/drawingml/2006/picture">
+                  <pic:nvPicPr>
+                    <pic:cNvPr id="1532947964" name=""/>
+                    <pic:cNvPicPr/>
+                  </pic:nvPicPr>
+                  <pic:blipFill>
+                    <a:blip r:embed="rId8"/>
+                    <a:stretch>
+                      <a:fillRect/>
+                    </a:stretch>
+                  </pic:blipFill>
+                  <pic:spPr>
+                    <a:xfrm>
+                      <a:off x="0" y="0"/>
+                      <a:ext cx="5943600" cy="2689860"/>
+                    </a:xfrm>
+                    <a:prstGeom prst="rect">
+                      <a:avLst/>
+                    </a:prstGeom>
+                  </pic:spPr>
+                </pic:pic>
+              </a:graphicData>
+            </a:graphic>
+          </wp:inline>
+        </w:drawing>
+      </w:r>
+    </w:p>
     <w:p/>
     <w:sectPr>
       <w:pgSz w:w="12240" w:h="15840"/>

</xml_diff>